<commit_message>
BD 1 + web 1-2
</commit_message>
<xml_diff>
--- a/6_semester/Web/2 лр/assets/Web-ЛР2-ШаповаловаДС-4329.docx
+++ b/6_semester/Web/2 лр/assets/Web-ЛР2-ШаповаловаДС-4329.docx
@@ -2404,16 +2404,2883 @@
           <w:szCs w:val="24"/>
         </w:rPr>
       </w:pPr>
+      <w:r>
+        <w:rPr>
+          <w:rFonts w:ascii="Times New Roman" w:hAnsi="Times New Roman" w:cs="Times New Roman"/>
+          <w:sz w:val="24"/>
+          <w:szCs w:val="24"/>
+        </w:rPr>
+        <w:t>Для выполнения задания 1 была создана внешняя</w:t>
+      </w:r>
+      <w:r>
+        <w:rPr>
+          <w:rFonts w:ascii="Times New Roman" w:hAnsi="Times New Roman" w:cs="Times New Roman"/>
+          <w:sz w:val="24"/>
+          <w:szCs w:val="24"/>
+        </w:rPr>
+        <w:t xml:space="preserve"> </w:t>
+      </w:r>
+      <w:r>
+        <w:rPr>
+          <w:rFonts w:ascii="Times New Roman" w:hAnsi="Times New Roman" w:cs="Times New Roman"/>
+          <w:sz w:val="24"/>
+          <w:szCs w:val="24"/>
+        </w:rPr>
+        <w:t>таблица стилей</w:t>
+      </w:r>
+      <w:r>
+        <w:rPr>
+          <w:rFonts w:ascii="Times New Roman" w:hAnsi="Times New Roman" w:cs="Times New Roman"/>
+          <w:sz w:val="24"/>
+          <w:szCs w:val="24"/>
+        </w:rPr>
+        <w:t xml:space="preserve">, на которую указана ссылка </w:t>
+      </w:r>
+      <w:r>
+        <w:rPr>
+          <w:rFonts w:ascii="Times New Roman" w:hAnsi="Times New Roman" w:cs="Times New Roman"/>
+          <w:sz w:val="24"/>
+          <w:szCs w:val="24"/>
+        </w:rPr>
+        <w:t xml:space="preserve">в </w:t>
+      </w:r>
+      <w:r>
+        <w:rPr>
+          <w:rFonts w:ascii="Times New Roman" w:hAnsi="Times New Roman" w:cs="Times New Roman"/>
+          <w:sz w:val="24"/>
+          <w:szCs w:val="24"/>
+          <w:lang w:val="en-US"/>
+        </w:rPr>
+        <w:t>html</w:t>
+      </w:r>
+      <w:r>
+        <w:rPr>
+          <w:rFonts w:ascii="Times New Roman" w:hAnsi="Times New Roman" w:cs="Times New Roman"/>
+          <w:sz w:val="24"/>
+          <w:szCs w:val="24"/>
+        </w:rPr>
+        <w:t xml:space="preserve"> </w:t>
+      </w:r>
+      <w:r>
+        <w:rPr>
+          <w:rFonts w:ascii="Times New Roman" w:hAnsi="Times New Roman" w:cs="Times New Roman"/>
+          <w:sz w:val="24"/>
+          <w:szCs w:val="24"/>
+        </w:rPr>
+        <w:t>файле 1 страницы</w:t>
+      </w:r>
+      <w:r>
+        <w:rPr>
+          <w:rFonts w:ascii="Times New Roman" w:hAnsi="Times New Roman" w:cs="Times New Roman"/>
+          <w:sz w:val="24"/>
+          <w:szCs w:val="24"/>
+        </w:rPr>
+        <w:t xml:space="preserve">. </w:t>
+      </w:r>
+    </w:p>
+    <w:p>
+      <w:pPr>
+        <w:rPr>
+          <w:rFonts w:ascii="Times New Roman" w:hAnsi="Times New Roman" w:cs="Times New Roman"/>
+          <w:sz w:val="24"/>
+          <w:szCs w:val="24"/>
+        </w:rPr>
+      </w:pPr>
+      <w:r>
+        <w:rPr>
+          <w:rFonts w:ascii="Times New Roman" w:hAnsi="Times New Roman" w:cs="Times New Roman"/>
+          <w:sz w:val="24"/>
+          <w:szCs w:val="24"/>
+        </w:rPr>
+        <w:t>Были добавлены стили для основного тела веб-страницы, заголовков 1 и 2.</w:t>
+      </w:r>
+    </w:p>
+    <w:p>
+      <w:pPr>
+        <w:shd w:val="clear" w:color="auto" w:fill="1F1F1F"/>
+        <w:spacing w:line="285" w:lineRule="atLeast"/>
+        <w:ind w:firstLine="0"/>
+        <w:jc w:val="left"/>
+        <w:rPr>
+          <w:rFonts w:ascii="Consolas" w:eastAsia="Times New Roman" w:hAnsi="Consolas" w:cs="Times New Roman"/>
+          <w:color w:val="CCCCCC"/>
+          <w:sz w:val="21"/>
+          <w:szCs w:val="21"/>
+          <w:lang w:val="en-US" w:eastAsia="ru-RU"/>
+        </w:rPr>
+      </w:pPr>
+      <w:r>
+        <w:rPr>
+          <w:rFonts w:ascii="Consolas" w:eastAsia="Times New Roman" w:hAnsi="Consolas" w:cs="Times New Roman"/>
+          <w:color w:val="D7BA7D"/>
+          <w:sz w:val="21"/>
+          <w:szCs w:val="21"/>
+          <w:lang w:val="en-US" w:eastAsia="ru-RU"/>
+        </w:rPr>
+        <w:t>body</w:t>
+      </w:r>
+      <w:r>
+        <w:rPr>
+          <w:rFonts w:ascii="Consolas" w:eastAsia="Times New Roman" w:hAnsi="Consolas" w:cs="Times New Roman"/>
+          <w:color w:val="CCCCCC"/>
+          <w:sz w:val="21"/>
+          <w:szCs w:val="21"/>
+          <w:lang w:val="en-US" w:eastAsia="ru-RU"/>
+        </w:rPr>
+        <w:t xml:space="preserve"> {</w:t>
+      </w:r>
+    </w:p>
+    <w:p>
+      <w:pPr>
+        <w:shd w:val="clear" w:color="auto" w:fill="1F1F1F"/>
+        <w:spacing w:line="285" w:lineRule="atLeast"/>
+        <w:ind w:firstLine="0"/>
+        <w:jc w:val="left"/>
+        <w:rPr>
+          <w:rFonts w:ascii="Consolas" w:eastAsia="Times New Roman" w:hAnsi="Consolas" w:cs="Times New Roman"/>
+          <w:color w:val="CCCCCC"/>
+          <w:sz w:val="21"/>
+          <w:szCs w:val="21"/>
+          <w:lang w:val="en-US" w:eastAsia="ru-RU"/>
+        </w:rPr>
+      </w:pPr>
+      <w:r>
+        <w:rPr>
+          <w:rFonts w:ascii="Consolas" w:eastAsia="Times New Roman" w:hAnsi="Consolas" w:cs="Times New Roman"/>
+          <w:color w:val="CCCCCC"/>
+          <w:sz w:val="21"/>
+          <w:szCs w:val="21"/>
+          <w:lang w:val="en-US" w:eastAsia="ru-RU"/>
+        </w:rPr>
+        <w:t xml:space="preserve">    </w:t>
+      </w:r>
+      <w:r>
+        <w:rPr>
+          <w:rFonts w:ascii="Consolas" w:eastAsia="Times New Roman" w:hAnsi="Consolas" w:cs="Times New Roman"/>
+          <w:color w:val="9CDCFE"/>
+          <w:sz w:val="21"/>
+          <w:szCs w:val="21"/>
+          <w:lang w:val="en-US" w:eastAsia="ru-RU"/>
+        </w:rPr>
+        <w:t>background-color</w:t>
+      </w:r>
+      <w:r>
+        <w:rPr>
+          <w:rFonts w:ascii="Consolas" w:eastAsia="Times New Roman" w:hAnsi="Consolas" w:cs="Times New Roman"/>
+          <w:color w:val="CCCCCC"/>
+          <w:sz w:val="21"/>
+          <w:szCs w:val="21"/>
+          <w:lang w:val="en-US" w:eastAsia="ru-RU"/>
+        </w:rPr>
+        <w:t xml:space="preserve">: </w:t>
+      </w:r>
       <w:proofErr w:type="spellStart"/>
-      <w:r>
-        <w:rPr>
-          <w:rFonts w:ascii="Times New Roman" w:hAnsi="Times New Roman" w:cs="Times New Roman"/>
-          <w:sz w:val="24"/>
-          <w:szCs w:val="24"/>
-        </w:rPr>
-        <w:t>Ывавава</w:t>
+      <w:proofErr w:type="gramStart"/>
+      <w:r>
+        <w:rPr>
+          <w:rFonts w:ascii="Consolas" w:eastAsia="Times New Roman" w:hAnsi="Consolas" w:cs="Times New Roman"/>
+          <w:color w:val="DCDCAA"/>
+          <w:sz w:val="21"/>
+          <w:szCs w:val="21"/>
+          <w:lang w:val="en-US" w:eastAsia="ru-RU"/>
+        </w:rPr>
+        <w:t>rgb</w:t>
       </w:r>
       <w:proofErr w:type="spellEnd"/>
+      <w:r>
+        <w:rPr>
+          <w:rFonts w:ascii="Consolas" w:eastAsia="Times New Roman" w:hAnsi="Consolas" w:cs="Times New Roman"/>
+          <w:color w:val="CCCCCC"/>
+          <w:sz w:val="21"/>
+          <w:szCs w:val="21"/>
+          <w:lang w:val="en-US" w:eastAsia="ru-RU"/>
+        </w:rPr>
+        <w:t>(</w:t>
+      </w:r>
+      <w:proofErr w:type="gramEnd"/>
+      <w:r>
+        <w:rPr>
+          <w:rFonts w:ascii="Consolas" w:eastAsia="Times New Roman" w:hAnsi="Consolas" w:cs="Times New Roman"/>
+          <w:color w:val="B5CEA8"/>
+          <w:sz w:val="21"/>
+          <w:szCs w:val="21"/>
+          <w:lang w:val="en-US" w:eastAsia="ru-RU"/>
+        </w:rPr>
+        <w:t>255</w:t>
+      </w:r>
+      <w:r>
+        <w:rPr>
+          <w:rFonts w:ascii="Consolas" w:eastAsia="Times New Roman" w:hAnsi="Consolas" w:cs="Times New Roman"/>
+          <w:color w:val="CCCCCC"/>
+          <w:sz w:val="21"/>
+          <w:szCs w:val="21"/>
+          <w:lang w:val="en-US" w:eastAsia="ru-RU"/>
+        </w:rPr>
+        <w:t xml:space="preserve">, </w:t>
+      </w:r>
+      <w:r>
+        <w:rPr>
+          <w:rFonts w:ascii="Consolas" w:eastAsia="Times New Roman" w:hAnsi="Consolas" w:cs="Times New Roman"/>
+          <w:color w:val="B5CEA8"/>
+          <w:sz w:val="21"/>
+          <w:szCs w:val="21"/>
+          <w:lang w:val="en-US" w:eastAsia="ru-RU"/>
+        </w:rPr>
+        <w:t>240</w:t>
+      </w:r>
+      <w:r>
+        <w:rPr>
+          <w:rFonts w:ascii="Consolas" w:eastAsia="Times New Roman" w:hAnsi="Consolas" w:cs="Times New Roman"/>
+          <w:color w:val="CCCCCC"/>
+          <w:sz w:val="21"/>
+          <w:szCs w:val="21"/>
+          <w:lang w:val="en-US" w:eastAsia="ru-RU"/>
+        </w:rPr>
+        <w:t xml:space="preserve">, </w:t>
+      </w:r>
+      <w:r>
+        <w:rPr>
+          <w:rFonts w:ascii="Consolas" w:eastAsia="Times New Roman" w:hAnsi="Consolas" w:cs="Times New Roman"/>
+          <w:color w:val="B5CEA8"/>
+          <w:sz w:val="21"/>
+          <w:szCs w:val="21"/>
+          <w:lang w:val="en-US" w:eastAsia="ru-RU"/>
+        </w:rPr>
+        <w:t>218</w:t>
+      </w:r>
+      <w:r>
+        <w:rPr>
+          <w:rFonts w:ascii="Consolas" w:eastAsia="Times New Roman" w:hAnsi="Consolas" w:cs="Times New Roman"/>
+          <w:color w:val="CCCCCC"/>
+          <w:sz w:val="21"/>
+          <w:szCs w:val="21"/>
+          <w:lang w:val="en-US" w:eastAsia="ru-RU"/>
+        </w:rPr>
+        <w:t>);</w:t>
+      </w:r>
+    </w:p>
+    <w:p>
+      <w:pPr>
+        <w:shd w:val="clear" w:color="auto" w:fill="1F1F1F"/>
+        <w:spacing w:line="285" w:lineRule="atLeast"/>
+        <w:ind w:firstLine="0"/>
+        <w:jc w:val="left"/>
+        <w:rPr>
+          <w:rFonts w:ascii="Consolas" w:eastAsia="Times New Roman" w:hAnsi="Consolas" w:cs="Times New Roman"/>
+          <w:color w:val="CCCCCC"/>
+          <w:sz w:val="21"/>
+          <w:szCs w:val="21"/>
+          <w:lang w:val="en-US" w:eastAsia="ru-RU"/>
+        </w:rPr>
+      </w:pPr>
+      <w:r>
+        <w:rPr>
+          <w:rFonts w:ascii="Consolas" w:eastAsia="Times New Roman" w:hAnsi="Consolas" w:cs="Times New Roman"/>
+          <w:color w:val="CCCCCC"/>
+          <w:sz w:val="21"/>
+          <w:szCs w:val="21"/>
+          <w:lang w:val="en-US" w:eastAsia="ru-RU"/>
+        </w:rPr>
+        <w:t xml:space="preserve">    </w:t>
+      </w:r>
+      <w:r>
+        <w:rPr>
+          <w:rFonts w:ascii="Consolas" w:eastAsia="Times New Roman" w:hAnsi="Consolas" w:cs="Times New Roman"/>
+          <w:color w:val="9CDCFE"/>
+          <w:sz w:val="21"/>
+          <w:szCs w:val="21"/>
+          <w:lang w:val="en-US" w:eastAsia="ru-RU"/>
+        </w:rPr>
+        <w:t>font-family</w:t>
+      </w:r>
+      <w:r>
+        <w:rPr>
+          <w:rFonts w:ascii="Consolas" w:eastAsia="Times New Roman" w:hAnsi="Consolas" w:cs="Times New Roman"/>
+          <w:color w:val="CCCCCC"/>
+          <w:sz w:val="21"/>
+          <w:szCs w:val="21"/>
+          <w:lang w:val="en-US" w:eastAsia="ru-RU"/>
+        </w:rPr>
+        <w:t xml:space="preserve">: </w:t>
+      </w:r>
+      <w:r>
+        <w:rPr>
+          <w:rFonts w:ascii="Consolas" w:eastAsia="Times New Roman" w:hAnsi="Consolas" w:cs="Times New Roman"/>
+          <w:color w:val="CE9178"/>
+          <w:sz w:val="21"/>
+          <w:szCs w:val="21"/>
+          <w:lang w:val="en-US" w:eastAsia="ru-RU"/>
+        </w:rPr>
+        <w:t>'Segoe UI'</w:t>
+      </w:r>
+      <w:r>
+        <w:rPr>
+          <w:rFonts w:ascii="Consolas" w:eastAsia="Times New Roman" w:hAnsi="Consolas" w:cs="Times New Roman"/>
+          <w:color w:val="CCCCCC"/>
+          <w:sz w:val="21"/>
+          <w:szCs w:val="21"/>
+          <w:lang w:val="en-US" w:eastAsia="ru-RU"/>
+        </w:rPr>
+        <w:t>;</w:t>
+      </w:r>
+    </w:p>
+    <w:p>
+      <w:pPr>
+        <w:shd w:val="clear" w:color="auto" w:fill="1F1F1F"/>
+        <w:spacing w:line="285" w:lineRule="atLeast"/>
+        <w:ind w:firstLine="0"/>
+        <w:jc w:val="left"/>
+        <w:rPr>
+          <w:rFonts w:ascii="Consolas" w:eastAsia="Times New Roman" w:hAnsi="Consolas" w:cs="Times New Roman"/>
+          <w:color w:val="CCCCCC"/>
+          <w:sz w:val="21"/>
+          <w:szCs w:val="21"/>
+          <w:lang w:val="en-US" w:eastAsia="ru-RU"/>
+        </w:rPr>
+      </w:pPr>
+      <w:r>
+        <w:rPr>
+          <w:rFonts w:ascii="Consolas" w:eastAsia="Times New Roman" w:hAnsi="Consolas" w:cs="Times New Roman"/>
+          <w:color w:val="CCCCCC"/>
+          <w:sz w:val="21"/>
+          <w:szCs w:val="21"/>
+          <w:lang w:val="en-US" w:eastAsia="ru-RU"/>
+        </w:rPr>
+        <w:t>}</w:t>
+      </w:r>
+    </w:p>
+    <w:p>
+      <w:pPr>
+        <w:shd w:val="clear" w:color="auto" w:fill="1F1F1F"/>
+        <w:spacing w:line="285" w:lineRule="atLeast"/>
+        <w:ind w:firstLine="0"/>
+        <w:jc w:val="left"/>
+        <w:rPr>
+          <w:rFonts w:ascii="Consolas" w:eastAsia="Times New Roman" w:hAnsi="Consolas" w:cs="Times New Roman"/>
+          <w:color w:val="CCCCCC"/>
+          <w:sz w:val="21"/>
+          <w:szCs w:val="21"/>
+          <w:lang w:val="en-US" w:eastAsia="ru-RU"/>
+        </w:rPr>
+      </w:pPr>
+      <w:r>
+        <w:rPr>
+          <w:rFonts w:ascii="Consolas" w:eastAsia="Times New Roman" w:hAnsi="Consolas" w:cs="Times New Roman"/>
+          <w:color w:val="D7BA7D"/>
+          <w:sz w:val="21"/>
+          <w:szCs w:val="21"/>
+          <w:lang w:val="en-US" w:eastAsia="ru-RU"/>
+        </w:rPr>
+        <w:t>h1</w:t>
+      </w:r>
+      <w:r>
+        <w:rPr>
+          <w:rFonts w:ascii="Consolas" w:eastAsia="Times New Roman" w:hAnsi="Consolas" w:cs="Times New Roman"/>
+          <w:color w:val="CCCCCC"/>
+          <w:sz w:val="21"/>
+          <w:szCs w:val="21"/>
+          <w:lang w:val="en-US" w:eastAsia="ru-RU"/>
+        </w:rPr>
+        <w:t xml:space="preserve"> {</w:t>
+      </w:r>
+    </w:p>
+    <w:p>
+      <w:pPr>
+        <w:shd w:val="clear" w:color="auto" w:fill="1F1F1F"/>
+        <w:spacing w:line="285" w:lineRule="atLeast"/>
+        <w:ind w:firstLine="0"/>
+        <w:jc w:val="left"/>
+        <w:rPr>
+          <w:rFonts w:ascii="Consolas" w:eastAsia="Times New Roman" w:hAnsi="Consolas" w:cs="Times New Roman"/>
+          <w:color w:val="CCCCCC"/>
+          <w:sz w:val="21"/>
+          <w:szCs w:val="21"/>
+          <w:lang w:val="en-US" w:eastAsia="ru-RU"/>
+        </w:rPr>
+      </w:pPr>
+      <w:r>
+        <w:rPr>
+          <w:rFonts w:ascii="Consolas" w:eastAsia="Times New Roman" w:hAnsi="Consolas" w:cs="Times New Roman"/>
+          <w:color w:val="CCCCCC"/>
+          <w:sz w:val="21"/>
+          <w:szCs w:val="21"/>
+          <w:lang w:val="en-US" w:eastAsia="ru-RU"/>
+        </w:rPr>
+        <w:t xml:space="preserve">    </w:t>
+      </w:r>
+      <w:r>
+        <w:rPr>
+          <w:rFonts w:ascii="Consolas" w:eastAsia="Times New Roman" w:hAnsi="Consolas" w:cs="Times New Roman"/>
+          <w:color w:val="9CDCFE"/>
+          <w:sz w:val="21"/>
+          <w:szCs w:val="21"/>
+          <w:lang w:val="en-US" w:eastAsia="ru-RU"/>
+        </w:rPr>
+        <w:t>font-family</w:t>
+      </w:r>
+      <w:r>
+        <w:rPr>
+          <w:rFonts w:ascii="Consolas" w:eastAsia="Times New Roman" w:hAnsi="Consolas" w:cs="Times New Roman"/>
+          <w:color w:val="CCCCCC"/>
+          <w:sz w:val="21"/>
+          <w:szCs w:val="21"/>
+          <w:lang w:val="en-US" w:eastAsia="ru-RU"/>
+        </w:rPr>
+        <w:t xml:space="preserve">: </w:t>
+      </w:r>
+      <w:r>
+        <w:rPr>
+          <w:rFonts w:ascii="Consolas" w:eastAsia="Times New Roman" w:hAnsi="Consolas" w:cs="Times New Roman"/>
+          <w:color w:val="CE9178"/>
+          <w:sz w:val="21"/>
+          <w:szCs w:val="21"/>
+          <w:lang w:val="en-US" w:eastAsia="ru-RU"/>
+        </w:rPr>
+        <w:t>'Segoe UI'</w:t>
+      </w:r>
+      <w:r>
+        <w:rPr>
+          <w:rFonts w:ascii="Consolas" w:eastAsia="Times New Roman" w:hAnsi="Consolas" w:cs="Times New Roman"/>
+          <w:color w:val="CCCCCC"/>
+          <w:sz w:val="21"/>
+          <w:szCs w:val="21"/>
+          <w:lang w:val="en-US" w:eastAsia="ru-RU"/>
+        </w:rPr>
+        <w:t>;</w:t>
+      </w:r>
+    </w:p>
+    <w:p>
+      <w:pPr>
+        <w:shd w:val="clear" w:color="auto" w:fill="1F1F1F"/>
+        <w:spacing w:line="285" w:lineRule="atLeast"/>
+        <w:ind w:firstLine="0"/>
+        <w:jc w:val="left"/>
+        <w:rPr>
+          <w:rFonts w:ascii="Consolas" w:eastAsia="Times New Roman" w:hAnsi="Consolas" w:cs="Times New Roman"/>
+          <w:color w:val="CCCCCC"/>
+          <w:sz w:val="21"/>
+          <w:szCs w:val="21"/>
+          <w:lang w:val="en-US" w:eastAsia="ru-RU"/>
+        </w:rPr>
+      </w:pPr>
+      <w:r>
+        <w:rPr>
+          <w:rFonts w:ascii="Consolas" w:eastAsia="Times New Roman" w:hAnsi="Consolas" w:cs="Times New Roman"/>
+          <w:color w:val="CCCCCC"/>
+          <w:sz w:val="21"/>
+          <w:szCs w:val="21"/>
+          <w:lang w:val="en-US" w:eastAsia="ru-RU"/>
+        </w:rPr>
+        <w:t xml:space="preserve">    </w:t>
+      </w:r>
+      <w:r>
+        <w:rPr>
+          <w:rFonts w:ascii="Consolas" w:eastAsia="Times New Roman" w:hAnsi="Consolas" w:cs="Times New Roman"/>
+          <w:color w:val="9CDCFE"/>
+          <w:sz w:val="21"/>
+          <w:szCs w:val="21"/>
+          <w:lang w:val="en-US" w:eastAsia="ru-RU"/>
+        </w:rPr>
+        <w:t>font-size</w:t>
+      </w:r>
+      <w:r>
+        <w:rPr>
+          <w:rFonts w:ascii="Consolas" w:eastAsia="Times New Roman" w:hAnsi="Consolas" w:cs="Times New Roman"/>
+          <w:color w:val="CCCCCC"/>
+          <w:sz w:val="21"/>
+          <w:szCs w:val="21"/>
+          <w:lang w:val="en-US" w:eastAsia="ru-RU"/>
+        </w:rPr>
+        <w:t xml:space="preserve">: </w:t>
+      </w:r>
+      <w:r>
+        <w:rPr>
+          <w:rFonts w:ascii="Consolas" w:eastAsia="Times New Roman" w:hAnsi="Consolas" w:cs="Times New Roman"/>
+          <w:color w:val="B5CEA8"/>
+          <w:sz w:val="21"/>
+          <w:szCs w:val="21"/>
+          <w:lang w:val="en-US" w:eastAsia="ru-RU"/>
+        </w:rPr>
+        <w:t>20pt</w:t>
+      </w:r>
+      <w:r>
+        <w:rPr>
+          <w:rFonts w:ascii="Consolas" w:eastAsia="Times New Roman" w:hAnsi="Consolas" w:cs="Times New Roman"/>
+          <w:color w:val="CCCCCC"/>
+          <w:sz w:val="21"/>
+          <w:szCs w:val="21"/>
+          <w:lang w:val="en-US" w:eastAsia="ru-RU"/>
+        </w:rPr>
+        <w:t>;</w:t>
+      </w:r>
+    </w:p>
+    <w:p>
+      <w:pPr>
+        <w:shd w:val="clear" w:color="auto" w:fill="1F1F1F"/>
+        <w:spacing w:line="285" w:lineRule="atLeast"/>
+        <w:ind w:firstLine="0"/>
+        <w:jc w:val="left"/>
+        <w:rPr>
+          <w:rFonts w:ascii="Consolas" w:eastAsia="Times New Roman" w:hAnsi="Consolas" w:cs="Times New Roman"/>
+          <w:color w:val="CCCCCC"/>
+          <w:sz w:val="21"/>
+          <w:szCs w:val="21"/>
+          <w:lang w:val="en-US" w:eastAsia="ru-RU"/>
+        </w:rPr>
+      </w:pPr>
+      <w:r>
+        <w:rPr>
+          <w:rFonts w:ascii="Consolas" w:eastAsia="Times New Roman" w:hAnsi="Consolas" w:cs="Times New Roman"/>
+          <w:color w:val="CCCCCC"/>
+          <w:sz w:val="21"/>
+          <w:szCs w:val="21"/>
+          <w:lang w:val="en-US" w:eastAsia="ru-RU"/>
+        </w:rPr>
+        <w:t xml:space="preserve">    </w:t>
+      </w:r>
+      <w:r>
+        <w:rPr>
+          <w:rFonts w:ascii="Consolas" w:eastAsia="Times New Roman" w:hAnsi="Consolas" w:cs="Times New Roman"/>
+          <w:color w:val="9CDCFE"/>
+          <w:sz w:val="21"/>
+          <w:szCs w:val="21"/>
+          <w:lang w:val="en-US" w:eastAsia="ru-RU"/>
+        </w:rPr>
+        <w:t>color</w:t>
+      </w:r>
+      <w:r>
+        <w:rPr>
+          <w:rFonts w:ascii="Consolas" w:eastAsia="Times New Roman" w:hAnsi="Consolas" w:cs="Times New Roman"/>
+          <w:color w:val="CCCCCC"/>
+          <w:sz w:val="21"/>
+          <w:szCs w:val="21"/>
+          <w:lang w:val="en-US" w:eastAsia="ru-RU"/>
+        </w:rPr>
+        <w:t xml:space="preserve">: </w:t>
+      </w:r>
+      <w:proofErr w:type="spellStart"/>
+      <w:proofErr w:type="gramStart"/>
+      <w:r>
+        <w:rPr>
+          <w:rFonts w:ascii="Consolas" w:eastAsia="Times New Roman" w:hAnsi="Consolas" w:cs="Times New Roman"/>
+          <w:color w:val="DCDCAA"/>
+          <w:sz w:val="21"/>
+          <w:szCs w:val="21"/>
+          <w:lang w:val="en-US" w:eastAsia="ru-RU"/>
+        </w:rPr>
+        <w:t>rgb</w:t>
+      </w:r>
+      <w:proofErr w:type="spellEnd"/>
+      <w:r>
+        <w:rPr>
+          <w:rFonts w:ascii="Consolas" w:eastAsia="Times New Roman" w:hAnsi="Consolas" w:cs="Times New Roman"/>
+          <w:color w:val="CCCCCC"/>
+          <w:sz w:val="21"/>
+          <w:szCs w:val="21"/>
+          <w:lang w:val="en-US" w:eastAsia="ru-RU"/>
+        </w:rPr>
+        <w:t>(</w:t>
+      </w:r>
+      <w:proofErr w:type="gramEnd"/>
+      <w:r>
+        <w:rPr>
+          <w:rFonts w:ascii="Consolas" w:eastAsia="Times New Roman" w:hAnsi="Consolas" w:cs="Times New Roman"/>
+          <w:color w:val="B5CEA8"/>
+          <w:sz w:val="21"/>
+          <w:szCs w:val="21"/>
+          <w:lang w:val="en-US" w:eastAsia="ru-RU"/>
+        </w:rPr>
+        <w:t>22</w:t>
+      </w:r>
+      <w:r>
+        <w:rPr>
+          <w:rFonts w:ascii="Consolas" w:eastAsia="Times New Roman" w:hAnsi="Consolas" w:cs="Times New Roman"/>
+          <w:color w:val="CCCCCC"/>
+          <w:sz w:val="21"/>
+          <w:szCs w:val="21"/>
+          <w:lang w:val="en-US" w:eastAsia="ru-RU"/>
+        </w:rPr>
+        <w:t xml:space="preserve">, </w:t>
+      </w:r>
+      <w:r>
+        <w:rPr>
+          <w:rFonts w:ascii="Consolas" w:eastAsia="Times New Roman" w:hAnsi="Consolas" w:cs="Times New Roman"/>
+          <w:color w:val="B5CEA8"/>
+          <w:sz w:val="21"/>
+          <w:szCs w:val="21"/>
+          <w:lang w:val="en-US" w:eastAsia="ru-RU"/>
+        </w:rPr>
+        <w:t>39</w:t>
+      </w:r>
+      <w:r>
+        <w:rPr>
+          <w:rFonts w:ascii="Consolas" w:eastAsia="Times New Roman" w:hAnsi="Consolas" w:cs="Times New Roman"/>
+          <w:color w:val="CCCCCC"/>
+          <w:sz w:val="21"/>
+          <w:szCs w:val="21"/>
+          <w:lang w:val="en-US" w:eastAsia="ru-RU"/>
+        </w:rPr>
+        <w:t xml:space="preserve">, </w:t>
+      </w:r>
+      <w:r>
+        <w:rPr>
+          <w:rFonts w:ascii="Consolas" w:eastAsia="Times New Roman" w:hAnsi="Consolas" w:cs="Times New Roman"/>
+          <w:color w:val="B5CEA8"/>
+          <w:sz w:val="21"/>
+          <w:szCs w:val="21"/>
+          <w:lang w:val="en-US" w:eastAsia="ru-RU"/>
+        </w:rPr>
+        <w:t>63</w:t>
+      </w:r>
+      <w:r>
+        <w:rPr>
+          <w:rFonts w:ascii="Consolas" w:eastAsia="Times New Roman" w:hAnsi="Consolas" w:cs="Times New Roman"/>
+          <w:color w:val="CCCCCC"/>
+          <w:sz w:val="21"/>
+          <w:szCs w:val="21"/>
+          <w:lang w:val="en-US" w:eastAsia="ru-RU"/>
+        </w:rPr>
+        <w:t>);</w:t>
+      </w:r>
+    </w:p>
+    <w:p>
+      <w:pPr>
+        <w:shd w:val="clear" w:color="auto" w:fill="1F1F1F"/>
+        <w:spacing w:line="285" w:lineRule="atLeast"/>
+        <w:ind w:firstLine="0"/>
+        <w:jc w:val="left"/>
+        <w:rPr>
+          <w:rFonts w:ascii="Consolas" w:eastAsia="Times New Roman" w:hAnsi="Consolas" w:cs="Times New Roman"/>
+          <w:color w:val="CCCCCC"/>
+          <w:sz w:val="21"/>
+          <w:szCs w:val="21"/>
+          <w:lang w:val="en-US" w:eastAsia="ru-RU"/>
+        </w:rPr>
+      </w:pPr>
+      <w:r>
+        <w:rPr>
+          <w:rFonts w:ascii="Consolas" w:eastAsia="Times New Roman" w:hAnsi="Consolas" w:cs="Times New Roman"/>
+          <w:color w:val="CCCCCC"/>
+          <w:sz w:val="21"/>
+          <w:szCs w:val="21"/>
+          <w:lang w:val="en-US" w:eastAsia="ru-RU"/>
+        </w:rPr>
+        <w:t>}</w:t>
+      </w:r>
+    </w:p>
+    <w:p>
+      <w:pPr>
+        <w:shd w:val="clear" w:color="auto" w:fill="1F1F1F"/>
+        <w:spacing w:line="285" w:lineRule="atLeast"/>
+        <w:ind w:firstLine="0"/>
+        <w:jc w:val="left"/>
+        <w:rPr>
+          <w:rFonts w:ascii="Consolas" w:eastAsia="Times New Roman" w:hAnsi="Consolas" w:cs="Times New Roman"/>
+          <w:color w:val="CCCCCC"/>
+          <w:sz w:val="21"/>
+          <w:szCs w:val="21"/>
+          <w:lang w:val="en-US" w:eastAsia="ru-RU"/>
+        </w:rPr>
+      </w:pPr>
+      <w:r>
+        <w:rPr>
+          <w:rFonts w:ascii="Consolas" w:eastAsia="Times New Roman" w:hAnsi="Consolas" w:cs="Times New Roman"/>
+          <w:color w:val="D7BA7D"/>
+          <w:sz w:val="21"/>
+          <w:szCs w:val="21"/>
+          <w:lang w:val="en-US" w:eastAsia="ru-RU"/>
+        </w:rPr>
+        <w:t>h2</w:t>
+      </w:r>
+      <w:r>
+        <w:rPr>
+          <w:rFonts w:ascii="Consolas" w:eastAsia="Times New Roman" w:hAnsi="Consolas" w:cs="Times New Roman"/>
+          <w:color w:val="CCCCCC"/>
+          <w:sz w:val="21"/>
+          <w:szCs w:val="21"/>
+          <w:lang w:val="en-US" w:eastAsia="ru-RU"/>
+        </w:rPr>
+        <w:t xml:space="preserve"> {</w:t>
+      </w:r>
+    </w:p>
+    <w:p>
+      <w:pPr>
+        <w:shd w:val="clear" w:color="auto" w:fill="1F1F1F"/>
+        <w:spacing w:line="285" w:lineRule="atLeast"/>
+        <w:ind w:firstLine="0"/>
+        <w:jc w:val="left"/>
+        <w:rPr>
+          <w:rFonts w:ascii="Consolas" w:eastAsia="Times New Roman" w:hAnsi="Consolas" w:cs="Times New Roman"/>
+          <w:color w:val="CCCCCC"/>
+          <w:sz w:val="21"/>
+          <w:szCs w:val="21"/>
+          <w:lang w:val="en-US" w:eastAsia="ru-RU"/>
+        </w:rPr>
+      </w:pPr>
+      <w:r>
+        <w:rPr>
+          <w:rFonts w:ascii="Consolas" w:eastAsia="Times New Roman" w:hAnsi="Consolas" w:cs="Times New Roman"/>
+          <w:color w:val="CCCCCC"/>
+          <w:sz w:val="21"/>
+          <w:szCs w:val="21"/>
+          <w:lang w:val="en-US" w:eastAsia="ru-RU"/>
+        </w:rPr>
+        <w:t xml:space="preserve">    </w:t>
+      </w:r>
+      <w:r>
+        <w:rPr>
+          <w:rFonts w:ascii="Consolas" w:eastAsia="Times New Roman" w:hAnsi="Consolas" w:cs="Times New Roman"/>
+          <w:color w:val="9CDCFE"/>
+          <w:sz w:val="21"/>
+          <w:szCs w:val="21"/>
+          <w:lang w:val="en-US" w:eastAsia="ru-RU"/>
+        </w:rPr>
+        <w:t>font-family</w:t>
+      </w:r>
+      <w:r>
+        <w:rPr>
+          <w:rFonts w:ascii="Consolas" w:eastAsia="Times New Roman" w:hAnsi="Consolas" w:cs="Times New Roman"/>
+          <w:color w:val="CCCCCC"/>
+          <w:sz w:val="21"/>
+          <w:szCs w:val="21"/>
+          <w:lang w:val="en-US" w:eastAsia="ru-RU"/>
+        </w:rPr>
+        <w:t xml:space="preserve">: </w:t>
+      </w:r>
+      <w:r>
+        <w:rPr>
+          <w:rFonts w:ascii="Consolas" w:eastAsia="Times New Roman" w:hAnsi="Consolas" w:cs="Times New Roman"/>
+          <w:color w:val="CE9178"/>
+          <w:sz w:val="21"/>
+          <w:szCs w:val="21"/>
+          <w:lang w:val="en-US" w:eastAsia="ru-RU"/>
+        </w:rPr>
+        <w:t>'Segoe UI'</w:t>
+      </w:r>
+      <w:r>
+        <w:rPr>
+          <w:rFonts w:ascii="Consolas" w:eastAsia="Times New Roman" w:hAnsi="Consolas" w:cs="Times New Roman"/>
+          <w:color w:val="CCCCCC"/>
+          <w:sz w:val="21"/>
+          <w:szCs w:val="21"/>
+          <w:lang w:val="en-US" w:eastAsia="ru-RU"/>
+        </w:rPr>
+        <w:t>;</w:t>
+      </w:r>
+    </w:p>
+    <w:p>
+      <w:pPr>
+        <w:shd w:val="clear" w:color="auto" w:fill="1F1F1F"/>
+        <w:spacing w:line="285" w:lineRule="atLeast"/>
+        <w:ind w:firstLine="0"/>
+        <w:jc w:val="left"/>
+        <w:rPr>
+          <w:rFonts w:ascii="Consolas" w:eastAsia="Times New Roman" w:hAnsi="Consolas" w:cs="Times New Roman"/>
+          <w:color w:val="CCCCCC"/>
+          <w:sz w:val="21"/>
+          <w:szCs w:val="21"/>
+          <w:lang w:val="en-US" w:eastAsia="ru-RU"/>
+        </w:rPr>
+      </w:pPr>
+      <w:r>
+        <w:rPr>
+          <w:rFonts w:ascii="Consolas" w:eastAsia="Times New Roman" w:hAnsi="Consolas" w:cs="Times New Roman"/>
+          <w:color w:val="CCCCCC"/>
+          <w:sz w:val="21"/>
+          <w:szCs w:val="21"/>
+          <w:lang w:val="en-US" w:eastAsia="ru-RU"/>
+        </w:rPr>
+        <w:t xml:space="preserve">    </w:t>
+      </w:r>
+      <w:r>
+        <w:rPr>
+          <w:rFonts w:ascii="Consolas" w:eastAsia="Times New Roman" w:hAnsi="Consolas" w:cs="Times New Roman"/>
+          <w:color w:val="9CDCFE"/>
+          <w:sz w:val="21"/>
+          <w:szCs w:val="21"/>
+          <w:lang w:val="en-US" w:eastAsia="ru-RU"/>
+        </w:rPr>
+        <w:t>font-size</w:t>
+      </w:r>
+      <w:r>
+        <w:rPr>
+          <w:rFonts w:ascii="Consolas" w:eastAsia="Times New Roman" w:hAnsi="Consolas" w:cs="Times New Roman"/>
+          <w:color w:val="CCCCCC"/>
+          <w:sz w:val="21"/>
+          <w:szCs w:val="21"/>
+          <w:lang w:val="en-US" w:eastAsia="ru-RU"/>
+        </w:rPr>
+        <w:t xml:space="preserve">: </w:t>
+      </w:r>
+      <w:r>
+        <w:rPr>
+          <w:rFonts w:ascii="Consolas" w:eastAsia="Times New Roman" w:hAnsi="Consolas" w:cs="Times New Roman"/>
+          <w:color w:val="CE9178"/>
+          <w:sz w:val="21"/>
+          <w:szCs w:val="21"/>
+          <w:lang w:val="en-US" w:eastAsia="ru-RU"/>
+        </w:rPr>
+        <w:t>large</w:t>
+      </w:r>
+      <w:r>
+        <w:rPr>
+          <w:rFonts w:ascii="Consolas" w:eastAsia="Times New Roman" w:hAnsi="Consolas" w:cs="Times New Roman"/>
+          <w:color w:val="CCCCCC"/>
+          <w:sz w:val="21"/>
+          <w:szCs w:val="21"/>
+          <w:lang w:val="en-US" w:eastAsia="ru-RU"/>
+        </w:rPr>
+        <w:t>;</w:t>
+      </w:r>
+    </w:p>
+    <w:p>
+      <w:pPr>
+        <w:shd w:val="clear" w:color="auto" w:fill="1F1F1F"/>
+        <w:spacing w:line="285" w:lineRule="atLeast"/>
+        <w:ind w:firstLine="0"/>
+        <w:jc w:val="left"/>
+        <w:rPr>
+          <w:rFonts w:ascii="Consolas" w:eastAsia="Times New Roman" w:hAnsi="Consolas" w:cs="Times New Roman"/>
+          <w:color w:val="CCCCCC"/>
+          <w:sz w:val="21"/>
+          <w:szCs w:val="21"/>
+          <w:lang w:val="en-US" w:eastAsia="ru-RU"/>
+        </w:rPr>
+      </w:pPr>
+      <w:r>
+        <w:rPr>
+          <w:rFonts w:ascii="Consolas" w:eastAsia="Times New Roman" w:hAnsi="Consolas" w:cs="Times New Roman"/>
+          <w:color w:val="CCCCCC"/>
+          <w:sz w:val="21"/>
+          <w:szCs w:val="21"/>
+          <w:lang w:val="en-US" w:eastAsia="ru-RU"/>
+        </w:rPr>
+        <w:t xml:space="preserve">    </w:t>
+      </w:r>
+      <w:r>
+        <w:rPr>
+          <w:rFonts w:ascii="Consolas" w:eastAsia="Times New Roman" w:hAnsi="Consolas" w:cs="Times New Roman"/>
+          <w:color w:val="9CDCFE"/>
+          <w:sz w:val="21"/>
+          <w:szCs w:val="21"/>
+          <w:lang w:val="en-US" w:eastAsia="ru-RU"/>
+        </w:rPr>
+        <w:t>font-weight</w:t>
+      </w:r>
+      <w:r>
+        <w:rPr>
+          <w:rFonts w:ascii="Consolas" w:eastAsia="Times New Roman" w:hAnsi="Consolas" w:cs="Times New Roman"/>
+          <w:color w:val="CCCCCC"/>
+          <w:sz w:val="21"/>
+          <w:szCs w:val="21"/>
+          <w:lang w:val="en-US" w:eastAsia="ru-RU"/>
+        </w:rPr>
+        <w:t xml:space="preserve">: </w:t>
+      </w:r>
+      <w:proofErr w:type="gramStart"/>
+      <w:r>
+        <w:rPr>
+          <w:rFonts w:ascii="Consolas" w:eastAsia="Times New Roman" w:hAnsi="Consolas" w:cs="Times New Roman"/>
+          <w:color w:val="B5CEA8"/>
+          <w:sz w:val="21"/>
+          <w:szCs w:val="21"/>
+          <w:lang w:val="en-US" w:eastAsia="ru-RU"/>
+        </w:rPr>
+        <w:t>700</w:t>
+      </w:r>
+      <w:r>
+        <w:rPr>
+          <w:rFonts w:ascii="Consolas" w:eastAsia="Times New Roman" w:hAnsi="Consolas" w:cs="Times New Roman"/>
+          <w:color w:val="CCCCCC"/>
+          <w:sz w:val="21"/>
+          <w:szCs w:val="21"/>
+          <w:lang w:val="en-US" w:eastAsia="ru-RU"/>
+        </w:rPr>
+        <w:t xml:space="preserve"> ;</w:t>
+      </w:r>
+      <w:proofErr w:type="gramEnd"/>
+      <w:r>
+        <w:rPr>
+          <w:rFonts w:ascii="Consolas" w:eastAsia="Times New Roman" w:hAnsi="Consolas" w:cs="Times New Roman"/>
+          <w:color w:val="CCCCCC"/>
+          <w:sz w:val="21"/>
+          <w:szCs w:val="21"/>
+          <w:lang w:val="en-US" w:eastAsia="ru-RU"/>
+        </w:rPr>
+        <w:t xml:space="preserve">    </w:t>
+      </w:r>
+    </w:p>
+    <w:p>
+      <w:pPr>
+        <w:shd w:val="clear" w:color="auto" w:fill="1F1F1F"/>
+        <w:spacing w:line="285" w:lineRule="atLeast"/>
+        <w:ind w:firstLine="0"/>
+        <w:jc w:val="left"/>
+        <w:rPr>
+          <w:rFonts w:ascii="Consolas" w:eastAsia="Times New Roman" w:hAnsi="Consolas" w:cs="Times New Roman"/>
+          <w:color w:val="CCCCCC"/>
+          <w:sz w:val="21"/>
+          <w:szCs w:val="21"/>
+          <w:lang w:val="en-US" w:eastAsia="ru-RU"/>
+        </w:rPr>
+      </w:pPr>
+      <w:r>
+        <w:rPr>
+          <w:rFonts w:ascii="Consolas" w:eastAsia="Times New Roman" w:hAnsi="Consolas" w:cs="Times New Roman"/>
+          <w:color w:val="CCCCCC"/>
+          <w:sz w:val="21"/>
+          <w:szCs w:val="21"/>
+          <w:lang w:val="en-US" w:eastAsia="ru-RU"/>
+        </w:rPr>
+        <w:t xml:space="preserve">    </w:t>
+      </w:r>
+      <w:proofErr w:type="spellStart"/>
+      <w:proofErr w:type="gramStart"/>
+      <w:r>
+        <w:rPr>
+          <w:rFonts w:ascii="Consolas" w:eastAsia="Times New Roman" w:hAnsi="Consolas" w:cs="Times New Roman"/>
+          <w:color w:val="9CDCFE"/>
+          <w:sz w:val="21"/>
+          <w:szCs w:val="21"/>
+          <w:lang w:val="en-US" w:eastAsia="ru-RU"/>
+        </w:rPr>
+        <w:t>color</w:t>
+      </w:r>
+      <w:r>
+        <w:rPr>
+          <w:rFonts w:ascii="Consolas" w:eastAsia="Times New Roman" w:hAnsi="Consolas" w:cs="Times New Roman"/>
+          <w:color w:val="CCCCCC"/>
+          <w:sz w:val="21"/>
+          <w:szCs w:val="21"/>
+          <w:lang w:val="en-US" w:eastAsia="ru-RU"/>
+        </w:rPr>
+        <w:t>:</w:t>
+      </w:r>
+      <w:r>
+        <w:rPr>
+          <w:rFonts w:ascii="Consolas" w:eastAsia="Times New Roman" w:hAnsi="Consolas" w:cs="Times New Roman"/>
+          <w:color w:val="DCDCAA"/>
+          <w:sz w:val="21"/>
+          <w:szCs w:val="21"/>
+          <w:lang w:val="en-US" w:eastAsia="ru-RU"/>
+        </w:rPr>
+        <w:t>rgb</w:t>
+      </w:r>
+      <w:proofErr w:type="spellEnd"/>
+      <w:proofErr w:type="gramEnd"/>
+      <w:r>
+        <w:rPr>
+          <w:rFonts w:ascii="Consolas" w:eastAsia="Times New Roman" w:hAnsi="Consolas" w:cs="Times New Roman"/>
+          <w:color w:val="CCCCCC"/>
+          <w:sz w:val="21"/>
+          <w:szCs w:val="21"/>
+          <w:lang w:val="en-US" w:eastAsia="ru-RU"/>
+        </w:rPr>
+        <w:t>(</w:t>
+      </w:r>
+      <w:r>
+        <w:rPr>
+          <w:rFonts w:ascii="Consolas" w:eastAsia="Times New Roman" w:hAnsi="Consolas" w:cs="Times New Roman"/>
+          <w:color w:val="B5CEA8"/>
+          <w:sz w:val="21"/>
+          <w:szCs w:val="21"/>
+          <w:lang w:val="en-US" w:eastAsia="ru-RU"/>
+        </w:rPr>
+        <w:t>7</w:t>
+      </w:r>
+      <w:r>
+        <w:rPr>
+          <w:rFonts w:ascii="Consolas" w:eastAsia="Times New Roman" w:hAnsi="Consolas" w:cs="Times New Roman"/>
+          <w:color w:val="CCCCCC"/>
+          <w:sz w:val="21"/>
+          <w:szCs w:val="21"/>
+          <w:lang w:val="en-US" w:eastAsia="ru-RU"/>
+        </w:rPr>
+        <w:t xml:space="preserve">, </w:t>
+      </w:r>
+      <w:r>
+        <w:rPr>
+          <w:rFonts w:ascii="Consolas" w:eastAsia="Times New Roman" w:hAnsi="Consolas" w:cs="Times New Roman"/>
+          <w:color w:val="B5CEA8"/>
+          <w:sz w:val="21"/>
+          <w:szCs w:val="21"/>
+          <w:lang w:val="en-US" w:eastAsia="ru-RU"/>
+        </w:rPr>
+        <w:t>77</w:t>
+      </w:r>
+      <w:r>
+        <w:rPr>
+          <w:rFonts w:ascii="Consolas" w:eastAsia="Times New Roman" w:hAnsi="Consolas" w:cs="Times New Roman"/>
+          <w:color w:val="CCCCCC"/>
+          <w:sz w:val="21"/>
+          <w:szCs w:val="21"/>
+          <w:lang w:val="en-US" w:eastAsia="ru-RU"/>
+        </w:rPr>
+        <w:t xml:space="preserve">, </w:t>
+      </w:r>
+      <w:r>
+        <w:rPr>
+          <w:rFonts w:ascii="Consolas" w:eastAsia="Times New Roman" w:hAnsi="Consolas" w:cs="Times New Roman"/>
+          <w:color w:val="B5CEA8"/>
+          <w:sz w:val="21"/>
+          <w:szCs w:val="21"/>
+          <w:lang w:val="en-US" w:eastAsia="ru-RU"/>
+        </w:rPr>
+        <w:t>53</w:t>
+      </w:r>
+      <w:r>
+        <w:rPr>
+          <w:rFonts w:ascii="Consolas" w:eastAsia="Times New Roman" w:hAnsi="Consolas" w:cs="Times New Roman"/>
+          <w:color w:val="CCCCCC"/>
+          <w:sz w:val="21"/>
+          <w:szCs w:val="21"/>
+          <w:lang w:val="en-US" w:eastAsia="ru-RU"/>
+        </w:rPr>
+        <w:t>);</w:t>
+      </w:r>
+    </w:p>
+    <w:p>
+      <w:pPr>
+        <w:shd w:val="clear" w:color="auto" w:fill="1F1F1F"/>
+        <w:spacing w:line="285" w:lineRule="atLeast"/>
+        <w:ind w:firstLine="0"/>
+        <w:jc w:val="left"/>
+        <w:rPr>
+          <w:rFonts w:ascii="Consolas" w:eastAsia="Times New Roman" w:hAnsi="Consolas" w:cs="Times New Roman"/>
+          <w:color w:val="CCCCCC"/>
+          <w:sz w:val="21"/>
+          <w:szCs w:val="21"/>
+          <w:lang w:val="en-US" w:eastAsia="ru-RU"/>
+        </w:rPr>
+      </w:pPr>
+      <w:r>
+        <w:rPr>
+          <w:rFonts w:ascii="Consolas" w:eastAsia="Times New Roman" w:hAnsi="Consolas" w:cs="Times New Roman"/>
+          <w:color w:val="CCCCCC"/>
+          <w:sz w:val="21"/>
+          <w:szCs w:val="21"/>
+          <w:lang w:val="en-US" w:eastAsia="ru-RU"/>
+        </w:rPr>
+        <w:t xml:space="preserve">    </w:t>
+      </w:r>
+      <w:r>
+        <w:rPr>
+          <w:rFonts w:ascii="Consolas" w:eastAsia="Times New Roman" w:hAnsi="Consolas" w:cs="Times New Roman"/>
+          <w:color w:val="9CDCFE"/>
+          <w:sz w:val="21"/>
+          <w:szCs w:val="21"/>
+          <w:lang w:val="en-US" w:eastAsia="ru-RU"/>
+        </w:rPr>
+        <w:t>font-style</w:t>
+      </w:r>
+      <w:r>
+        <w:rPr>
+          <w:rFonts w:ascii="Consolas" w:eastAsia="Times New Roman" w:hAnsi="Consolas" w:cs="Times New Roman"/>
+          <w:color w:val="CCCCCC"/>
+          <w:sz w:val="21"/>
+          <w:szCs w:val="21"/>
+          <w:lang w:val="en-US" w:eastAsia="ru-RU"/>
+        </w:rPr>
+        <w:t xml:space="preserve">: </w:t>
+      </w:r>
+      <w:r>
+        <w:rPr>
+          <w:rFonts w:ascii="Consolas" w:eastAsia="Times New Roman" w:hAnsi="Consolas" w:cs="Times New Roman"/>
+          <w:color w:val="CE9178"/>
+          <w:sz w:val="21"/>
+          <w:szCs w:val="21"/>
+          <w:lang w:val="en-US" w:eastAsia="ru-RU"/>
+        </w:rPr>
+        <w:t>oblique</w:t>
+      </w:r>
+      <w:r>
+        <w:rPr>
+          <w:rFonts w:ascii="Consolas" w:eastAsia="Times New Roman" w:hAnsi="Consolas" w:cs="Times New Roman"/>
+          <w:color w:val="CCCCCC"/>
+          <w:sz w:val="21"/>
+          <w:szCs w:val="21"/>
+          <w:lang w:val="en-US" w:eastAsia="ru-RU"/>
+        </w:rPr>
+        <w:t>;</w:t>
+      </w:r>
+    </w:p>
+    <w:p>
+      <w:pPr>
+        <w:shd w:val="clear" w:color="auto" w:fill="1F1F1F"/>
+        <w:spacing w:line="285" w:lineRule="atLeast"/>
+        <w:ind w:firstLine="0"/>
+        <w:jc w:val="left"/>
+        <w:rPr>
+          <w:rFonts w:ascii="Consolas" w:eastAsia="Times New Roman" w:hAnsi="Consolas" w:cs="Times New Roman"/>
+          <w:color w:val="CCCCCC"/>
+          <w:sz w:val="21"/>
+          <w:szCs w:val="21"/>
+          <w:lang w:eastAsia="ru-RU"/>
+        </w:rPr>
+      </w:pPr>
+      <w:r>
+        <w:rPr>
+          <w:rFonts w:ascii="Consolas" w:eastAsia="Times New Roman" w:hAnsi="Consolas" w:cs="Times New Roman"/>
+          <w:color w:val="CCCCCC"/>
+          <w:sz w:val="21"/>
+          <w:szCs w:val="21"/>
+          <w:lang w:eastAsia="ru-RU"/>
+        </w:rPr>
+        <w:t>}</w:t>
+      </w:r>
+    </w:p>
+    <w:p>
+      <w:pPr>
+        <w:ind w:firstLine="0"/>
+        <w:jc w:val="center"/>
+        <w:rPr>
+          <w:rFonts w:ascii="Times New Roman" w:hAnsi="Times New Roman" w:cs="Times New Roman"/>
+          <w:sz w:val="24"/>
+          <w:szCs w:val="24"/>
+        </w:rPr>
+      </w:pPr>
+      <w:r>
+        <w:rPr>
+          <w:noProof/>
+          <w14:ligatures w14:val="standardContextual"/>
+        </w:rPr>
+        <w:drawing>
+          <wp:inline distT="0" distB="0" distL="0" distR="0" wp14:anchorId="0413868C" wp14:editId="3C039879">
+            <wp:extent cx="5940425" cy="3338830"/>
+            <wp:effectExtent l="0" t="0" r="3175" b="0"/>
+            <wp:docPr id="1842298983" name="Рисунок 1"/>
+            <wp:cNvGraphicFramePr>
+              <a:graphicFrameLocks xmlns:a="http://schemas.openxmlformats.org/drawingml/2006/main" noChangeAspect="1"/>
+            </wp:cNvGraphicFramePr>
+            <a:graphic xmlns:a="http://schemas.openxmlformats.org/drawingml/2006/main">
+              <a:graphicData uri="http://schemas.openxmlformats.org/drawingml/2006/picture">
+                <pic:pic xmlns:pic="http://schemas.openxmlformats.org/drawingml/2006/picture">
+                  <pic:nvPicPr>
+                    <pic:cNvPr id="1842298983" name=""/>
+                    <pic:cNvPicPr/>
+                  </pic:nvPicPr>
+                  <pic:blipFill>
+                    <a:blip r:embed="rId9"/>
+                    <a:stretch>
+                      <a:fillRect/>
+                    </a:stretch>
+                  </pic:blipFill>
+                  <pic:spPr>
+                    <a:xfrm>
+                      <a:off x="0" y="0"/>
+                      <a:ext cx="5940425" cy="3338830"/>
+                    </a:xfrm>
+                    <a:prstGeom prst="rect">
+                      <a:avLst/>
+                    </a:prstGeom>
+                  </pic:spPr>
+                </pic:pic>
+              </a:graphicData>
+            </a:graphic>
+          </wp:inline>
+        </w:drawing>
+      </w:r>
+    </w:p>
+    <w:p>
+      <w:pPr>
+        <w:ind w:firstLine="0"/>
+        <w:jc w:val="center"/>
+        <w:rPr>
+          <w:rFonts w:ascii="Times New Roman" w:hAnsi="Times New Roman" w:cs="Times New Roman"/>
+          <w:sz w:val="24"/>
+          <w:szCs w:val="24"/>
+        </w:rPr>
+      </w:pPr>
+      <w:r>
+        <w:rPr>
+          <w:rFonts w:ascii="Times New Roman" w:hAnsi="Times New Roman" w:cs="Times New Roman"/>
+          <w:sz w:val="24"/>
+          <w:szCs w:val="24"/>
+        </w:rPr>
+        <w:t>Рисунок 1 – 1 страница</w:t>
+      </w:r>
+    </w:p>
+    <w:p>
+      <w:pPr>
+        <w:rPr>
+          <w:rFonts w:ascii="Times New Roman" w:hAnsi="Times New Roman" w:cs="Times New Roman"/>
+          <w:sz w:val="24"/>
+          <w:szCs w:val="24"/>
+        </w:rPr>
+      </w:pPr>
+      <w:r>
+        <w:rPr>
+          <w:rFonts w:ascii="Times New Roman" w:hAnsi="Times New Roman" w:cs="Times New Roman"/>
+          <w:sz w:val="24"/>
+          <w:szCs w:val="24"/>
+        </w:rPr>
+        <w:t>Для форматирования текстового содержимого на второй странице был создан отдельный контейнер (&lt;</w:t>
+      </w:r>
+      <w:proofErr w:type="spellStart"/>
+      <w:r>
+        <w:rPr>
+          <w:rFonts w:ascii="Times New Roman" w:hAnsi="Times New Roman" w:cs="Times New Roman"/>
+          <w:sz w:val="24"/>
+          <w:szCs w:val="24"/>
+        </w:rPr>
+        <w:t>div</w:t>
+      </w:r>
+      <w:proofErr w:type="spellEnd"/>
+      <w:r>
+        <w:rPr>
+          <w:rFonts w:ascii="Times New Roman" w:hAnsi="Times New Roman" w:cs="Times New Roman"/>
+          <w:sz w:val="24"/>
+          <w:szCs w:val="24"/>
+        </w:rPr>
+        <w:t>&gt;). К тексту применены следующие CSS-свойства:</w:t>
+      </w:r>
+    </w:p>
+    <w:p>
+      <w:pPr>
+        <w:numPr>
+          <w:ilvl w:val="0"/>
+          <w:numId w:val="79"/>
+        </w:numPr>
+        <w:rPr>
+          <w:rFonts w:ascii="Times New Roman" w:hAnsi="Times New Roman" w:cs="Times New Roman"/>
+          <w:sz w:val="24"/>
+          <w:szCs w:val="24"/>
+        </w:rPr>
+      </w:pPr>
+      <w:r>
+        <w:rPr>
+          <w:rFonts w:ascii="Times New Roman" w:hAnsi="Times New Roman" w:cs="Times New Roman"/>
+          <w:sz w:val="24"/>
+          <w:szCs w:val="24"/>
+        </w:rPr>
+        <w:t xml:space="preserve">Оформление: использовано свойство </w:t>
+      </w:r>
+      <w:proofErr w:type="spellStart"/>
+      <w:r>
+        <w:rPr>
+          <w:rFonts w:ascii="Times New Roman" w:hAnsi="Times New Roman" w:cs="Times New Roman"/>
+          <w:sz w:val="24"/>
+          <w:szCs w:val="24"/>
+        </w:rPr>
+        <w:t>text-decoration</w:t>
+      </w:r>
+      <w:proofErr w:type="spellEnd"/>
+      <w:r>
+        <w:rPr>
+          <w:rFonts w:ascii="Times New Roman" w:hAnsi="Times New Roman" w:cs="Times New Roman"/>
+          <w:sz w:val="24"/>
+          <w:szCs w:val="24"/>
+        </w:rPr>
+        <w:t xml:space="preserve"> для применения подчёркивания (</w:t>
+      </w:r>
+      <w:proofErr w:type="spellStart"/>
+      <w:r>
+        <w:rPr>
+          <w:rFonts w:ascii="Times New Roman" w:hAnsi="Times New Roman" w:cs="Times New Roman"/>
+          <w:sz w:val="24"/>
+          <w:szCs w:val="24"/>
+        </w:rPr>
+        <w:t>underline</w:t>
+      </w:r>
+      <w:proofErr w:type="spellEnd"/>
+      <w:r>
+        <w:rPr>
+          <w:rFonts w:ascii="Times New Roman" w:hAnsi="Times New Roman" w:cs="Times New Roman"/>
+          <w:sz w:val="24"/>
+          <w:szCs w:val="24"/>
+        </w:rPr>
+        <w:t xml:space="preserve">), </w:t>
+      </w:r>
+      <w:proofErr w:type="spellStart"/>
+      <w:r>
+        <w:rPr>
+          <w:rFonts w:ascii="Times New Roman" w:hAnsi="Times New Roman" w:cs="Times New Roman"/>
+          <w:sz w:val="24"/>
+          <w:szCs w:val="24"/>
+        </w:rPr>
+        <w:t>надчёркивания</w:t>
+      </w:r>
+      <w:proofErr w:type="spellEnd"/>
+      <w:r>
+        <w:rPr>
+          <w:rFonts w:ascii="Times New Roman" w:hAnsi="Times New Roman" w:cs="Times New Roman"/>
+          <w:sz w:val="24"/>
+          <w:szCs w:val="24"/>
+        </w:rPr>
+        <w:t xml:space="preserve"> (</w:t>
+      </w:r>
+      <w:proofErr w:type="spellStart"/>
+      <w:r>
+        <w:rPr>
+          <w:rFonts w:ascii="Times New Roman" w:hAnsi="Times New Roman" w:cs="Times New Roman"/>
+          <w:sz w:val="24"/>
+          <w:szCs w:val="24"/>
+        </w:rPr>
+        <w:t>overline</w:t>
+      </w:r>
+      <w:proofErr w:type="spellEnd"/>
+      <w:r>
+        <w:rPr>
+          <w:rFonts w:ascii="Times New Roman" w:hAnsi="Times New Roman" w:cs="Times New Roman"/>
+          <w:sz w:val="24"/>
+          <w:szCs w:val="24"/>
+        </w:rPr>
+        <w:t>) и зачёркивания (</w:t>
+      </w:r>
+      <w:proofErr w:type="spellStart"/>
+      <w:r>
+        <w:rPr>
+          <w:rFonts w:ascii="Times New Roman" w:hAnsi="Times New Roman" w:cs="Times New Roman"/>
+          <w:sz w:val="24"/>
+          <w:szCs w:val="24"/>
+        </w:rPr>
+        <w:t>line-through</w:t>
+      </w:r>
+      <w:proofErr w:type="spellEnd"/>
+      <w:r>
+        <w:rPr>
+          <w:rFonts w:ascii="Times New Roman" w:hAnsi="Times New Roman" w:cs="Times New Roman"/>
+          <w:sz w:val="24"/>
+          <w:szCs w:val="24"/>
+        </w:rPr>
+        <w:t>).</w:t>
+      </w:r>
+    </w:p>
+    <w:p>
+      <w:pPr>
+        <w:numPr>
+          <w:ilvl w:val="0"/>
+          <w:numId w:val="79"/>
+        </w:numPr>
+        <w:rPr>
+          <w:rFonts w:ascii="Times New Roman" w:hAnsi="Times New Roman" w:cs="Times New Roman"/>
+          <w:sz w:val="24"/>
+          <w:szCs w:val="24"/>
+        </w:rPr>
+      </w:pPr>
+      <w:r>
+        <w:rPr>
+          <w:rFonts w:ascii="Times New Roman" w:hAnsi="Times New Roman" w:cs="Times New Roman"/>
+          <w:sz w:val="24"/>
+          <w:szCs w:val="24"/>
+        </w:rPr>
+        <w:t xml:space="preserve">Выравнивание: горизонтальное выравнивание задано через </w:t>
+      </w:r>
+      <w:proofErr w:type="spellStart"/>
+      <w:r>
+        <w:rPr>
+          <w:rFonts w:ascii="Times New Roman" w:hAnsi="Times New Roman" w:cs="Times New Roman"/>
+          <w:sz w:val="24"/>
+          <w:szCs w:val="24"/>
+        </w:rPr>
+        <w:t>text-align</w:t>
+      </w:r>
+      <w:proofErr w:type="spellEnd"/>
+      <w:r>
+        <w:rPr>
+          <w:rFonts w:ascii="Times New Roman" w:hAnsi="Times New Roman" w:cs="Times New Roman"/>
+          <w:sz w:val="24"/>
+          <w:szCs w:val="24"/>
+        </w:rPr>
+        <w:t xml:space="preserve"> со значениями </w:t>
+      </w:r>
+      <w:proofErr w:type="spellStart"/>
+      <w:r>
+        <w:rPr>
+          <w:rFonts w:ascii="Times New Roman" w:hAnsi="Times New Roman" w:cs="Times New Roman"/>
+          <w:sz w:val="24"/>
+          <w:szCs w:val="24"/>
+        </w:rPr>
+        <w:t>left</w:t>
+      </w:r>
+      <w:proofErr w:type="spellEnd"/>
+      <w:r>
+        <w:rPr>
+          <w:rFonts w:ascii="Times New Roman" w:hAnsi="Times New Roman" w:cs="Times New Roman"/>
+          <w:sz w:val="24"/>
+          <w:szCs w:val="24"/>
+        </w:rPr>
+        <w:t xml:space="preserve">, </w:t>
+      </w:r>
+      <w:proofErr w:type="spellStart"/>
+      <w:r>
+        <w:rPr>
+          <w:rFonts w:ascii="Times New Roman" w:hAnsi="Times New Roman" w:cs="Times New Roman"/>
+          <w:sz w:val="24"/>
+          <w:szCs w:val="24"/>
+        </w:rPr>
+        <w:t>center</w:t>
+      </w:r>
+      <w:proofErr w:type="spellEnd"/>
+      <w:r>
+        <w:rPr>
+          <w:rFonts w:ascii="Times New Roman" w:hAnsi="Times New Roman" w:cs="Times New Roman"/>
+          <w:sz w:val="24"/>
+          <w:szCs w:val="24"/>
+        </w:rPr>
+        <w:t xml:space="preserve">, </w:t>
+      </w:r>
+      <w:proofErr w:type="spellStart"/>
+      <w:r>
+        <w:rPr>
+          <w:rFonts w:ascii="Times New Roman" w:hAnsi="Times New Roman" w:cs="Times New Roman"/>
+          <w:sz w:val="24"/>
+          <w:szCs w:val="24"/>
+        </w:rPr>
+        <w:t>right</w:t>
+      </w:r>
+      <w:proofErr w:type="spellEnd"/>
+      <w:r>
+        <w:rPr>
+          <w:rFonts w:ascii="Times New Roman" w:hAnsi="Times New Roman" w:cs="Times New Roman"/>
+          <w:sz w:val="24"/>
+          <w:szCs w:val="24"/>
+        </w:rPr>
+        <w:t xml:space="preserve"> и </w:t>
+      </w:r>
+      <w:proofErr w:type="spellStart"/>
+      <w:r>
+        <w:rPr>
+          <w:rFonts w:ascii="Times New Roman" w:hAnsi="Times New Roman" w:cs="Times New Roman"/>
+          <w:sz w:val="24"/>
+          <w:szCs w:val="24"/>
+        </w:rPr>
+        <w:t>justify</w:t>
+      </w:r>
+      <w:proofErr w:type="spellEnd"/>
+      <w:r>
+        <w:rPr>
+          <w:rFonts w:ascii="Times New Roman" w:hAnsi="Times New Roman" w:cs="Times New Roman"/>
+          <w:sz w:val="24"/>
+          <w:szCs w:val="24"/>
+        </w:rPr>
+        <w:t>.</w:t>
+      </w:r>
+    </w:p>
+    <w:p>
+      <w:pPr>
+        <w:numPr>
+          <w:ilvl w:val="0"/>
+          <w:numId w:val="79"/>
+        </w:numPr>
+        <w:rPr>
+          <w:rFonts w:ascii="Times New Roman" w:hAnsi="Times New Roman" w:cs="Times New Roman"/>
+          <w:sz w:val="24"/>
+          <w:szCs w:val="24"/>
+        </w:rPr>
+      </w:pPr>
+      <w:r>
+        <w:rPr>
+          <w:rFonts w:ascii="Times New Roman" w:hAnsi="Times New Roman" w:cs="Times New Roman"/>
+          <w:sz w:val="24"/>
+          <w:szCs w:val="24"/>
+        </w:rPr>
+        <w:lastRenderedPageBreak/>
+        <w:t xml:space="preserve">Вертикальное выравнивание: свойство </w:t>
+      </w:r>
+      <w:proofErr w:type="spellStart"/>
+      <w:r>
+        <w:rPr>
+          <w:rFonts w:ascii="Times New Roman" w:hAnsi="Times New Roman" w:cs="Times New Roman"/>
+          <w:sz w:val="24"/>
+          <w:szCs w:val="24"/>
+        </w:rPr>
+        <w:t>vertical-align</w:t>
+      </w:r>
+      <w:proofErr w:type="spellEnd"/>
+      <w:r>
+        <w:rPr>
+          <w:rFonts w:ascii="Times New Roman" w:hAnsi="Times New Roman" w:cs="Times New Roman"/>
+          <w:sz w:val="24"/>
+          <w:szCs w:val="24"/>
+        </w:rPr>
+        <w:t xml:space="preserve"> применено для размещения изображений внутри строки (</w:t>
+      </w:r>
+      <w:proofErr w:type="spellStart"/>
+      <w:r>
+        <w:rPr>
+          <w:rFonts w:ascii="Times New Roman" w:hAnsi="Times New Roman" w:cs="Times New Roman"/>
+          <w:sz w:val="24"/>
+          <w:szCs w:val="24"/>
+        </w:rPr>
+        <w:t>middle</w:t>
+      </w:r>
+      <w:proofErr w:type="spellEnd"/>
+      <w:r>
+        <w:rPr>
+          <w:rFonts w:ascii="Times New Roman" w:hAnsi="Times New Roman" w:cs="Times New Roman"/>
+          <w:sz w:val="24"/>
+          <w:szCs w:val="24"/>
+        </w:rPr>
+        <w:t>), а также использованы теги верхнего (&lt;</w:t>
+      </w:r>
+      <w:proofErr w:type="spellStart"/>
+      <w:r>
+        <w:rPr>
+          <w:rFonts w:ascii="Times New Roman" w:hAnsi="Times New Roman" w:cs="Times New Roman"/>
+          <w:sz w:val="24"/>
+          <w:szCs w:val="24"/>
+        </w:rPr>
+        <w:t>sup</w:t>
+      </w:r>
+      <w:proofErr w:type="spellEnd"/>
+      <w:r>
+        <w:rPr>
+          <w:rFonts w:ascii="Times New Roman" w:hAnsi="Times New Roman" w:cs="Times New Roman"/>
+          <w:sz w:val="24"/>
+          <w:szCs w:val="24"/>
+        </w:rPr>
+        <w:t>&gt;) и нижнего (&lt;</w:t>
+      </w:r>
+      <w:proofErr w:type="spellStart"/>
+      <w:r>
+        <w:rPr>
+          <w:rFonts w:ascii="Times New Roman" w:hAnsi="Times New Roman" w:cs="Times New Roman"/>
+          <w:sz w:val="24"/>
+          <w:szCs w:val="24"/>
+        </w:rPr>
+        <w:t>sub</w:t>
+      </w:r>
+      <w:proofErr w:type="spellEnd"/>
+      <w:r>
+        <w:rPr>
+          <w:rFonts w:ascii="Times New Roman" w:hAnsi="Times New Roman" w:cs="Times New Roman"/>
+          <w:sz w:val="24"/>
+          <w:szCs w:val="24"/>
+        </w:rPr>
+        <w:t>&gt;) индексов.</w:t>
+      </w:r>
+    </w:p>
+    <w:p>
+      <w:pPr>
+        <w:numPr>
+          <w:ilvl w:val="0"/>
+          <w:numId w:val="79"/>
+        </w:numPr>
+        <w:rPr>
+          <w:rFonts w:ascii="Times New Roman" w:hAnsi="Times New Roman" w:cs="Times New Roman"/>
+          <w:sz w:val="24"/>
+          <w:szCs w:val="24"/>
+        </w:rPr>
+      </w:pPr>
+      <w:r>
+        <w:rPr>
+          <w:rFonts w:ascii="Times New Roman" w:hAnsi="Times New Roman" w:cs="Times New Roman"/>
+          <w:sz w:val="24"/>
+          <w:szCs w:val="24"/>
+        </w:rPr>
+        <w:t xml:space="preserve">Интервалы: высота строки настроена через </w:t>
+      </w:r>
+      <w:proofErr w:type="spellStart"/>
+      <w:r>
+        <w:rPr>
+          <w:rFonts w:ascii="Times New Roman" w:hAnsi="Times New Roman" w:cs="Times New Roman"/>
+          <w:sz w:val="24"/>
+          <w:szCs w:val="24"/>
+        </w:rPr>
+        <w:t>line-height</w:t>
+      </w:r>
+      <w:proofErr w:type="spellEnd"/>
+      <w:r>
+        <w:rPr>
+          <w:rFonts w:ascii="Times New Roman" w:hAnsi="Times New Roman" w:cs="Times New Roman"/>
+          <w:sz w:val="24"/>
+          <w:szCs w:val="24"/>
+        </w:rPr>
+        <w:t xml:space="preserve">, расстояние между символами — через </w:t>
+      </w:r>
+      <w:proofErr w:type="spellStart"/>
+      <w:r>
+        <w:rPr>
+          <w:rFonts w:ascii="Times New Roman" w:hAnsi="Times New Roman" w:cs="Times New Roman"/>
+          <w:sz w:val="24"/>
+          <w:szCs w:val="24"/>
+        </w:rPr>
+        <w:t>letter-spacing</w:t>
+      </w:r>
+      <w:proofErr w:type="spellEnd"/>
+      <w:r>
+        <w:rPr>
+          <w:rFonts w:ascii="Times New Roman" w:hAnsi="Times New Roman" w:cs="Times New Roman"/>
+          <w:sz w:val="24"/>
+          <w:szCs w:val="24"/>
+        </w:rPr>
+        <w:t xml:space="preserve">, между словами — через </w:t>
+      </w:r>
+      <w:proofErr w:type="spellStart"/>
+      <w:r>
+        <w:rPr>
+          <w:rFonts w:ascii="Times New Roman" w:hAnsi="Times New Roman" w:cs="Times New Roman"/>
+          <w:sz w:val="24"/>
+          <w:szCs w:val="24"/>
+        </w:rPr>
+        <w:t>word-spacing</w:t>
+      </w:r>
+      <w:proofErr w:type="spellEnd"/>
+      <w:r>
+        <w:rPr>
+          <w:rFonts w:ascii="Times New Roman" w:hAnsi="Times New Roman" w:cs="Times New Roman"/>
+          <w:sz w:val="24"/>
+          <w:szCs w:val="24"/>
+        </w:rPr>
+        <w:t>. Использованы различные значения в пикселях и относительных единицах.</w:t>
+      </w:r>
+    </w:p>
+    <w:p>
+      <w:pPr>
+        <w:numPr>
+          <w:ilvl w:val="0"/>
+          <w:numId w:val="79"/>
+        </w:numPr>
+        <w:rPr>
+          <w:rFonts w:ascii="Times New Roman" w:hAnsi="Times New Roman" w:cs="Times New Roman"/>
+          <w:sz w:val="24"/>
+          <w:szCs w:val="24"/>
+        </w:rPr>
+      </w:pPr>
+      <w:r>
+        <w:rPr>
+          <w:rFonts w:ascii="Times New Roman" w:hAnsi="Times New Roman" w:cs="Times New Roman"/>
+          <w:sz w:val="24"/>
+          <w:szCs w:val="24"/>
+        </w:rPr>
+        <w:t xml:space="preserve">Абзацный отступ: для красной строки применено свойство </w:t>
+      </w:r>
+      <w:proofErr w:type="spellStart"/>
+      <w:r>
+        <w:rPr>
+          <w:rFonts w:ascii="Times New Roman" w:hAnsi="Times New Roman" w:cs="Times New Roman"/>
+          <w:sz w:val="24"/>
+          <w:szCs w:val="24"/>
+        </w:rPr>
+        <w:t>text-indent</w:t>
+      </w:r>
+      <w:proofErr w:type="spellEnd"/>
+      <w:r>
+        <w:rPr>
+          <w:rFonts w:ascii="Times New Roman" w:hAnsi="Times New Roman" w:cs="Times New Roman"/>
+          <w:sz w:val="24"/>
+          <w:szCs w:val="24"/>
+        </w:rPr>
+        <w:t>.</w:t>
+      </w:r>
+    </w:p>
+    <w:p>
+      <w:pPr>
+        <w:numPr>
+          <w:ilvl w:val="0"/>
+          <w:numId w:val="79"/>
+        </w:numPr>
+        <w:rPr>
+          <w:rFonts w:ascii="Times New Roman" w:hAnsi="Times New Roman" w:cs="Times New Roman"/>
+          <w:sz w:val="24"/>
+          <w:szCs w:val="24"/>
+        </w:rPr>
+      </w:pPr>
+      <w:r>
+        <w:rPr>
+          <w:rFonts w:ascii="Times New Roman" w:hAnsi="Times New Roman" w:cs="Times New Roman"/>
+          <w:sz w:val="24"/>
+          <w:szCs w:val="24"/>
+        </w:rPr>
+        <w:t xml:space="preserve">Эффекты: к тексту добавлена тень с помощью свойства </w:t>
+      </w:r>
+      <w:proofErr w:type="spellStart"/>
+      <w:r>
+        <w:rPr>
+          <w:rFonts w:ascii="Times New Roman" w:hAnsi="Times New Roman" w:cs="Times New Roman"/>
+          <w:sz w:val="24"/>
+          <w:szCs w:val="24"/>
+        </w:rPr>
+        <w:t>text-shadow</w:t>
+      </w:r>
+      <w:proofErr w:type="spellEnd"/>
+      <w:r>
+        <w:rPr>
+          <w:rFonts w:ascii="Times New Roman" w:hAnsi="Times New Roman" w:cs="Times New Roman"/>
+          <w:sz w:val="24"/>
+          <w:szCs w:val="24"/>
+        </w:rPr>
+        <w:t xml:space="preserve"> с указанием смещения, размытия и цвета.</w:t>
+      </w:r>
+    </w:p>
+    <w:p>
+      <w:pPr>
+        <w:rPr>
+          <w:rFonts w:ascii="Times New Roman" w:hAnsi="Times New Roman" w:cs="Times New Roman"/>
+          <w:sz w:val="24"/>
+          <w:szCs w:val="24"/>
+        </w:rPr>
+      </w:pPr>
+      <w:r>
+        <w:rPr>
+          <w:rFonts w:ascii="Times New Roman" w:hAnsi="Times New Roman" w:cs="Times New Roman"/>
+          <w:sz w:val="24"/>
+          <w:szCs w:val="24"/>
+        </w:rPr>
+        <w:t xml:space="preserve">Задание 3. Оформление </w:t>
+      </w:r>
+      <w:proofErr w:type="gramStart"/>
+      <w:r>
+        <w:rPr>
+          <w:rFonts w:ascii="Times New Roman" w:hAnsi="Times New Roman" w:cs="Times New Roman"/>
+          <w:sz w:val="24"/>
+          <w:szCs w:val="24"/>
+        </w:rPr>
+        <w:t>списков</w:t>
+      </w:r>
+      <w:proofErr w:type="gramEnd"/>
+      <w:r>
+        <w:rPr>
+          <w:rFonts w:ascii="Times New Roman" w:hAnsi="Times New Roman" w:cs="Times New Roman"/>
+          <w:sz w:val="24"/>
+          <w:szCs w:val="24"/>
+        </w:rPr>
+        <w:t xml:space="preserve"> Для маркированных и нумерованных списков настроены следующие параметры:</w:t>
+      </w:r>
+    </w:p>
+    <w:p>
+      <w:pPr>
+        <w:numPr>
+          <w:ilvl w:val="0"/>
+          <w:numId w:val="80"/>
+        </w:numPr>
+        <w:rPr>
+          <w:rFonts w:ascii="Times New Roman" w:hAnsi="Times New Roman" w:cs="Times New Roman"/>
+          <w:sz w:val="24"/>
+          <w:szCs w:val="24"/>
+        </w:rPr>
+      </w:pPr>
+      <w:r>
+        <w:rPr>
+          <w:rFonts w:ascii="Times New Roman" w:hAnsi="Times New Roman" w:cs="Times New Roman"/>
+          <w:sz w:val="24"/>
+          <w:szCs w:val="24"/>
+        </w:rPr>
+        <w:t xml:space="preserve">Вид маркеров: свойство </w:t>
+      </w:r>
+      <w:proofErr w:type="spellStart"/>
+      <w:r>
+        <w:rPr>
+          <w:rFonts w:ascii="Times New Roman" w:hAnsi="Times New Roman" w:cs="Times New Roman"/>
+          <w:sz w:val="24"/>
+          <w:szCs w:val="24"/>
+        </w:rPr>
+        <w:t>list-style-type</w:t>
+      </w:r>
+      <w:proofErr w:type="spellEnd"/>
+      <w:r>
+        <w:rPr>
+          <w:rFonts w:ascii="Times New Roman" w:hAnsi="Times New Roman" w:cs="Times New Roman"/>
+          <w:sz w:val="24"/>
+          <w:szCs w:val="24"/>
+        </w:rPr>
+        <w:t xml:space="preserve"> со значениями </w:t>
+      </w:r>
+      <w:proofErr w:type="spellStart"/>
+      <w:r>
+        <w:rPr>
+          <w:rFonts w:ascii="Times New Roman" w:hAnsi="Times New Roman" w:cs="Times New Roman"/>
+          <w:sz w:val="24"/>
+          <w:szCs w:val="24"/>
+        </w:rPr>
+        <w:t>disc</w:t>
+      </w:r>
+      <w:proofErr w:type="spellEnd"/>
+      <w:r>
+        <w:rPr>
+          <w:rFonts w:ascii="Times New Roman" w:hAnsi="Times New Roman" w:cs="Times New Roman"/>
+          <w:sz w:val="24"/>
+          <w:szCs w:val="24"/>
+        </w:rPr>
+        <w:t xml:space="preserve">, </w:t>
+      </w:r>
+      <w:proofErr w:type="spellStart"/>
+      <w:r>
+        <w:rPr>
+          <w:rFonts w:ascii="Times New Roman" w:hAnsi="Times New Roman" w:cs="Times New Roman"/>
+          <w:sz w:val="24"/>
+          <w:szCs w:val="24"/>
+        </w:rPr>
+        <w:t>circle</w:t>
+      </w:r>
+      <w:proofErr w:type="spellEnd"/>
+      <w:r>
+        <w:rPr>
+          <w:rFonts w:ascii="Times New Roman" w:hAnsi="Times New Roman" w:cs="Times New Roman"/>
+          <w:sz w:val="24"/>
+          <w:szCs w:val="24"/>
+        </w:rPr>
+        <w:t xml:space="preserve">, </w:t>
+      </w:r>
+      <w:proofErr w:type="spellStart"/>
+      <w:r>
+        <w:rPr>
+          <w:rFonts w:ascii="Times New Roman" w:hAnsi="Times New Roman" w:cs="Times New Roman"/>
+          <w:sz w:val="24"/>
+          <w:szCs w:val="24"/>
+        </w:rPr>
+        <w:t>square</w:t>
+      </w:r>
+      <w:proofErr w:type="spellEnd"/>
+      <w:r>
+        <w:rPr>
+          <w:rFonts w:ascii="Times New Roman" w:hAnsi="Times New Roman" w:cs="Times New Roman"/>
+          <w:sz w:val="24"/>
+          <w:szCs w:val="24"/>
+        </w:rPr>
+        <w:t>.</w:t>
+      </w:r>
+    </w:p>
+    <w:p>
+      <w:pPr>
+        <w:numPr>
+          <w:ilvl w:val="0"/>
+          <w:numId w:val="80"/>
+        </w:numPr>
+        <w:rPr>
+          <w:rFonts w:ascii="Times New Roman" w:hAnsi="Times New Roman" w:cs="Times New Roman"/>
+          <w:sz w:val="24"/>
+          <w:szCs w:val="24"/>
+          <w:lang w:val="en-US"/>
+        </w:rPr>
+      </w:pPr>
+      <w:r>
+        <w:rPr>
+          <w:rFonts w:ascii="Times New Roman" w:hAnsi="Times New Roman" w:cs="Times New Roman"/>
+          <w:sz w:val="24"/>
+          <w:szCs w:val="24"/>
+        </w:rPr>
+        <w:t>Вид</w:t>
+      </w:r>
+      <w:r>
+        <w:rPr>
+          <w:rFonts w:ascii="Times New Roman" w:hAnsi="Times New Roman" w:cs="Times New Roman"/>
+          <w:sz w:val="24"/>
+          <w:szCs w:val="24"/>
+          <w:lang w:val="en-US"/>
+        </w:rPr>
+        <w:t xml:space="preserve"> </w:t>
+      </w:r>
+      <w:r>
+        <w:rPr>
+          <w:rFonts w:ascii="Times New Roman" w:hAnsi="Times New Roman" w:cs="Times New Roman"/>
+          <w:sz w:val="24"/>
+          <w:szCs w:val="24"/>
+        </w:rPr>
+        <w:t>нумерации</w:t>
+      </w:r>
+      <w:r>
+        <w:rPr>
+          <w:rFonts w:ascii="Times New Roman" w:hAnsi="Times New Roman" w:cs="Times New Roman"/>
+          <w:sz w:val="24"/>
+          <w:szCs w:val="24"/>
+          <w:lang w:val="en-US"/>
+        </w:rPr>
+        <w:t xml:space="preserve">: </w:t>
+      </w:r>
+      <w:r>
+        <w:rPr>
+          <w:rFonts w:ascii="Times New Roman" w:hAnsi="Times New Roman" w:cs="Times New Roman"/>
+          <w:sz w:val="24"/>
+          <w:szCs w:val="24"/>
+        </w:rPr>
+        <w:t>свойство</w:t>
+      </w:r>
+      <w:r>
+        <w:rPr>
+          <w:rFonts w:ascii="Times New Roman" w:hAnsi="Times New Roman" w:cs="Times New Roman"/>
+          <w:sz w:val="24"/>
+          <w:szCs w:val="24"/>
+          <w:lang w:val="en-US"/>
+        </w:rPr>
+        <w:t xml:space="preserve"> list-style-type </w:t>
+      </w:r>
+      <w:r>
+        <w:rPr>
+          <w:rFonts w:ascii="Times New Roman" w:hAnsi="Times New Roman" w:cs="Times New Roman"/>
+          <w:sz w:val="24"/>
+          <w:szCs w:val="24"/>
+        </w:rPr>
+        <w:t>со</w:t>
+      </w:r>
+      <w:r>
+        <w:rPr>
+          <w:rFonts w:ascii="Times New Roman" w:hAnsi="Times New Roman" w:cs="Times New Roman"/>
+          <w:sz w:val="24"/>
+          <w:szCs w:val="24"/>
+          <w:lang w:val="en-US"/>
+        </w:rPr>
+        <w:t xml:space="preserve"> </w:t>
+      </w:r>
+      <w:r>
+        <w:rPr>
+          <w:rFonts w:ascii="Times New Roman" w:hAnsi="Times New Roman" w:cs="Times New Roman"/>
+          <w:sz w:val="24"/>
+          <w:szCs w:val="24"/>
+        </w:rPr>
+        <w:t>значениями</w:t>
+      </w:r>
+      <w:r>
+        <w:rPr>
+          <w:rFonts w:ascii="Times New Roman" w:hAnsi="Times New Roman" w:cs="Times New Roman"/>
+          <w:sz w:val="24"/>
+          <w:szCs w:val="24"/>
+          <w:lang w:val="en-US"/>
+        </w:rPr>
+        <w:t xml:space="preserve"> decimal, lower-roman, upper-alpha.</w:t>
+      </w:r>
+    </w:p>
+    <w:p>
+      <w:pPr>
+        <w:numPr>
+          <w:ilvl w:val="0"/>
+          <w:numId w:val="80"/>
+        </w:numPr>
+        <w:rPr>
+          <w:rFonts w:ascii="Times New Roman" w:hAnsi="Times New Roman" w:cs="Times New Roman"/>
+          <w:sz w:val="24"/>
+          <w:szCs w:val="24"/>
+        </w:rPr>
+      </w:pPr>
+      <w:r>
+        <w:rPr>
+          <w:rFonts w:ascii="Times New Roman" w:hAnsi="Times New Roman" w:cs="Times New Roman"/>
+          <w:sz w:val="24"/>
+          <w:szCs w:val="24"/>
+        </w:rPr>
+        <w:t xml:space="preserve">Позиция маркера: свойство </w:t>
+      </w:r>
+      <w:proofErr w:type="spellStart"/>
+      <w:r>
+        <w:rPr>
+          <w:rFonts w:ascii="Times New Roman" w:hAnsi="Times New Roman" w:cs="Times New Roman"/>
+          <w:sz w:val="24"/>
+          <w:szCs w:val="24"/>
+        </w:rPr>
+        <w:t>list-style-position</w:t>
+      </w:r>
+      <w:proofErr w:type="spellEnd"/>
+      <w:r>
+        <w:rPr>
+          <w:rFonts w:ascii="Times New Roman" w:hAnsi="Times New Roman" w:cs="Times New Roman"/>
+          <w:sz w:val="24"/>
+          <w:szCs w:val="24"/>
+        </w:rPr>
+        <w:t xml:space="preserve"> со значениями </w:t>
+      </w:r>
+      <w:proofErr w:type="spellStart"/>
+      <w:r>
+        <w:rPr>
+          <w:rFonts w:ascii="Times New Roman" w:hAnsi="Times New Roman" w:cs="Times New Roman"/>
+          <w:sz w:val="24"/>
+          <w:szCs w:val="24"/>
+        </w:rPr>
+        <w:t>outside</w:t>
+      </w:r>
+      <w:proofErr w:type="spellEnd"/>
+      <w:r>
+        <w:rPr>
+          <w:rFonts w:ascii="Times New Roman" w:hAnsi="Times New Roman" w:cs="Times New Roman"/>
+          <w:sz w:val="24"/>
+          <w:szCs w:val="24"/>
+        </w:rPr>
+        <w:t xml:space="preserve"> (стандартное) и </w:t>
+      </w:r>
+      <w:proofErr w:type="spellStart"/>
+      <w:r>
+        <w:rPr>
+          <w:rFonts w:ascii="Times New Roman" w:hAnsi="Times New Roman" w:cs="Times New Roman"/>
+          <w:sz w:val="24"/>
+          <w:szCs w:val="24"/>
+        </w:rPr>
+        <w:t>inside</w:t>
+      </w:r>
+      <w:proofErr w:type="spellEnd"/>
+      <w:r>
+        <w:rPr>
+          <w:rFonts w:ascii="Times New Roman" w:hAnsi="Times New Roman" w:cs="Times New Roman"/>
+          <w:sz w:val="24"/>
+          <w:szCs w:val="24"/>
+        </w:rPr>
+        <w:t xml:space="preserve"> (маркер как часть текста).</w:t>
+      </w:r>
+    </w:p>
+    <w:p>
+      <w:pPr>
+        <w:rPr>
+          <w:rFonts w:ascii="Times New Roman" w:hAnsi="Times New Roman" w:cs="Times New Roman"/>
+          <w:sz w:val="24"/>
+          <w:szCs w:val="24"/>
+        </w:rPr>
+      </w:pPr>
+      <w:r>
+        <w:rPr>
+          <w:rFonts w:ascii="Times New Roman" w:hAnsi="Times New Roman" w:cs="Times New Roman"/>
+          <w:sz w:val="24"/>
+          <w:szCs w:val="24"/>
+        </w:rPr>
+        <w:t xml:space="preserve">Задание 4. Обрамление </w:t>
+      </w:r>
+      <w:proofErr w:type="gramStart"/>
+      <w:r>
+        <w:rPr>
+          <w:rFonts w:ascii="Times New Roman" w:hAnsi="Times New Roman" w:cs="Times New Roman"/>
+          <w:sz w:val="24"/>
+          <w:szCs w:val="24"/>
+        </w:rPr>
+        <w:t>контейнера</w:t>
+      </w:r>
+      <w:proofErr w:type="gramEnd"/>
+      <w:r>
+        <w:rPr>
+          <w:rFonts w:ascii="Times New Roman" w:hAnsi="Times New Roman" w:cs="Times New Roman"/>
+          <w:sz w:val="24"/>
+          <w:szCs w:val="24"/>
+        </w:rPr>
+        <w:t xml:space="preserve"> Для визуального выделения блоков на второй странице использованы свойства границ:</w:t>
+      </w:r>
+    </w:p>
+    <w:p>
+      <w:pPr>
+        <w:numPr>
+          <w:ilvl w:val="0"/>
+          <w:numId w:val="81"/>
+        </w:numPr>
+        <w:rPr>
+          <w:rFonts w:ascii="Times New Roman" w:hAnsi="Times New Roman" w:cs="Times New Roman"/>
+          <w:sz w:val="24"/>
+          <w:szCs w:val="24"/>
+          <w:lang w:val="en-US"/>
+        </w:rPr>
+      </w:pPr>
+      <w:r>
+        <w:rPr>
+          <w:rFonts w:ascii="Times New Roman" w:hAnsi="Times New Roman" w:cs="Times New Roman"/>
+          <w:sz w:val="24"/>
+          <w:szCs w:val="24"/>
+        </w:rPr>
+        <w:t>Тип</w:t>
+      </w:r>
+      <w:r>
+        <w:rPr>
+          <w:rFonts w:ascii="Times New Roman" w:hAnsi="Times New Roman" w:cs="Times New Roman"/>
+          <w:sz w:val="24"/>
+          <w:szCs w:val="24"/>
+          <w:lang w:val="en-US"/>
+        </w:rPr>
+        <w:t xml:space="preserve"> </w:t>
+      </w:r>
+      <w:r>
+        <w:rPr>
+          <w:rFonts w:ascii="Times New Roman" w:hAnsi="Times New Roman" w:cs="Times New Roman"/>
+          <w:sz w:val="24"/>
+          <w:szCs w:val="24"/>
+        </w:rPr>
+        <w:t>рамки</w:t>
+      </w:r>
+      <w:r>
+        <w:rPr>
+          <w:rFonts w:ascii="Times New Roman" w:hAnsi="Times New Roman" w:cs="Times New Roman"/>
+          <w:sz w:val="24"/>
+          <w:szCs w:val="24"/>
+          <w:lang w:val="en-US"/>
+        </w:rPr>
+        <w:t>: border-style (</w:t>
+      </w:r>
+      <w:r>
+        <w:rPr>
+          <w:rFonts w:ascii="Times New Roman" w:hAnsi="Times New Roman" w:cs="Times New Roman"/>
+          <w:sz w:val="24"/>
+          <w:szCs w:val="24"/>
+        </w:rPr>
+        <w:t>значения</w:t>
+      </w:r>
+      <w:r>
+        <w:rPr>
+          <w:rFonts w:ascii="Times New Roman" w:hAnsi="Times New Roman" w:cs="Times New Roman"/>
+          <w:sz w:val="24"/>
+          <w:szCs w:val="24"/>
+          <w:lang w:val="en-US"/>
+        </w:rPr>
+        <w:t xml:space="preserve"> solid, dashed, dotted, double).</w:t>
+      </w:r>
+    </w:p>
+    <w:p>
+      <w:pPr>
+        <w:numPr>
+          <w:ilvl w:val="0"/>
+          <w:numId w:val="81"/>
+        </w:numPr>
+        <w:rPr>
+          <w:rFonts w:ascii="Times New Roman" w:hAnsi="Times New Roman" w:cs="Times New Roman"/>
+          <w:sz w:val="24"/>
+          <w:szCs w:val="24"/>
+        </w:rPr>
+      </w:pPr>
+      <w:r>
+        <w:rPr>
+          <w:rFonts w:ascii="Times New Roman" w:hAnsi="Times New Roman" w:cs="Times New Roman"/>
+          <w:sz w:val="24"/>
+          <w:szCs w:val="24"/>
+        </w:rPr>
+        <w:t xml:space="preserve">Цвет рамки: </w:t>
+      </w:r>
+      <w:proofErr w:type="spellStart"/>
+      <w:r>
+        <w:rPr>
+          <w:rFonts w:ascii="Times New Roman" w:hAnsi="Times New Roman" w:cs="Times New Roman"/>
+          <w:sz w:val="24"/>
+          <w:szCs w:val="24"/>
+        </w:rPr>
+        <w:t>border-color</w:t>
+      </w:r>
+      <w:proofErr w:type="spellEnd"/>
+      <w:r>
+        <w:rPr>
+          <w:rFonts w:ascii="Times New Roman" w:hAnsi="Times New Roman" w:cs="Times New Roman"/>
+          <w:sz w:val="24"/>
+          <w:szCs w:val="24"/>
+        </w:rPr>
+        <w:t xml:space="preserve"> (задан названиями цветов, HEX-кодами и функцией </w:t>
+      </w:r>
+      <w:proofErr w:type="spellStart"/>
+      <w:proofErr w:type="gramStart"/>
+      <w:r>
+        <w:rPr>
+          <w:rFonts w:ascii="Times New Roman" w:hAnsi="Times New Roman" w:cs="Times New Roman"/>
+          <w:sz w:val="24"/>
+          <w:szCs w:val="24"/>
+        </w:rPr>
+        <w:t>rgb</w:t>
+      </w:r>
+      <w:proofErr w:type="spellEnd"/>
+      <w:r>
+        <w:rPr>
+          <w:rFonts w:ascii="Times New Roman" w:hAnsi="Times New Roman" w:cs="Times New Roman"/>
+          <w:sz w:val="24"/>
+          <w:szCs w:val="24"/>
+        </w:rPr>
+        <w:t>(</w:t>
+      </w:r>
+      <w:proofErr w:type="gramEnd"/>
+      <w:r>
+        <w:rPr>
+          <w:rFonts w:ascii="Times New Roman" w:hAnsi="Times New Roman" w:cs="Times New Roman"/>
+          <w:sz w:val="24"/>
+          <w:szCs w:val="24"/>
+        </w:rPr>
+        <w:t>)).</w:t>
+      </w:r>
+    </w:p>
+    <w:p>
+      <w:pPr>
+        <w:numPr>
+          <w:ilvl w:val="0"/>
+          <w:numId w:val="81"/>
+        </w:numPr>
+        <w:rPr>
+          <w:rFonts w:ascii="Times New Roman" w:hAnsi="Times New Roman" w:cs="Times New Roman"/>
+          <w:sz w:val="24"/>
+          <w:szCs w:val="24"/>
+        </w:rPr>
+      </w:pPr>
+      <w:r>
+        <w:rPr>
+          <w:rFonts w:ascii="Times New Roman" w:hAnsi="Times New Roman" w:cs="Times New Roman"/>
+          <w:sz w:val="24"/>
+          <w:szCs w:val="24"/>
+        </w:rPr>
+        <w:t xml:space="preserve">Толщина рамки: </w:t>
+      </w:r>
+      <w:proofErr w:type="spellStart"/>
+      <w:r>
+        <w:rPr>
+          <w:rFonts w:ascii="Times New Roman" w:hAnsi="Times New Roman" w:cs="Times New Roman"/>
+          <w:sz w:val="24"/>
+          <w:szCs w:val="24"/>
+        </w:rPr>
+        <w:t>border-width</w:t>
+      </w:r>
+      <w:proofErr w:type="spellEnd"/>
+      <w:r>
+        <w:rPr>
+          <w:rFonts w:ascii="Times New Roman" w:hAnsi="Times New Roman" w:cs="Times New Roman"/>
+          <w:sz w:val="24"/>
+          <w:szCs w:val="24"/>
+        </w:rPr>
+        <w:t xml:space="preserve"> (в пикселях и ключевых словах </w:t>
+      </w:r>
+      <w:proofErr w:type="spellStart"/>
+      <w:r>
+        <w:rPr>
+          <w:rFonts w:ascii="Times New Roman" w:hAnsi="Times New Roman" w:cs="Times New Roman"/>
+          <w:sz w:val="24"/>
+          <w:szCs w:val="24"/>
+        </w:rPr>
+        <w:t>thin</w:t>
+      </w:r>
+      <w:proofErr w:type="spellEnd"/>
+      <w:r>
+        <w:rPr>
+          <w:rFonts w:ascii="Times New Roman" w:hAnsi="Times New Roman" w:cs="Times New Roman"/>
+          <w:sz w:val="24"/>
+          <w:szCs w:val="24"/>
+        </w:rPr>
+        <w:t xml:space="preserve">, </w:t>
+      </w:r>
+      <w:proofErr w:type="spellStart"/>
+      <w:r>
+        <w:rPr>
+          <w:rFonts w:ascii="Times New Roman" w:hAnsi="Times New Roman" w:cs="Times New Roman"/>
+          <w:sz w:val="24"/>
+          <w:szCs w:val="24"/>
+        </w:rPr>
+        <w:t>medium</w:t>
+      </w:r>
+      <w:proofErr w:type="spellEnd"/>
+      <w:r>
+        <w:rPr>
+          <w:rFonts w:ascii="Times New Roman" w:hAnsi="Times New Roman" w:cs="Times New Roman"/>
+          <w:sz w:val="24"/>
+          <w:szCs w:val="24"/>
+        </w:rPr>
+        <w:t xml:space="preserve">, </w:t>
+      </w:r>
+      <w:proofErr w:type="spellStart"/>
+      <w:r>
+        <w:rPr>
+          <w:rFonts w:ascii="Times New Roman" w:hAnsi="Times New Roman" w:cs="Times New Roman"/>
+          <w:sz w:val="24"/>
+          <w:szCs w:val="24"/>
+        </w:rPr>
+        <w:t>thick</w:t>
+      </w:r>
+      <w:proofErr w:type="spellEnd"/>
+      <w:r>
+        <w:rPr>
+          <w:rFonts w:ascii="Times New Roman" w:hAnsi="Times New Roman" w:cs="Times New Roman"/>
+          <w:sz w:val="24"/>
+          <w:szCs w:val="24"/>
+        </w:rPr>
+        <w:t>).</w:t>
+      </w:r>
+    </w:p>
+    <w:p>
+      <w:pPr>
+        <w:numPr>
+          <w:ilvl w:val="0"/>
+          <w:numId w:val="81"/>
+        </w:numPr>
+        <w:rPr>
+          <w:rFonts w:ascii="Times New Roman" w:hAnsi="Times New Roman" w:cs="Times New Roman"/>
+          <w:sz w:val="24"/>
+          <w:szCs w:val="24"/>
+        </w:rPr>
+      </w:pPr>
+      <w:r>
+        <w:rPr>
+          <w:rFonts w:ascii="Times New Roman" w:hAnsi="Times New Roman" w:cs="Times New Roman"/>
+          <w:sz w:val="24"/>
+          <w:szCs w:val="24"/>
+        </w:rPr>
+        <w:t xml:space="preserve">Скругление углов: </w:t>
+      </w:r>
+      <w:proofErr w:type="spellStart"/>
+      <w:r>
+        <w:rPr>
+          <w:rFonts w:ascii="Times New Roman" w:hAnsi="Times New Roman" w:cs="Times New Roman"/>
+          <w:sz w:val="24"/>
+          <w:szCs w:val="24"/>
+        </w:rPr>
+        <w:t>border-radius</w:t>
+      </w:r>
+      <w:proofErr w:type="spellEnd"/>
+      <w:r>
+        <w:rPr>
+          <w:rFonts w:ascii="Times New Roman" w:hAnsi="Times New Roman" w:cs="Times New Roman"/>
+          <w:sz w:val="24"/>
+          <w:szCs w:val="24"/>
+        </w:rPr>
+        <w:t xml:space="preserve"> (различные значения в пикселях и процентах для создания круглых элементов).</w:t>
+      </w:r>
+    </w:p>
+    <w:p>
+      <w:pPr>
+        <w:rPr>
+          <w:rFonts w:ascii="Times New Roman" w:hAnsi="Times New Roman" w:cs="Times New Roman"/>
+          <w:sz w:val="24"/>
+          <w:szCs w:val="24"/>
+        </w:rPr>
+      </w:pPr>
+      <w:r>
+        <w:rPr>
+          <w:rFonts w:ascii="Times New Roman" w:hAnsi="Times New Roman" w:cs="Times New Roman"/>
+          <w:sz w:val="24"/>
+          <w:szCs w:val="24"/>
+        </w:rPr>
+        <w:t xml:space="preserve">Задание 5. Фон </w:t>
+      </w:r>
+      <w:proofErr w:type="gramStart"/>
+      <w:r>
+        <w:rPr>
+          <w:rFonts w:ascii="Times New Roman" w:hAnsi="Times New Roman" w:cs="Times New Roman"/>
+          <w:sz w:val="24"/>
+          <w:szCs w:val="24"/>
+        </w:rPr>
+        <w:t>веб-страниц</w:t>
+      </w:r>
+      <w:proofErr w:type="gramEnd"/>
+      <w:r>
+        <w:rPr>
+          <w:rFonts w:ascii="Times New Roman" w:hAnsi="Times New Roman" w:cs="Times New Roman"/>
+          <w:sz w:val="24"/>
+          <w:szCs w:val="24"/>
+        </w:rPr>
+        <w:t xml:space="preserve"> Для разных страниц сайта задан различный цвет фона через свойство </w:t>
+      </w:r>
+      <w:proofErr w:type="spellStart"/>
+      <w:r>
+        <w:rPr>
+          <w:rFonts w:ascii="Times New Roman" w:hAnsi="Times New Roman" w:cs="Times New Roman"/>
+          <w:sz w:val="24"/>
+          <w:szCs w:val="24"/>
+        </w:rPr>
+        <w:t>background-color</w:t>
+      </w:r>
+      <w:proofErr w:type="spellEnd"/>
+      <w:r>
+        <w:rPr>
+          <w:rFonts w:ascii="Times New Roman" w:hAnsi="Times New Roman" w:cs="Times New Roman"/>
+          <w:sz w:val="24"/>
+          <w:szCs w:val="24"/>
+        </w:rPr>
+        <w:t xml:space="preserve"> для тега </w:t>
+      </w:r>
+      <w:proofErr w:type="spellStart"/>
+      <w:r>
+        <w:rPr>
+          <w:rFonts w:ascii="Times New Roman" w:hAnsi="Times New Roman" w:cs="Times New Roman"/>
+          <w:sz w:val="24"/>
+          <w:szCs w:val="24"/>
+        </w:rPr>
+        <w:t>body</w:t>
+      </w:r>
+      <w:proofErr w:type="spellEnd"/>
+      <w:r>
+        <w:rPr>
+          <w:rFonts w:ascii="Times New Roman" w:hAnsi="Times New Roman" w:cs="Times New Roman"/>
+          <w:sz w:val="24"/>
+          <w:szCs w:val="24"/>
+        </w:rPr>
+        <w:t>. Это позволяет визуально разграничить страницы сайта.</w:t>
+      </w:r>
+    </w:p>
+    <w:p>
+      <w:pPr>
+        <w:rPr>
+          <w:rFonts w:ascii="Times New Roman" w:hAnsi="Times New Roman" w:cs="Times New Roman"/>
+          <w:sz w:val="24"/>
+          <w:szCs w:val="24"/>
+        </w:rPr>
+      </w:pPr>
+      <w:r>
+        <w:rPr>
+          <w:rFonts w:ascii="Times New Roman" w:hAnsi="Times New Roman" w:cs="Times New Roman"/>
+          <w:sz w:val="24"/>
+          <w:szCs w:val="24"/>
+        </w:rPr>
+        <w:t xml:space="preserve">Задание 6. </w:t>
+      </w:r>
+      <w:proofErr w:type="spellStart"/>
+      <w:r>
+        <w:rPr>
+          <w:rFonts w:ascii="Times New Roman" w:hAnsi="Times New Roman" w:cs="Times New Roman"/>
+          <w:sz w:val="24"/>
+          <w:szCs w:val="24"/>
+        </w:rPr>
+        <w:t>Псевдоклассы</w:t>
+      </w:r>
+      <w:proofErr w:type="spellEnd"/>
+      <w:r>
+        <w:rPr>
+          <w:rFonts w:ascii="Times New Roman" w:hAnsi="Times New Roman" w:cs="Times New Roman"/>
+          <w:sz w:val="24"/>
+          <w:szCs w:val="24"/>
+        </w:rPr>
+        <w:t xml:space="preserve"> и </w:t>
+      </w:r>
+      <w:proofErr w:type="gramStart"/>
+      <w:r>
+        <w:rPr>
+          <w:rFonts w:ascii="Times New Roman" w:hAnsi="Times New Roman" w:cs="Times New Roman"/>
+          <w:sz w:val="24"/>
+          <w:szCs w:val="24"/>
+        </w:rPr>
+        <w:t>интерактивность</w:t>
+      </w:r>
+      <w:proofErr w:type="gramEnd"/>
+      <w:r>
+        <w:rPr>
+          <w:rFonts w:ascii="Times New Roman" w:hAnsi="Times New Roman" w:cs="Times New Roman"/>
+          <w:sz w:val="24"/>
+          <w:szCs w:val="24"/>
+        </w:rPr>
+        <w:t xml:space="preserve"> Для добавления интерактивности использованы CSS-</w:t>
+      </w:r>
+      <w:proofErr w:type="spellStart"/>
+      <w:r>
+        <w:rPr>
+          <w:rFonts w:ascii="Times New Roman" w:hAnsi="Times New Roman" w:cs="Times New Roman"/>
+          <w:sz w:val="24"/>
+          <w:szCs w:val="24"/>
+        </w:rPr>
+        <w:t>псевдоклассы</w:t>
+      </w:r>
+      <w:proofErr w:type="spellEnd"/>
+      <w:r>
+        <w:rPr>
+          <w:rFonts w:ascii="Times New Roman" w:hAnsi="Times New Roman" w:cs="Times New Roman"/>
+          <w:sz w:val="24"/>
+          <w:szCs w:val="24"/>
+        </w:rPr>
+        <w:t>:</w:t>
+      </w:r>
+    </w:p>
+    <w:p>
+      <w:pPr>
+        <w:numPr>
+          <w:ilvl w:val="0"/>
+          <w:numId w:val="82"/>
+        </w:numPr>
+        <w:rPr>
+          <w:rFonts w:ascii="Times New Roman" w:hAnsi="Times New Roman" w:cs="Times New Roman"/>
+          <w:sz w:val="24"/>
+          <w:szCs w:val="24"/>
+        </w:rPr>
+      </w:pPr>
+      <w:r>
+        <w:rPr>
+          <w:rFonts w:ascii="Times New Roman" w:hAnsi="Times New Roman" w:cs="Times New Roman"/>
+          <w:sz w:val="24"/>
+          <w:szCs w:val="24"/>
+        </w:rPr>
+        <w:t>Гиперссылки: настроено изменение цвета ссылок в различных состояниях:</w:t>
+      </w:r>
+    </w:p>
+    <w:p>
+      <w:pPr>
+        <w:numPr>
+          <w:ilvl w:val="1"/>
+          <w:numId w:val="82"/>
+        </w:numPr>
+        <w:rPr>
+          <w:rFonts w:ascii="Times New Roman" w:hAnsi="Times New Roman" w:cs="Times New Roman"/>
+          <w:sz w:val="24"/>
+          <w:szCs w:val="24"/>
+        </w:rPr>
+      </w:pPr>
+      <w:proofErr w:type="gramStart"/>
+      <w:r>
+        <w:rPr>
+          <w:rFonts w:ascii="Times New Roman" w:hAnsi="Times New Roman" w:cs="Times New Roman"/>
+          <w:sz w:val="24"/>
+          <w:szCs w:val="24"/>
+        </w:rPr>
+        <w:t>a:link</w:t>
+      </w:r>
+      <w:proofErr w:type="gramEnd"/>
+      <w:r>
+        <w:rPr>
+          <w:rFonts w:ascii="Times New Roman" w:hAnsi="Times New Roman" w:cs="Times New Roman"/>
+          <w:sz w:val="24"/>
+          <w:szCs w:val="24"/>
+        </w:rPr>
+        <w:t xml:space="preserve"> — обычная ссылка;</w:t>
+      </w:r>
+    </w:p>
+    <w:p>
+      <w:pPr>
+        <w:numPr>
+          <w:ilvl w:val="1"/>
+          <w:numId w:val="82"/>
+        </w:numPr>
+        <w:rPr>
+          <w:rFonts w:ascii="Times New Roman" w:hAnsi="Times New Roman" w:cs="Times New Roman"/>
+          <w:sz w:val="24"/>
+          <w:szCs w:val="24"/>
+        </w:rPr>
+      </w:pPr>
+      <w:proofErr w:type="gramStart"/>
+      <w:r>
+        <w:rPr>
+          <w:rFonts w:ascii="Times New Roman" w:hAnsi="Times New Roman" w:cs="Times New Roman"/>
+          <w:sz w:val="24"/>
+          <w:szCs w:val="24"/>
+        </w:rPr>
+        <w:t>a:visited</w:t>
+      </w:r>
+      <w:proofErr w:type="gramEnd"/>
+      <w:r>
+        <w:rPr>
+          <w:rFonts w:ascii="Times New Roman" w:hAnsi="Times New Roman" w:cs="Times New Roman"/>
+          <w:sz w:val="24"/>
+          <w:szCs w:val="24"/>
+        </w:rPr>
+        <w:t xml:space="preserve"> — посещенная ссылка;</w:t>
+      </w:r>
+    </w:p>
+    <w:p>
+      <w:pPr>
+        <w:numPr>
+          <w:ilvl w:val="1"/>
+          <w:numId w:val="82"/>
+        </w:numPr>
+        <w:rPr>
+          <w:rFonts w:ascii="Times New Roman" w:hAnsi="Times New Roman" w:cs="Times New Roman"/>
+          <w:sz w:val="24"/>
+          <w:szCs w:val="24"/>
+        </w:rPr>
+      </w:pPr>
+      <w:proofErr w:type="gramStart"/>
+      <w:r>
+        <w:rPr>
+          <w:rFonts w:ascii="Times New Roman" w:hAnsi="Times New Roman" w:cs="Times New Roman"/>
+          <w:sz w:val="24"/>
+          <w:szCs w:val="24"/>
+        </w:rPr>
+        <w:t>a:hover</w:t>
+      </w:r>
+      <w:proofErr w:type="gramEnd"/>
+      <w:r>
+        <w:rPr>
+          <w:rFonts w:ascii="Times New Roman" w:hAnsi="Times New Roman" w:cs="Times New Roman"/>
+          <w:sz w:val="24"/>
+          <w:szCs w:val="24"/>
+        </w:rPr>
+        <w:t xml:space="preserve"> — при наведении курсора;</w:t>
+      </w:r>
+    </w:p>
+    <w:p>
+      <w:pPr>
+        <w:numPr>
+          <w:ilvl w:val="1"/>
+          <w:numId w:val="82"/>
+        </w:numPr>
+        <w:rPr>
+          <w:rFonts w:ascii="Times New Roman" w:hAnsi="Times New Roman" w:cs="Times New Roman"/>
+          <w:sz w:val="24"/>
+          <w:szCs w:val="24"/>
+        </w:rPr>
+      </w:pPr>
+      <w:proofErr w:type="gramStart"/>
+      <w:r>
+        <w:rPr>
+          <w:rFonts w:ascii="Times New Roman" w:hAnsi="Times New Roman" w:cs="Times New Roman"/>
+          <w:sz w:val="24"/>
+          <w:szCs w:val="24"/>
+        </w:rPr>
+        <w:t>a:active</w:t>
+      </w:r>
+      <w:proofErr w:type="gramEnd"/>
+      <w:r>
+        <w:rPr>
+          <w:rFonts w:ascii="Times New Roman" w:hAnsi="Times New Roman" w:cs="Times New Roman"/>
+          <w:sz w:val="24"/>
+          <w:szCs w:val="24"/>
+        </w:rPr>
+        <w:t xml:space="preserve"> — в момент нажатия.</w:t>
+      </w:r>
+    </w:p>
+    <w:p>
+      <w:pPr>
+        <w:numPr>
+          <w:ilvl w:val="0"/>
+          <w:numId w:val="82"/>
+        </w:numPr>
+        <w:rPr>
+          <w:rFonts w:ascii="Times New Roman" w:hAnsi="Times New Roman" w:cs="Times New Roman"/>
+          <w:sz w:val="24"/>
+          <w:szCs w:val="24"/>
+        </w:rPr>
+      </w:pPr>
+      <w:r>
+        <w:rPr>
+          <w:rFonts w:ascii="Times New Roman" w:hAnsi="Times New Roman" w:cs="Times New Roman"/>
+          <w:sz w:val="24"/>
+          <w:szCs w:val="24"/>
+        </w:rPr>
+        <w:lastRenderedPageBreak/>
+        <w:t>Изображения: к тегу &lt;</w:t>
+      </w:r>
+      <w:proofErr w:type="spellStart"/>
+      <w:r>
+        <w:rPr>
+          <w:rFonts w:ascii="Times New Roman" w:hAnsi="Times New Roman" w:cs="Times New Roman"/>
+          <w:sz w:val="24"/>
+          <w:szCs w:val="24"/>
+        </w:rPr>
+        <w:t>img</w:t>
+      </w:r>
+      <w:proofErr w:type="spellEnd"/>
+      <w:r>
+        <w:rPr>
+          <w:rFonts w:ascii="Times New Roman" w:hAnsi="Times New Roman" w:cs="Times New Roman"/>
+          <w:sz w:val="24"/>
+          <w:szCs w:val="24"/>
+        </w:rPr>
+        <w:t xml:space="preserve">&gt; применён </w:t>
+      </w:r>
+      <w:proofErr w:type="spellStart"/>
+      <w:proofErr w:type="gramStart"/>
+      <w:r>
+        <w:rPr>
+          <w:rFonts w:ascii="Times New Roman" w:hAnsi="Times New Roman" w:cs="Times New Roman"/>
+          <w:sz w:val="24"/>
+          <w:szCs w:val="24"/>
+        </w:rPr>
+        <w:t>псевдокласс</w:t>
+      </w:r>
+      <w:proofErr w:type="spellEnd"/>
+      <w:r>
+        <w:rPr>
+          <w:rFonts w:ascii="Times New Roman" w:hAnsi="Times New Roman" w:cs="Times New Roman"/>
+          <w:sz w:val="24"/>
+          <w:szCs w:val="24"/>
+        </w:rPr>
+        <w:t xml:space="preserve"> :</w:t>
+      </w:r>
+      <w:proofErr w:type="spellStart"/>
+      <w:r>
+        <w:rPr>
+          <w:rFonts w:ascii="Times New Roman" w:hAnsi="Times New Roman" w:cs="Times New Roman"/>
+          <w:sz w:val="24"/>
+          <w:szCs w:val="24"/>
+        </w:rPr>
+        <w:t>hover</w:t>
+      </w:r>
+      <w:proofErr w:type="spellEnd"/>
+      <w:proofErr w:type="gramEnd"/>
+      <w:r>
+        <w:rPr>
+          <w:rFonts w:ascii="Times New Roman" w:hAnsi="Times New Roman" w:cs="Times New Roman"/>
+          <w:sz w:val="24"/>
+          <w:szCs w:val="24"/>
+        </w:rPr>
+        <w:t xml:space="preserve"> со свойством </w:t>
+      </w:r>
+      <w:proofErr w:type="spellStart"/>
+      <w:r>
+        <w:rPr>
+          <w:rFonts w:ascii="Times New Roman" w:hAnsi="Times New Roman" w:cs="Times New Roman"/>
+          <w:sz w:val="24"/>
+          <w:szCs w:val="24"/>
+        </w:rPr>
+        <w:t>opacity</w:t>
+      </w:r>
+      <w:proofErr w:type="spellEnd"/>
+      <w:r>
+        <w:rPr>
+          <w:rFonts w:ascii="Times New Roman" w:hAnsi="Times New Roman" w:cs="Times New Roman"/>
+          <w:sz w:val="24"/>
+          <w:szCs w:val="24"/>
+        </w:rPr>
+        <w:t xml:space="preserve"> для изменения прозрачности картинки при наведении курсора. Для плавности перехода добавлено свойство </w:t>
+      </w:r>
+      <w:proofErr w:type="spellStart"/>
+      <w:r>
+        <w:rPr>
+          <w:rFonts w:ascii="Times New Roman" w:hAnsi="Times New Roman" w:cs="Times New Roman"/>
+          <w:sz w:val="24"/>
+          <w:szCs w:val="24"/>
+        </w:rPr>
+        <w:t>transition.</w:t>
+      </w:r>
+      <w:proofErr w:type="spellEnd"/>
+    </w:p>
+    <w:p>
+      <w:pPr>
+        <w:ind w:firstLine="0"/>
+        <w:jc w:val="center"/>
+        <w:rPr>
+          <w:rFonts w:ascii="Times New Roman" w:hAnsi="Times New Roman" w:cs="Times New Roman"/>
+          <w:sz w:val="24"/>
+          <w:szCs w:val="24"/>
+        </w:rPr>
+      </w:pPr>
+      <w:r>
+        <w:rPr>
+          <w:noProof/>
+          <w14:ligatures w14:val="standardContextual"/>
+        </w:rPr>
+        <w:drawing>
+          <wp:inline distT="0" distB="0" distL="0" distR="0" wp14:anchorId="53CF9F22" wp14:editId="43EDD0F0">
+            <wp:extent cx="5940425" cy="3712845"/>
+            <wp:effectExtent l="0" t="0" r="3175" b="1905"/>
+            <wp:docPr id="1346598519" name="Рисунок 1"/>
+            <wp:cNvGraphicFramePr>
+              <a:graphicFrameLocks xmlns:a="http://schemas.openxmlformats.org/drawingml/2006/main" noChangeAspect="1"/>
+            </wp:cNvGraphicFramePr>
+            <a:graphic xmlns:a="http://schemas.openxmlformats.org/drawingml/2006/main">
+              <a:graphicData uri="http://schemas.openxmlformats.org/drawingml/2006/picture">
+                <pic:pic xmlns:pic="http://schemas.openxmlformats.org/drawingml/2006/picture">
+                  <pic:nvPicPr>
+                    <pic:cNvPr id="1346598519" name=""/>
+                    <pic:cNvPicPr/>
+                  </pic:nvPicPr>
+                  <pic:blipFill>
+                    <a:blip r:embed="rId10"/>
+                    <a:stretch>
+                      <a:fillRect/>
+                    </a:stretch>
+                  </pic:blipFill>
+                  <pic:spPr>
+                    <a:xfrm>
+                      <a:off x="0" y="0"/>
+                      <a:ext cx="5940425" cy="3712845"/>
+                    </a:xfrm>
+                    <a:prstGeom prst="rect">
+                      <a:avLst/>
+                    </a:prstGeom>
+                  </pic:spPr>
+                </pic:pic>
+              </a:graphicData>
+            </a:graphic>
+          </wp:inline>
+        </w:drawing>
+      </w:r>
+    </w:p>
+    <w:p>
+      <w:pPr>
+        <w:ind w:firstLine="0"/>
+        <w:jc w:val="center"/>
+        <w:rPr>
+          <w:rFonts w:ascii="Times New Roman" w:hAnsi="Times New Roman" w:cs="Times New Roman"/>
+          <w:sz w:val="24"/>
+          <w:szCs w:val="24"/>
+        </w:rPr>
+      </w:pPr>
+      <w:r>
+        <w:rPr>
+          <w:rFonts w:ascii="Times New Roman" w:hAnsi="Times New Roman" w:cs="Times New Roman"/>
+          <w:sz w:val="24"/>
+          <w:szCs w:val="24"/>
+        </w:rPr>
+        <w:t>Рисунок 2.1 – 2 страница</w:t>
+      </w:r>
+      <w:r>
+        <w:rPr>
+          <w:rFonts w:ascii="Times New Roman" w:hAnsi="Times New Roman" w:cs="Times New Roman"/>
+          <w:sz w:val="24"/>
+          <w:szCs w:val="24"/>
+        </w:rPr>
+        <w:t>, часть 1</w:t>
+      </w:r>
+    </w:p>
+    <w:p>
+      <w:pPr>
+        <w:ind w:firstLine="0"/>
+        <w:jc w:val="center"/>
+        <w:rPr>
+          <w:rFonts w:ascii="Times New Roman" w:hAnsi="Times New Roman" w:cs="Times New Roman"/>
+          <w:sz w:val="24"/>
+          <w:szCs w:val="24"/>
+        </w:rPr>
+      </w:pPr>
+      <w:r>
+        <w:rPr>
+          <w:noProof/>
+          <w14:ligatures w14:val="standardContextual"/>
+        </w:rPr>
+        <w:drawing>
+          <wp:inline distT="0" distB="0" distL="0" distR="0" wp14:anchorId="12893E85" wp14:editId="36AC0CAB">
+            <wp:extent cx="5940425" cy="3338830"/>
+            <wp:effectExtent l="0" t="0" r="3175" b="0"/>
+            <wp:docPr id="387403674" name="Рисунок 1"/>
+            <wp:cNvGraphicFramePr>
+              <a:graphicFrameLocks xmlns:a="http://schemas.openxmlformats.org/drawingml/2006/main" noChangeAspect="1"/>
+            </wp:cNvGraphicFramePr>
+            <a:graphic xmlns:a="http://schemas.openxmlformats.org/drawingml/2006/main">
+              <a:graphicData uri="http://schemas.openxmlformats.org/drawingml/2006/picture">
+                <pic:pic xmlns:pic="http://schemas.openxmlformats.org/drawingml/2006/picture">
+                  <pic:nvPicPr>
+                    <pic:cNvPr id="387403674" name=""/>
+                    <pic:cNvPicPr/>
+                  </pic:nvPicPr>
+                  <pic:blipFill>
+                    <a:blip r:embed="rId11"/>
+                    <a:stretch>
+                      <a:fillRect/>
+                    </a:stretch>
+                  </pic:blipFill>
+                  <pic:spPr>
+                    <a:xfrm>
+                      <a:off x="0" y="0"/>
+                      <a:ext cx="5940425" cy="3338830"/>
+                    </a:xfrm>
+                    <a:prstGeom prst="rect">
+                      <a:avLst/>
+                    </a:prstGeom>
+                  </pic:spPr>
+                </pic:pic>
+              </a:graphicData>
+            </a:graphic>
+          </wp:inline>
+        </w:drawing>
+      </w:r>
+    </w:p>
+    <w:p>
+      <w:pPr>
+        <w:ind w:firstLine="0"/>
+        <w:jc w:val="center"/>
+        <w:rPr>
+          <w:rFonts w:ascii="Times New Roman" w:hAnsi="Times New Roman" w:cs="Times New Roman"/>
+          <w:sz w:val="24"/>
+          <w:szCs w:val="24"/>
+        </w:rPr>
+      </w:pPr>
+      <w:r>
+        <w:rPr>
+          <w:rFonts w:ascii="Times New Roman" w:hAnsi="Times New Roman" w:cs="Times New Roman"/>
+          <w:sz w:val="24"/>
+          <w:szCs w:val="24"/>
+        </w:rPr>
+        <w:t>Рисунок 2</w:t>
+      </w:r>
+      <w:r>
+        <w:rPr>
+          <w:rFonts w:ascii="Times New Roman" w:hAnsi="Times New Roman" w:cs="Times New Roman"/>
+          <w:sz w:val="24"/>
+          <w:szCs w:val="24"/>
+        </w:rPr>
+        <w:t>.2</w:t>
+      </w:r>
+      <w:r>
+        <w:rPr>
+          <w:rFonts w:ascii="Times New Roman" w:hAnsi="Times New Roman" w:cs="Times New Roman"/>
+          <w:sz w:val="24"/>
+          <w:szCs w:val="24"/>
+        </w:rPr>
+        <w:t xml:space="preserve"> – 2 страница</w:t>
+      </w:r>
+      <w:r>
+        <w:rPr>
+          <w:rFonts w:ascii="Times New Roman" w:hAnsi="Times New Roman" w:cs="Times New Roman"/>
+          <w:sz w:val="24"/>
+          <w:szCs w:val="24"/>
+        </w:rPr>
+        <w:t>, часть 2</w:t>
+      </w:r>
+    </w:p>
+    <w:p>
+      <w:pPr>
+        <w:ind w:firstLine="0"/>
+        <w:rPr>
+          <w:rFonts w:ascii="Times New Roman" w:hAnsi="Times New Roman" w:cs="Times New Roman"/>
+          <w:sz w:val="24"/>
+          <w:szCs w:val="24"/>
+        </w:rPr>
+      </w:pPr>
     </w:p>
     <w:p>
       <w:pPr>
@@ -2470,6 +5337,14 @@
           <w:szCs w:val="24"/>
         </w:rPr>
       </w:pPr>
+      <w:r>
+        <w:rPr>
+          <w:rFonts w:ascii="Times New Roman" w:eastAsiaTheme="majorEastAsia" w:hAnsi="Times New Roman" w:cs="Times New Roman"/>
+          <w:sz w:val="24"/>
+          <w:szCs w:val="24"/>
+        </w:rPr>
+        <w:t xml:space="preserve">В ходе выполнения лабораторной работы были изучены и применены на практике основные свойства CSS для форматирования текста, оформления списков, создания рамок и управления фоном страницы. Также освоено использование </w:t>
+      </w:r>
       <w:proofErr w:type="spellStart"/>
       <w:r>
         <w:rPr>
@@ -2477,13 +5352,21 @@
           <w:sz w:val="24"/>
           <w:szCs w:val="24"/>
         </w:rPr>
-        <w:t>ывпва</w:t>
+        <w:t>псевдоклассов</w:t>
       </w:r>
       <w:proofErr w:type="spellEnd"/>
+      <w:r>
+        <w:rPr>
+          <w:rFonts w:ascii="Times New Roman" w:eastAsiaTheme="majorEastAsia" w:hAnsi="Times New Roman" w:cs="Times New Roman"/>
+          <w:sz w:val="24"/>
+          <w:szCs w:val="24"/>
+        </w:rPr>
+        <w:t xml:space="preserve"> для создания интерактивных элементов интерфейса. Все стили были применены с использованием различных значений параметров, что продемонстрировало гибкость настройки веб-страниц.</w:t>
+      </w:r>
     </w:p>
     <w:sectPr>
-      <w:footerReference w:type="default" r:id="rId9"/>
-      <w:footerReference w:type="first" r:id="rId10"/>
+      <w:footerReference w:type="default" r:id="rId12"/>
+      <w:footerReference w:type="first" r:id="rId13"/>
       <w:pgSz w:w="11906" w:h="16838"/>
       <w:pgMar w:top="1134" w:right="850" w:bottom="1134" w:left="1701" w:header="708" w:footer="708" w:gutter="0"/>
       <w:pgNumType w:start="3"/>
@@ -3895,6 +6778,155 @@
     </w:lvl>
   </w:abstractNum>
   <w:abstractNum w:abstractNumId="9" w15:restartNumberingAfterBreak="0">
+    <w:nsid w:val="0E8A7E89"/>
+    <w:multiLevelType w:val="multilevel"/>
+    <w:tmpl w:val="47DA01DA"/>
+    <w:lvl w:ilvl="0">
+      <w:start w:val="1"/>
+      <w:numFmt w:val="bullet"/>
+      <w:lvlText w:val=""/>
+      <w:lvlJc w:val="left"/>
+      <w:pPr>
+        <w:tabs>
+          <w:tab w:val="num" w:pos="720"/>
+        </w:tabs>
+        <w:ind w:left="720" w:hanging="360"/>
+      </w:pPr>
+      <w:rPr>
+        <w:rFonts w:ascii="Symbol" w:hAnsi="Symbol" w:hint="default"/>
+        <w:sz w:val="20"/>
+      </w:rPr>
+    </w:lvl>
+    <w:lvl w:ilvl="1">
+      <w:start w:val="1"/>
+      <w:numFmt w:val="bullet"/>
+      <w:lvlText w:val="o"/>
+      <w:lvlJc w:val="left"/>
+      <w:pPr>
+        <w:tabs>
+          <w:tab w:val="num" w:pos="1440"/>
+        </w:tabs>
+        <w:ind w:left="1440" w:hanging="360"/>
+      </w:pPr>
+      <w:rPr>
+        <w:rFonts w:ascii="Courier New" w:hAnsi="Courier New" w:hint="default"/>
+        <w:sz w:val="20"/>
+      </w:rPr>
+    </w:lvl>
+    <w:lvl w:ilvl="2" w:tentative="1">
+      <w:start w:val="1"/>
+      <w:numFmt w:val="bullet"/>
+      <w:lvlText w:val=""/>
+      <w:lvlJc w:val="left"/>
+      <w:pPr>
+        <w:tabs>
+          <w:tab w:val="num" w:pos="2160"/>
+        </w:tabs>
+        <w:ind w:left="2160" w:hanging="360"/>
+      </w:pPr>
+      <w:rPr>
+        <w:rFonts w:ascii="Wingdings" w:hAnsi="Wingdings" w:hint="default"/>
+        <w:sz w:val="20"/>
+      </w:rPr>
+    </w:lvl>
+    <w:lvl w:ilvl="3" w:tentative="1">
+      <w:start w:val="1"/>
+      <w:numFmt w:val="bullet"/>
+      <w:lvlText w:val=""/>
+      <w:lvlJc w:val="left"/>
+      <w:pPr>
+        <w:tabs>
+          <w:tab w:val="num" w:pos="2880"/>
+        </w:tabs>
+        <w:ind w:left="2880" w:hanging="360"/>
+      </w:pPr>
+      <w:rPr>
+        <w:rFonts w:ascii="Wingdings" w:hAnsi="Wingdings" w:hint="default"/>
+        <w:sz w:val="20"/>
+      </w:rPr>
+    </w:lvl>
+    <w:lvl w:ilvl="4" w:tentative="1">
+      <w:start w:val="1"/>
+      <w:numFmt w:val="bullet"/>
+      <w:lvlText w:val=""/>
+      <w:lvlJc w:val="left"/>
+      <w:pPr>
+        <w:tabs>
+          <w:tab w:val="num" w:pos="3600"/>
+        </w:tabs>
+        <w:ind w:left="3600" w:hanging="360"/>
+      </w:pPr>
+      <w:rPr>
+        <w:rFonts w:ascii="Wingdings" w:hAnsi="Wingdings" w:hint="default"/>
+        <w:sz w:val="20"/>
+      </w:rPr>
+    </w:lvl>
+    <w:lvl w:ilvl="5" w:tentative="1">
+      <w:start w:val="1"/>
+      <w:numFmt w:val="bullet"/>
+      <w:lvlText w:val=""/>
+      <w:lvlJc w:val="left"/>
+      <w:pPr>
+        <w:tabs>
+          <w:tab w:val="num" w:pos="4320"/>
+        </w:tabs>
+        <w:ind w:left="4320" w:hanging="360"/>
+      </w:pPr>
+      <w:rPr>
+        <w:rFonts w:ascii="Wingdings" w:hAnsi="Wingdings" w:hint="default"/>
+        <w:sz w:val="20"/>
+      </w:rPr>
+    </w:lvl>
+    <w:lvl w:ilvl="6" w:tentative="1">
+      <w:start w:val="1"/>
+      <w:numFmt w:val="bullet"/>
+      <w:lvlText w:val=""/>
+      <w:lvlJc w:val="left"/>
+      <w:pPr>
+        <w:tabs>
+          <w:tab w:val="num" w:pos="5040"/>
+        </w:tabs>
+        <w:ind w:left="5040" w:hanging="360"/>
+      </w:pPr>
+      <w:rPr>
+        <w:rFonts w:ascii="Wingdings" w:hAnsi="Wingdings" w:hint="default"/>
+        <w:sz w:val="20"/>
+      </w:rPr>
+    </w:lvl>
+    <w:lvl w:ilvl="7" w:tentative="1">
+      <w:start w:val="1"/>
+      <w:numFmt w:val="bullet"/>
+      <w:lvlText w:val=""/>
+      <w:lvlJc w:val="left"/>
+      <w:pPr>
+        <w:tabs>
+          <w:tab w:val="num" w:pos="5760"/>
+        </w:tabs>
+        <w:ind w:left="5760" w:hanging="360"/>
+      </w:pPr>
+      <w:rPr>
+        <w:rFonts w:ascii="Wingdings" w:hAnsi="Wingdings" w:hint="default"/>
+        <w:sz w:val="20"/>
+      </w:rPr>
+    </w:lvl>
+    <w:lvl w:ilvl="8" w:tentative="1">
+      <w:start w:val="1"/>
+      <w:numFmt w:val="bullet"/>
+      <w:lvlText w:val=""/>
+      <w:lvlJc w:val="left"/>
+      <w:pPr>
+        <w:tabs>
+          <w:tab w:val="num" w:pos="6480"/>
+        </w:tabs>
+        <w:ind w:left="6480" w:hanging="360"/>
+      </w:pPr>
+      <w:rPr>
+        <w:rFonts w:ascii="Wingdings" w:hAnsi="Wingdings" w:hint="default"/>
+        <w:sz w:val="20"/>
+      </w:rPr>
+    </w:lvl>
+  </w:abstractNum>
+  <w:abstractNum w:abstractNumId="10" w15:restartNumberingAfterBreak="0">
     <w:nsid w:val="116156F9"/>
     <w:multiLevelType w:val="multilevel"/>
     <w:tmpl w:val="B2B20A5E"/>
@@ -4043,7 +7075,7 @@
       </w:rPr>
     </w:lvl>
   </w:abstractNum>
-  <w:abstractNum w:abstractNumId="10" w15:restartNumberingAfterBreak="0">
+  <w:abstractNum w:abstractNumId="11" w15:restartNumberingAfterBreak="0">
     <w:nsid w:val="11A068A1"/>
     <w:multiLevelType w:val="hybridMultilevel"/>
     <w:tmpl w:val="6302B134"/>
@@ -4129,7 +7161,7 @@
       </w:pPr>
     </w:lvl>
   </w:abstractNum>
-  <w:abstractNum w:abstractNumId="11" w15:restartNumberingAfterBreak="0">
+  <w:abstractNum w:abstractNumId="12" w15:restartNumberingAfterBreak="0">
     <w:nsid w:val="12B027EA"/>
     <w:multiLevelType w:val="multilevel"/>
     <w:tmpl w:val="D12AB742"/>
@@ -4278,7 +7310,7 @@
       </w:rPr>
     </w:lvl>
   </w:abstractNum>
-  <w:abstractNum w:abstractNumId="12" w15:restartNumberingAfterBreak="0">
+  <w:abstractNum w:abstractNumId="13" w15:restartNumberingAfterBreak="0">
     <w:nsid w:val="16AC7854"/>
     <w:multiLevelType w:val="multilevel"/>
     <w:tmpl w:val="0CC8CCA6"/>
@@ -4391,7 +7423,7 @@
       </w:pPr>
     </w:lvl>
   </w:abstractNum>
-  <w:abstractNum w:abstractNumId="13" w15:restartNumberingAfterBreak="0">
+  <w:abstractNum w:abstractNumId="14" w15:restartNumberingAfterBreak="0">
     <w:nsid w:val="16D3455D"/>
     <w:multiLevelType w:val="hybridMultilevel"/>
     <w:tmpl w:val="9CEEC858"/>
@@ -4477,7 +7509,7 @@
       </w:pPr>
     </w:lvl>
   </w:abstractNum>
-  <w:abstractNum w:abstractNumId="14" w15:restartNumberingAfterBreak="0">
+  <w:abstractNum w:abstractNumId="15" w15:restartNumberingAfterBreak="0">
     <w:nsid w:val="17793434"/>
     <w:multiLevelType w:val="multilevel"/>
     <w:tmpl w:val="EBC0ECC2"/>
@@ -4626,7 +7658,7 @@
       </w:rPr>
     </w:lvl>
   </w:abstractNum>
-  <w:abstractNum w:abstractNumId="15" w15:restartNumberingAfterBreak="0">
+  <w:abstractNum w:abstractNumId="16" w15:restartNumberingAfterBreak="0">
     <w:nsid w:val="1A321E7B"/>
     <w:multiLevelType w:val="multilevel"/>
     <w:tmpl w:val="FA2278FC"/>
@@ -4775,7 +7807,7 @@
       </w:rPr>
     </w:lvl>
   </w:abstractNum>
-  <w:abstractNum w:abstractNumId="16" w15:restartNumberingAfterBreak="0">
+  <w:abstractNum w:abstractNumId="17" w15:restartNumberingAfterBreak="0">
     <w:nsid w:val="1AD17EC5"/>
     <w:multiLevelType w:val="multilevel"/>
     <w:tmpl w:val="BA96B862"/>
@@ -4869,7 +7901,7 @@
       </w:pPr>
     </w:lvl>
   </w:abstractNum>
-  <w:abstractNum w:abstractNumId="17" w15:restartNumberingAfterBreak="0">
+  <w:abstractNum w:abstractNumId="18" w15:restartNumberingAfterBreak="0">
     <w:nsid w:val="1C952524"/>
     <w:multiLevelType w:val="multilevel"/>
     <w:tmpl w:val="333AA7F6"/>
@@ -5018,7 +8050,7 @@
       </w:rPr>
     </w:lvl>
   </w:abstractNum>
-  <w:abstractNum w:abstractNumId="18" w15:restartNumberingAfterBreak="0">
+  <w:abstractNum w:abstractNumId="19" w15:restartNumberingAfterBreak="0">
     <w:nsid w:val="1E3C2836"/>
     <w:multiLevelType w:val="multilevel"/>
     <w:tmpl w:val="9A427318"/>
@@ -5167,7 +8199,156 @@
       </w:rPr>
     </w:lvl>
   </w:abstractNum>
-  <w:abstractNum w:abstractNumId="19" w15:restartNumberingAfterBreak="0">
+  <w:abstractNum w:abstractNumId="20" w15:restartNumberingAfterBreak="0">
+    <w:nsid w:val="1E456764"/>
+    <w:multiLevelType w:val="multilevel"/>
+    <w:tmpl w:val="7458E6F6"/>
+    <w:lvl w:ilvl="0">
+      <w:start w:val="1"/>
+      <w:numFmt w:val="bullet"/>
+      <w:lvlText w:val=""/>
+      <w:lvlJc w:val="left"/>
+      <w:pPr>
+        <w:tabs>
+          <w:tab w:val="num" w:pos="720"/>
+        </w:tabs>
+        <w:ind w:left="720" w:hanging="360"/>
+      </w:pPr>
+      <w:rPr>
+        <w:rFonts w:ascii="Symbol" w:hAnsi="Symbol" w:hint="default"/>
+        <w:sz w:val="20"/>
+      </w:rPr>
+    </w:lvl>
+    <w:lvl w:ilvl="1" w:tentative="1">
+      <w:start w:val="1"/>
+      <w:numFmt w:val="bullet"/>
+      <w:lvlText w:val="o"/>
+      <w:lvlJc w:val="left"/>
+      <w:pPr>
+        <w:tabs>
+          <w:tab w:val="num" w:pos="1440"/>
+        </w:tabs>
+        <w:ind w:left="1440" w:hanging="360"/>
+      </w:pPr>
+      <w:rPr>
+        <w:rFonts w:ascii="Courier New" w:hAnsi="Courier New" w:hint="default"/>
+        <w:sz w:val="20"/>
+      </w:rPr>
+    </w:lvl>
+    <w:lvl w:ilvl="2" w:tentative="1">
+      <w:start w:val="1"/>
+      <w:numFmt w:val="bullet"/>
+      <w:lvlText w:val=""/>
+      <w:lvlJc w:val="left"/>
+      <w:pPr>
+        <w:tabs>
+          <w:tab w:val="num" w:pos="2160"/>
+        </w:tabs>
+        <w:ind w:left="2160" w:hanging="360"/>
+      </w:pPr>
+      <w:rPr>
+        <w:rFonts w:ascii="Wingdings" w:hAnsi="Wingdings" w:hint="default"/>
+        <w:sz w:val="20"/>
+      </w:rPr>
+    </w:lvl>
+    <w:lvl w:ilvl="3" w:tentative="1">
+      <w:start w:val="1"/>
+      <w:numFmt w:val="bullet"/>
+      <w:lvlText w:val=""/>
+      <w:lvlJc w:val="left"/>
+      <w:pPr>
+        <w:tabs>
+          <w:tab w:val="num" w:pos="2880"/>
+        </w:tabs>
+        <w:ind w:left="2880" w:hanging="360"/>
+      </w:pPr>
+      <w:rPr>
+        <w:rFonts w:ascii="Wingdings" w:hAnsi="Wingdings" w:hint="default"/>
+        <w:sz w:val="20"/>
+      </w:rPr>
+    </w:lvl>
+    <w:lvl w:ilvl="4" w:tentative="1">
+      <w:start w:val="1"/>
+      <w:numFmt w:val="bullet"/>
+      <w:lvlText w:val=""/>
+      <w:lvlJc w:val="left"/>
+      <w:pPr>
+        <w:tabs>
+          <w:tab w:val="num" w:pos="3600"/>
+        </w:tabs>
+        <w:ind w:left="3600" w:hanging="360"/>
+      </w:pPr>
+      <w:rPr>
+        <w:rFonts w:ascii="Wingdings" w:hAnsi="Wingdings" w:hint="default"/>
+        <w:sz w:val="20"/>
+      </w:rPr>
+    </w:lvl>
+    <w:lvl w:ilvl="5" w:tentative="1">
+      <w:start w:val="1"/>
+      <w:numFmt w:val="bullet"/>
+      <w:lvlText w:val=""/>
+      <w:lvlJc w:val="left"/>
+      <w:pPr>
+        <w:tabs>
+          <w:tab w:val="num" w:pos="4320"/>
+        </w:tabs>
+        <w:ind w:left="4320" w:hanging="360"/>
+      </w:pPr>
+      <w:rPr>
+        <w:rFonts w:ascii="Wingdings" w:hAnsi="Wingdings" w:hint="default"/>
+        <w:sz w:val="20"/>
+      </w:rPr>
+    </w:lvl>
+    <w:lvl w:ilvl="6" w:tentative="1">
+      <w:start w:val="1"/>
+      <w:numFmt w:val="bullet"/>
+      <w:lvlText w:val=""/>
+      <w:lvlJc w:val="left"/>
+      <w:pPr>
+        <w:tabs>
+          <w:tab w:val="num" w:pos="5040"/>
+        </w:tabs>
+        <w:ind w:left="5040" w:hanging="360"/>
+      </w:pPr>
+      <w:rPr>
+        <w:rFonts w:ascii="Wingdings" w:hAnsi="Wingdings" w:hint="default"/>
+        <w:sz w:val="20"/>
+      </w:rPr>
+    </w:lvl>
+    <w:lvl w:ilvl="7" w:tentative="1">
+      <w:start w:val="1"/>
+      <w:numFmt w:val="bullet"/>
+      <w:lvlText w:val=""/>
+      <w:lvlJc w:val="left"/>
+      <w:pPr>
+        <w:tabs>
+          <w:tab w:val="num" w:pos="5760"/>
+        </w:tabs>
+        <w:ind w:left="5760" w:hanging="360"/>
+      </w:pPr>
+      <w:rPr>
+        <w:rFonts w:ascii="Wingdings" w:hAnsi="Wingdings" w:hint="default"/>
+        <w:sz w:val="20"/>
+      </w:rPr>
+    </w:lvl>
+    <w:lvl w:ilvl="8" w:tentative="1">
+      <w:start w:val="1"/>
+      <w:numFmt w:val="bullet"/>
+      <w:lvlText w:val=""/>
+      <w:lvlJc w:val="left"/>
+      <w:pPr>
+        <w:tabs>
+          <w:tab w:val="num" w:pos="6480"/>
+        </w:tabs>
+        <w:ind w:left="6480" w:hanging="360"/>
+      </w:pPr>
+      <w:rPr>
+        <w:rFonts w:ascii="Wingdings" w:hAnsi="Wingdings" w:hint="default"/>
+        <w:sz w:val="20"/>
+      </w:rPr>
+    </w:lvl>
+  </w:abstractNum>
+  <w:abstractNum w:abstractNumId="21" w15:restartNumberingAfterBreak="0">
     <w:nsid w:val="21991A2E"/>
     <w:multiLevelType w:val="multilevel"/>
     <w:tmpl w:val="0318E90E"/>
@@ -5316,7 +8497,7 @@
       </w:rPr>
     </w:lvl>
   </w:abstractNum>
-  <w:abstractNum w:abstractNumId="20" w15:restartNumberingAfterBreak="0">
+  <w:abstractNum w:abstractNumId="22" w15:restartNumberingAfterBreak="0">
     <w:nsid w:val="23FF3111"/>
     <w:multiLevelType w:val="multilevel"/>
     <w:tmpl w:val="332EEA2A"/>
@@ -5437,7 +8618,7 @@
       </w:pPr>
     </w:lvl>
   </w:abstractNum>
-  <w:abstractNum w:abstractNumId="21" w15:restartNumberingAfterBreak="0">
+  <w:abstractNum w:abstractNumId="23" w15:restartNumberingAfterBreak="0">
     <w:nsid w:val="25753139"/>
     <w:multiLevelType w:val="multilevel"/>
     <w:tmpl w:val="0834FC62"/>
@@ -5550,7 +8731,7 @@
       </w:pPr>
     </w:lvl>
   </w:abstractNum>
-  <w:abstractNum w:abstractNumId="22" w15:restartNumberingAfterBreak="0">
+  <w:abstractNum w:abstractNumId="24" w15:restartNumberingAfterBreak="0">
     <w:nsid w:val="25E332B0"/>
     <w:multiLevelType w:val="multilevel"/>
     <w:tmpl w:val="836EADD0"/>
@@ -5699,7 +8880,7 @@
       </w:rPr>
     </w:lvl>
   </w:abstractNum>
-  <w:abstractNum w:abstractNumId="23" w15:restartNumberingAfterBreak="0">
+  <w:abstractNum w:abstractNumId="25" w15:restartNumberingAfterBreak="0">
     <w:nsid w:val="27A231A6"/>
     <w:multiLevelType w:val="hybridMultilevel"/>
     <w:tmpl w:val="11622E02"/>
@@ -5815,7 +8996,156 @@
       </w:pPr>
     </w:lvl>
   </w:abstractNum>
-  <w:abstractNum w:abstractNumId="24" w15:restartNumberingAfterBreak="0">
+  <w:abstractNum w:abstractNumId="26" w15:restartNumberingAfterBreak="0">
+    <w:nsid w:val="2886489C"/>
+    <w:multiLevelType w:val="multilevel"/>
+    <w:tmpl w:val="7CDA446A"/>
+    <w:lvl w:ilvl="0">
+      <w:start w:val="1"/>
+      <w:numFmt w:val="bullet"/>
+      <w:lvlText w:val=""/>
+      <w:lvlJc w:val="left"/>
+      <w:pPr>
+        <w:tabs>
+          <w:tab w:val="num" w:pos="720"/>
+        </w:tabs>
+        <w:ind w:left="720" w:hanging="360"/>
+      </w:pPr>
+      <w:rPr>
+        <w:rFonts w:ascii="Symbol" w:hAnsi="Symbol" w:hint="default"/>
+        <w:sz w:val="20"/>
+      </w:rPr>
+    </w:lvl>
+    <w:lvl w:ilvl="1" w:tentative="1">
+      <w:start w:val="1"/>
+      <w:numFmt w:val="bullet"/>
+      <w:lvlText w:val="o"/>
+      <w:lvlJc w:val="left"/>
+      <w:pPr>
+        <w:tabs>
+          <w:tab w:val="num" w:pos="1440"/>
+        </w:tabs>
+        <w:ind w:left="1440" w:hanging="360"/>
+      </w:pPr>
+      <w:rPr>
+        <w:rFonts w:ascii="Courier New" w:hAnsi="Courier New" w:hint="default"/>
+        <w:sz w:val="20"/>
+      </w:rPr>
+    </w:lvl>
+    <w:lvl w:ilvl="2" w:tentative="1">
+      <w:start w:val="1"/>
+      <w:numFmt w:val="bullet"/>
+      <w:lvlText w:val=""/>
+      <w:lvlJc w:val="left"/>
+      <w:pPr>
+        <w:tabs>
+          <w:tab w:val="num" w:pos="2160"/>
+        </w:tabs>
+        <w:ind w:left="2160" w:hanging="360"/>
+      </w:pPr>
+      <w:rPr>
+        <w:rFonts w:ascii="Wingdings" w:hAnsi="Wingdings" w:hint="default"/>
+        <w:sz w:val="20"/>
+      </w:rPr>
+    </w:lvl>
+    <w:lvl w:ilvl="3" w:tentative="1">
+      <w:start w:val="1"/>
+      <w:numFmt w:val="bullet"/>
+      <w:lvlText w:val=""/>
+      <w:lvlJc w:val="left"/>
+      <w:pPr>
+        <w:tabs>
+          <w:tab w:val="num" w:pos="2880"/>
+        </w:tabs>
+        <w:ind w:left="2880" w:hanging="360"/>
+      </w:pPr>
+      <w:rPr>
+        <w:rFonts w:ascii="Wingdings" w:hAnsi="Wingdings" w:hint="default"/>
+        <w:sz w:val="20"/>
+      </w:rPr>
+    </w:lvl>
+    <w:lvl w:ilvl="4" w:tentative="1">
+      <w:start w:val="1"/>
+      <w:numFmt w:val="bullet"/>
+      <w:lvlText w:val=""/>
+      <w:lvlJc w:val="left"/>
+      <w:pPr>
+        <w:tabs>
+          <w:tab w:val="num" w:pos="3600"/>
+        </w:tabs>
+        <w:ind w:left="3600" w:hanging="360"/>
+      </w:pPr>
+      <w:rPr>
+        <w:rFonts w:ascii="Wingdings" w:hAnsi="Wingdings" w:hint="default"/>
+        <w:sz w:val="20"/>
+      </w:rPr>
+    </w:lvl>
+    <w:lvl w:ilvl="5" w:tentative="1">
+      <w:start w:val="1"/>
+      <w:numFmt w:val="bullet"/>
+      <w:lvlText w:val=""/>
+      <w:lvlJc w:val="left"/>
+      <w:pPr>
+        <w:tabs>
+          <w:tab w:val="num" w:pos="4320"/>
+        </w:tabs>
+        <w:ind w:left="4320" w:hanging="360"/>
+      </w:pPr>
+      <w:rPr>
+        <w:rFonts w:ascii="Wingdings" w:hAnsi="Wingdings" w:hint="default"/>
+        <w:sz w:val="20"/>
+      </w:rPr>
+    </w:lvl>
+    <w:lvl w:ilvl="6" w:tentative="1">
+      <w:start w:val="1"/>
+      <w:numFmt w:val="bullet"/>
+      <w:lvlText w:val=""/>
+      <w:lvlJc w:val="left"/>
+      <w:pPr>
+        <w:tabs>
+          <w:tab w:val="num" w:pos="5040"/>
+        </w:tabs>
+        <w:ind w:left="5040" w:hanging="360"/>
+      </w:pPr>
+      <w:rPr>
+        <w:rFonts w:ascii="Wingdings" w:hAnsi="Wingdings" w:hint="default"/>
+        <w:sz w:val="20"/>
+      </w:rPr>
+    </w:lvl>
+    <w:lvl w:ilvl="7" w:tentative="1">
+      <w:start w:val="1"/>
+      <w:numFmt w:val="bullet"/>
+      <w:lvlText w:val=""/>
+      <w:lvlJc w:val="left"/>
+      <w:pPr>
+        <w:tabs>
+          <w:tab w:val="num" w:pos="5760"/>
+        </w:tabs>
+        <w:ind w:left="5760" w:hanging="360"/>
+      </w:pPr>
+      <w:rPr>
+        <w:rFonts w:ascii="Wingdings" w:hAnsi="Wingdings" w:hint="default"/>
+        <w:sz w:val="20"/>
+      </w:rPr>
+    </w:lvl>
+    <w:lvl w:ilvl="8" w:tentative="1">
+      <w:start w:val="1"/>
+      <w:numFmt w:val="bullet"/>
+      <w:lvlText w:val=""/>
+      <w:lvlJc w:val="left"/>
+      <w:pPr>
+        <w:tabs>
+          <w:tab w:val="num" w:pos="6480"/>
+        </w:tabs>
+        <w:ind w:left="6480" w:hanging="360"/>
+      </w:pPr>
+      <w:rPr>
+        <w:rFonts w:ascii="Wingdings" w:hAnsi="Wingdings" w:hint="default"/>
+        <w:sz w:val="20"/>
+      </w:rPr>
+    </w:lvl>
+  </w:abstractNum>
+  <w:abstractNum w:abstractNumId="27" w15:restartNumberingAfterBreak="0">
     <w:nsid w:val="28B96EF8"/>
     <w:multiLevelType w:val="multilevel"/>
     <w:tmpl w:val="CF1E58EC"/>
@@ -5928,7 +9258,7 @@
       </w:pPr>
     </w:lvl>
   </w:abstractNum>
-  <w:abstractNum w:abstractNumId="25" w15:restartNumberingAfterBreak="0">
+  <w:abstractNum w:abstractNumId="28" w15:restartNumberingAfterBreak="0">
     <w:nsid w:val="2A4313D3"/>
     <w:multiLevelType w:val="multilevel"/>
     <w:tmpl w:val="7722C950"/>
@@ -6077,7 +9407,7 @@
       </w:rPr>
     </w:lvl>
   </w:abstractNum>
-  <w:abstractNum w:abstractNumId="26" w15:restartNumberingAfterBreak="0">
+  <w:abstractNum w:abstractNumId="29" w15:restartNumberingAfterBreak="0">
     <w:nsid w:val="2B5520D3"/>
     <w:multiLevelType w:val="hybridMultilevel"/>
     <w:tmpl w:val="F5AC7396"/>
@@ -6166,7 +9496,7 @@
       </w:pPr>
     </w:lvl>
   </w:abstractNum>
-  <w:abstractNum w:abstractNumId="27" w15:restartNumberingAfterBreak="0">
+  <w:abstractNum w:abstractNumId="30" w15:restartNumberingAfterBreak="0">
     <w:nsid w:val="2B871CA9"/>
     <w:multiLevelType w:val="multilevel"/>
     <w:tmpl w:val="8C7CE0BA"/>
@@ -6279,7 +9609,7 @@
       </w:pPr>
     </w:lvl>
   </w:abstractNum>
-  <w:abstractNum w:abstractNumId="28" w15:restartNumberingAfterBreak="0">
+  <w:abstractNum w:abstractNumId="31" w15:restartNumberingAfterBreak="0">
     <w:nsid w:val="2C4915FD"/>
     <w:multiLevelType w:val="hybridMultilevel"/>
     <w:tmpl w:val="60868122"/>
@@ -6365,7 +9695,7 @@
       </w:pPr>
     </w:lvl>
   </w:abstractNum>
-  <w:abstractNum w:abstractNumId="29" w15:restartNumberingAfterBreak="0">
+  <w:abstractNum w:abstractNumId="32" w15:restartNumberingAfterBreak="0">
     <w:nsid w:val="2C7D0510"/>
     <w:multiLevelType w:val="multilevel"/>
     <w:tmpl w:val="91B44830"/>
@@ -6514,7 +9844,7 @@
       </w:rPr>
     </w:lvl>
   </w:abstractNum>
-  <w:abstractNum w:abstractNumId="30" w15:restartNumberingAfterBreak="0">
+  <w:abstractNum w:abstractNumId="33" w15:restartNumberingAfterBreak="0">
     <w:nsid w:val="2D820BBC"/>
     <w:multiLevelType w:val="hybridMultilevel"/>
     <w:tmpl w:val="A71A0176"/>
@@ -6654,7 +9984,7 @@
       </w:rPr>
     </w:lvl>
   </w:abstractNum>
-  <w:abstractNum w:abstractNumId="31" w15:restartNumberingAfterBreak="0">
+  <w:abstractNum w:abstractNumId="34" w15:restartNumberingAfterBreak="0">
     <w:nsid w:val="2E565A27"/>
     <w:multiLevelType w:val="hybridMultilevel"/>
     <w:tmpl w:val="AAFE82AA"/>
@@ -6740,7 +10070,7 @@
       </w:pPr>
     </w:lvl>
   </w:abstractNum>
-  <w:abstractNum w:abstractNumId="32" w15:restartNumberingAfterBreak="0">
+  <w:abstractNum w:abstractNumId="35" w15:restartNumberingAfterBreak="0">
     <w:nsid w:val="2EA22A1D"/>
     <w:multiLevelType w:val="multilevel"/>
     <w:tmpl w:val="89586BD0"/>
@@ -6889,7 +10219,7 @@
       </w:rPr>
     </w:lvl>
   </w:abstractNum>
-  <w:abstractNum w:abstractNumId="33" w15:restartNumberingAfterBreak="0">
+  <w:abstractNum w:abstractNumId="36" w15:restartNumberingAfterBreak="0">
     <w:nsid w:val="2F7008CB"/>
     <w:multiLevelType w:val="multilevel"/>
     <w:tmpl w:val="F7E0FCEC"/>
@@ -7002,7 +10332,7 @@
       </w:pPr>
     </w:lvl>
   </w:abstractNum>
-  <w:abstractNum w:abstractNumId="34" w15:restartNumberingAfterBreak="0">
+  <w:abstractNum w:abstractNumId="37" w15:restartNumberingAfterBreak="0">
     <w:nsid w:val="2F8C525B"/>
     <w:multiLevelType w:val="multilevel"/>
     <w:tmpl w:val="5EB26B82"/>
@@ -7151,7 +10481,7 @@
       </w:rPr>
     </w:lvl>
   </w:abstractNum>
-  <w:abstractNum w:abstractNumId="35" w15:restartNumberingAfterBreak="0">
+  <w:abstractNum w:abstractNumId="38" w15:restartNumberingAfterBreak="0">
     <w:nsid w:val="31682B12"/>
     <w:multiLevelType w:val="multilevel"/>
     <w:tmpl w:val="1B28208C"/>
@@ -7300,7 +10630,7 @@
       </w:rPr>
     </w:lvl>
   </w:abstractNum>
-  <w:abstractNum w:abstractNumId="36" w15:restartNumberingAfterBreak="0">
+  <w:abstractNum w:abstractNumId="39" w15:restartNumberingAfterBreak="0">
     <w:nsid w:val="34351EC6"/>
     <w:multiLevelType w:val="multilevel"/>
     <w:tmpl w:val="8DD477AE"/>
@@ -7421,7 +10751,7 @@
       </w:pPr>
     </w:lvl>
   </w:abstractNum>
-  <w:abstractNum w:abstractNumId="37" w15:restartNumberingAfterBreak="0">
+  <w:abstractNum w:abstractNumId="40" w15:restartNumberingAfterBreak="0">
     <w:nsid w:val="364F39FB"/>
     <w:multiLevelType w:val="multilevel"/>
     <w:tmpl w:val="3CF26F3A"/>
@@ -7570,7 +10900,7 @@
       </w:rPr>
     </w:lvl>
   </w:abstractNum>
-  <w:abstractNum w:abstractNumId="38" w15:restartNumberingAfterBreak="0">
+  <w:abstractNum w:abstractNumId="41" w15:restartNumberingAfterBreak="0">
     <w:nsid w:val="36A05B3F"/>
     <w:multiLevelType w:val="multilevel"/>
     <w:tmpl w:val="83F0F212"/>
@@ -7719,7 +11049,7 @@
       </w:rPr>
     </w:lvl>
   </w:abstractNum>
-  <w:abstractNum w:abstractNumId="39" w15:restartNumberingAfterBreak="0">
+  <w:abstractNum w:abstractNumId="42" w15:restartNumberingAfterBreak="0">
     <w:nsid w:val="373B0523"/>
     <w:multiLevelType w:val="multilevel"/>
     <w:tmpl w:val="964E94B2"/>
@@ -7868,7 +11198,7 @@
       </w:rPr>
     </w:lvl>
   </w:abstractNum>
-  <w:abstractNum w:abstractNumId="40" w15:restartNumberingAfterBreak="0">
+  <w:abstractNum w:abstractNumId="43" w15:restartNumberingAfterBreak="0">
     <w:nsid w:val="38025C9F"/>
     <w:multiLevelType w:val="multilevel"/>
     <w:tmpl w:val="18B894D4"/>
@@ -8017,7 +11347,7 @@
       </w:rPr>
     </w:lvl>
   </w:abstractNum>
-  <w:abstractNum w:abstractNumId="41" w15:restartNumberingAfterBreak="0">
+  <w:abstractNum w:abstractNumId="44" w15:restartNumberingAfterBreak="0">
     <w:nsid w:val="38FC57AF"/>
     <w:multiLevelType w:val="hybridMultilevel"/>
     <w:tmpl w:val="21B43A8E"/>
@@ -8106,7 +11436,7 @@
       </w:pPr>
     </w:lvl>
   </w:abstractNum>
-  <w:abstractNum w:abstractNumId="42" w15:restartNumberingAfterBreak="0">
+  <w:abstractNum w:abstractNumId="45" w15:restartNumberingAfterBreak="0">
     <w:nsid w:val="3B2C40AC"/>
     <w:multiLevelType w:val="multilevel"/>
     <w:tmpl w:val="9BB4CC2E"/>
@@ -8255,7 +11585,7 @@
       </w:rPr>
     </w:lvl>
   </w:abstractNum>
-  <w:abstractNum w:abstractNumId="43" w15:restartNumberingAfterBreak="0">
+  <w:abstractNum w:abstractNumId="46" w15:restartNumberingAfterBreak="0">
     <w:nsid w:val="3B2E1BCD"/>
     <w:multiLevelType w:val="multilevel"/>
     <w:tmpl w:val="9CEEC8C4"/>
@@ -8404,7 +11734,7 @@
       </w:rPr>
     </w:lvl>
   </w:abstractNum>
-  <w:abstractNum w:abstractNumId="44" w15:restartNumberingAfterBreak="0">
+  <w:abstractNum w:abstractNumId="47" w15:restartNumberingAfterBreak="0">
     <w:nsid w:val="3B5039C5"/>
     <w:multiLevelType w:val="hybridMultilevel"/>
     <w:tmpl w:val="02EEE21E"/>
@@ -8490,7 +11820,7 @@
       </w:pPr>
     </w:lvl>
   </w:abstractNum>
-  <w:abstractNum w:abstractNumId="45" w15:restartNumberingAfterBreak="0">
+  <w:abstractNum w:abstractNumId="48" w15:restartNumberingAfterBreak="0">
     <w:nsid w:val="3CEC7B65"/>
     <w:multiLevelType w:val="multilevel"/>
     <w:tmpl w:val="237251E0"/>
@@ -8639,7 +11969,7 @@
       </w:rPr>
     </w:lvl>
   </w:abstractNum>
-  <w:abstractNum w:abstractNumId="46" w15:restartNumberingAfterBreak="0">
+  <w:abstractNum w:abstractNumId="49" w15:restartNumberingAfterBreak="0">
     <w:nsid w:val="408B582C"/>
     <w:multiLevelType w:val="multilevel"/>
     <w:tmpl w:val="8FC84EE4"/>
@@ -8788,7 +12118,7 @@
       </w:rPr>
     </w:lvl>
   </w:abstractNum>
-  <w:abstractNum w:abstractNumId="47" w15:restartNumberingAfterBreak="0">
+  <w:abstractNum w:abstractNumId="50" w15:restartNumberingAfterBreak="0">
     <w:nsid w:val="430B3396"/>
     <w:multiLevelType w:val="multilevel"/>
     <w:tmpl w:val="581E050E"/>
@@ -8937,7 +12267,7 @@
       </w:rPr>
     </w:lvl>
   </w:abstractNum>
-  <w:abstractNum w:abstractNumId="48" w15:restartNumberingAfterBreak="0">
+  <w:abstractNum w:abstractNumId="51" w15:restartNumberingAfterBreak="0">
     <w:nsid w:val="434B5C4D"/>
     <w:multiLevelType w:val="multilevel"/>
     <w:tmpl w:val="6478CCC6"/>
@@ -9086,7 +12416,7 @@
       </w:rPr>
     </w:lvl>
   </w:abstractNum>
-  <w:abstractNum w:abstractNumId="49" w15:restartNumberingAfterBreak="0">
+  <w:abstractNum w:abstractNumId="52" w15:restartNumberingAfterBreak="0">
     <w:nsid w:val="46445A09"/>
     <w:multiLevelType w:val="multilevel"/>
     <w:tmpl w:val="8B86FF52"/>
@@ -9235,7 +12565,7 @@
       </w:rPr>
     </w:lvl>
   </w:abstractNum>
-  <w:abstractNum w:abstractNumId="50" w15:restartNumberingAfterBreak="0">
+  <w:abstractNum w:abstractNumId="53" w15:restartNumberingAfterBreak="0">
     <w:nsid w:val="4A027A32"/>
     <w:multiLevelType w:val="hybridMultilevel"/>
     <w:tmpl w:val="63F2C52A"/>
@@ -9324,7 +12654,7 @@
       </w:pPr>
     </w:lvl>
   </w:abstractNum>
-  <w:abstractNum w:abstractNumId="51" w15:restartNumberingAfterBreak="0">
+  <w:abstractNum w:abstractNumId="54" w15:restartNumberingAfterBreak="0">
     <w:nsid w:val="4CEC4B30"/>
     <w:multiLevelType w:val="hybridMultilevel"/>
     <w:tmpl w:val="51E4FC02"/>
@@ -9437,7 +12767,7 @@
       </w:rPr>
     </w:lvl>
   </w:abstractNum>
-  <w:abstractNum w:abstractNumId="52" w15:restartNumberingAfterBreak="0">
+  <w:abstractNum w:abstractNumId="55" w15:restartNumberingAfterBreak="0">
     <w:nsid w:val="4DC7000D"/>
     <w:multiLevelType w:val="hybridMultilevel"/>
     <w:tmpl w:val="617AF260"/>
@@ -9526,7 +12856,7 @@
       </w:pPr>
     </w:lvl>
   </w:abstractNum>
-  <w:abstractNum w:abstractNumId="53" w15:restartNumberingAfterBreak="0">
+  <w:abstractNum w:abstractNumId="56" w15:restartNumberingAfterBreak="0">
     <w:nsid w:val="535A61CC"/>
     <w:multiLevelType w:val="hybridMultilevel"/>
     <w:tmpl w:val="3FB2197E"/>
@@ -9639,7 +12969,7 @@
       </w:rPr>
     </w:lvl>
   </w:abstractNum>
-  <w:abstractNum w:abstractNumId="54" w15:restartNumberingAfterBreak="0">
+  <w:abstractNum w:abstractNumId="57" w15:restartNumberingAfterBreak="0">
     <w:nsid w:val="54A34356"/>
     <w:multiLevelType w:val="multilevel"/>
     <w:tmpl w:val="D328316A"/>
@@ -9756,7 +13086,7 @@
       </w:pPr>
     </w:lvl>
   </w:abstractNum>
-  <w:abstractNum w:abstractNumId="55" w15:restartNumberingAfterBreak="0">
+  <w:abstractNum w:abstractNumId="58" w15:restartNumberingAfterBreak="0">
     <w:nsid w:val="56180D7F"/>
     <w:multiLevelType w:val="hybridMultilevel"/>
     <w:tmpl w:val="7C10F8DC"/>
@@ -9842,7 +13172,7 @@
       </w:pPr>
     </w:lvl>
   </w:abstractNum>
-  <w:abstractNum w:abstractNumId="56" w15:restartNumberingAfterBreak="0">
+  <w:abstractNum w:abstractNumId="59" w15:restartNumberingAfterBreak="0">
     <w:nsid w:val="561B0F56"/>
     <w:multiLevelType w:val="multilevel"/>
     <w:tmpl w:val="FC18E620"/>
@@ -9991,7 +13321,7 @@
       </w:rPr>
     </w:lvl>
   </w:abstractNum>
-  <w:abstractNum w:abstractNumId="57" w15:restartNumberingAfterBreak="0">
+  <w:abstractNum w:abstractNumId="60" w15:restartNumberingAfterBreak="0">
     <w:nsid w:val="56356641"/>
     <w:multiLevelType w:val="multilevel"/>
     <w:tmpl w:val="30EC4708"/>
@@ -10140,7 +13470,7 @@
       </w:rPr>
     </w:lvl>
   </w:abstractNum>
-  <w:abstractNum w:abstractNumId="58" w15:restartNumberingAfterBreak="0">
+  <w:abstractNum w:abstractNumId="61" w15:restartNumberingAfterBreak="0">
     <w:nsid w:val="5807564D"/>
     <w:multiLevelType w:val="multilevel"/>
     <w:tmpl w:val="184C8744"/>
@@ -10289,7 +13619,7 @@
       </w:rPr>
     </w:lvl>
   </w:abstractNum>
-  <w:abstractNum w:abstractNumId="59" w15:restartNumberingAfterBreak="0">
+  <w:abstractNum w:abstractNumId="62" w15:restartNumberingAfterBreak="0">
     <w:nsid w:val="5A622A4B"/>
     <w:multiLevelType w:val="multilevel"/>
     <w:tmpl w:val="5728F0B2"/>
@@ -10438,7 +13768,7 @@
       </w:rPr>
     </w:lvl>
   </w:abstractNum>
-  <w:abstractNum w:abstractNumId="60" w15:restartNumberingAfterBreak="0">
+  <w:abstractNum w:abstractNumId="63" w15:restartNumberingAfterBreak="0">
     <w:nsid w:val="5C3D5BC8"/>
     <w:multiLevelType w:val="multilevel"/>
     <w:tmpl w:val="8ED64BF6"/>
@@ -10551,7 +13881,7 @@
       </w:pPr>
     </w:lvl>
   </w:abstractNum>
-  <w:abstractNum w:abstractNumId="61" w15:restartNumberingAfterBreak="0">
+  <w:abstractNum w:abstractNumId="64" w15:restartNumberingAfterBreak="0">
     <w:nsid w:val="5DFA7DF7"/>
     <w:multiLevelType w:val="multilevel"/>
     <w:tmpl w:val="2B6067A8"/>
@@ -10673,7 +14003,7 @@
       </w:pPr>
     </w:lvl>
   </w:abstractNum>
-  <w:abstractNum w:abstractNumId="62" w15:restartNumberingAfterBreak="0">
+  <w:abstractNum w:abstractNumId="65" w15:restartNumberingAfterBreak="0">
     <w:nsid w:val="5E0666FD"/>
     <w:multiLevelType w:val="multilevel"/>
     <w:tmpl w:val="A634BAE4"/>
@@ -10786,7 +14116,156 @@
       </w:rPr>
     </w:lvl>
   </w:abstractNum>
-  <w:abstractNum w:abstractNumId="63" w15:restartNumberingAfterBreak="0">
+  <w:abstractNum w:abstractNumId="66" w15:restartNumberingAfterBreak="0">
+    <w:nsid w:val="5E343F01"/>
+    <w:multiLevelType w:val="multilevel"/>
+    <w:tmpl w:val="9B64E4C0"/>
+    <w:lvl w:ilvl="0">
+      <w:start w:val="1"/>
+      <w:numFmt w:val="bullet"/>
+      <w:lvlText w:val=""/>
+      <w:lvlJc w:val="left"/>
+      <w:pPr>
+        <w:tabs>
+          <w:tab w:val="num" w:pos="720"/>
+        </w:tabs>
+        <w:ind w:left="720" w:hanging="360"/>
+      </w:pPr>
+      <w:rPr>
+        <w:rFonts w:ascii="Symbol" w:hAnsi="Symbol" w:hint="default"/>
+        <w:sz w:val="20"/>
+      </w:rPr>
+    </w:lvl>
+    <w:lvl w:ilvl="1" w:tentative="1">
+      <w:start w:val="1"/>
+      <w:numFmt w:val="bullet"/>
+      <w:lvlText w:val="o"/>
+      <w:lvlJc w:val="left"/>
+      <w:pPr>
+        <w:tabs>
+          <w:tab w:val="num" w:pos="1440"/>
+        </w:tabs>
+        <w:ind w:left="1440" w:hanging="360"/>
+      </w:pPr>
+      <w:rPr>
+        <w:rFonts w:ascii="Courier New" w:hAnsi="Courier New" w:hint="default"/>
+        <w:sz w:val="20"/>
+      </w:rPr>
+    </w:lvl>
+    <w:lvl w:ilvl="2" w:tentative="1">
+      <w:start w:val="1"/>
+      <w:numFmt w:val="bullet"/>
+      <w:lvlText w:val=""/>
+      <w:lvlJc w:val="left"/>
+      <w:pPr>
+        <w:tabs>
+          <w:tab w:val="num" w:pos="2160"/>
+        </w:tabs>
+        <w:ind w:left="2160" w:hanging="360"/>
+      </w:pPr>
+      <w:rPr>
+        <w:rFonts w:ascii="Wingdings" w:hAnsi="Wingdings" w:hint="default"/>
+        <w:sz w:val="20"/>
+      </w:rPr>
+    </w:lvl>
+    <w:lvl w:ilvl="3" w:tentative="1">
+      <w:start w:val="1"/>
+      <w:numFmt w:val="bullet"/>
+      <w:lvlText w:val=""/>
+      <w:lvlJc w:val="left"/>
+      <w:pPr>
+        <w:tabs>
+          <w:tab w:val="num" w:pos="2880"/>
+        </w:tabs>
+        <w:ind w:left="2880" w:hanging="360"/>
+      </w:pPr>
+      <w:rPr>
+        <w:rFonts w:ascii="Wingdings" w:hAnsi="Wingdings" w:hint="default"/>
+        <w:sz w:val="20"/>
+      </w:rPr>
+    </w:lvl>
+    <w:lvl w:ilvl="4" w:tentative="1">
+      <w:start w:val="1"/>
+      <w:numFmt w:val="bullet"/>
+      <w:lvlText w:val=""/>
+      <w:lvlJc w:val="left"/>
+      <w:pPr>
+        <w:tabs>
+          <w:tab w:val="num" w:pos="3600"/>
+        </w:tabs>
+        <w:ind w:left="3600" w:hanging="360"/>
+      </w:pPr>
+      <w:rPr>
+        <w:rFonts w:ascii="Wingdings" w:hAnsi="Wingdings" w:hint="default"/>
+        <w:sz w:val="20"/>
+      </w:rPr>
+    </w:lvl>
+    <w:lvl w:ilvl="5" w:tentative="1">
+      <w:start w:val="1"/>
+      <w:numFmt w:val="bullet"/>
+      <w:lvlText w:val=""/>
+      <w:lvlJc w:val="left"/>
+      <w:pPr>
+        <w:tabs>
+          <w:tab w:val="num" w:pos="4320"/>
+        </w:tabs>
+        <w:ind w:left="4320" w:hanging="360"/>
+      </w:pPr>
+      <w:rPr>
+        <w:rFonts w:ascii="Wingdings" w:hAnsi="Wingdings" w:hint="default"/>
+        <w:sz w:val="20"/>
+      </w:rPr>
+    </w:lvl>
+    <w:lvl w:ilvl="6" w:tentative="1">
+      <w:start w:val="1"/>
+      <w:numFmt w:val="bullet"/>
+      <w:lvlText w:val=""/>
+      <w:lvlJc w:val="left"/>
+      <w:pPr>
+        <w:tabs>
+          <w:tab w:val="num" w:pos="5040"/>
+        </w:tabs>
+        <w:ind w:left="5040" w:hanging="360"/>
+      </w:pPr>
+      <w:rPr>
+        <w:rFonts w:ascii="Wingdings" w:hAnsi="Wingdings" w:hint="default"/>
+        <w:sz w:val="20"/>
+      </w:rPr>
+    </w:lvl>
+    <w:lvl w:ilvl="7" w:tentative="1">
+      <w:start w:val="1"/>
+      <w:numFmt w:val="bullet"/>
+      <w:lvlText w:val=""/>
+      <w:lvlJc w:val="left"/>
+      <w:pPr>
+        <w:tabs>
+          <w:tab w:val="num" w:pos="5760"/>
+        </w:tabs>
+        <w:ind w:left="5760" w:hanging="360"/>
+      </w:pPr>
+      <w:rPr>
+        <w:rFonts w:ascii="Wingdings" w:hAnsi="Wingdings" w:hint="default"/>
+        <w:sz w:val="20"/>
+      </w:rPr>
+    </w:lvl>
+    <w:lvl w:ilvl="8" w:tentative="1">
+      <w:start w:val="1"/>
+      <w:numFmt w:val="bullet"/>
+      <w:lvlText w:val=""/>
+      <w:lvlJc w:val="left"/>
+      <w:pPr>
+        <w:tabs>
+          <w:tab w:val="num" w:pos="6480"/>
+        </w:tabs>
+        <w:ind w:left="6480" w:hanging="360"/>
+      </w:pPr>
+      <w:rPr>
+        <w:rFonts w:ascii="Wingdings" w:hAnsi="Wingdings" w:hint="default"/>
+        <w:sz w:val="20"/>
+      </w:rPr>
+    </w:lvl>
+  </w:abstractNum>
+  <w:abstractNum w:abstractNumId="67" w15:restartNumberingAfterBreak="0">
     <w:nsid w:val="61D337D9"/>
     <w:multiLevelType w:val="hybridMultilevel"/>
     <w:tmpl w:val="6E8C59B6"/>
@@ -10899,7 +14378,7 @@
       </w:rPr>
     </w:lvl>
   </w:abstractNum>
-  <w:abstractNum w:abstractNumId="64" w15:restartNumberingAfterBreak="0">
+  <w:abstractNum w:abstractNumId="68" w15:restartNumberingAfterBreak="0">
     <w:nsid w:val="638B0652"/>
     <w:multiLevelType w:val="hybridMultilevel"/>
     <w:tmpl w:val="761458F8"/>
@@ -10988,7 +14467,7 @@
       </w:pPr>
     </w:lvl>
   </w:abstractNum>
-  <w:abstractNum w:abstractNumId="65" w15:restartNumberingAfterBreak="0">
+  <w:abstractNum w:abstractNumId="69" w15:restartNumberingAfterBreak="0">
     <w:nsid w:val="65F07D1B"/>
     <w:multiLevelType w:val="multilevel"/>
     <w:tmpl w:val="A6C45A9E"/>
@@ -11101,7 +14580,7 @@
       </w:pPr>
     </w:lvl>
   </w:abstractNum>
-  <w:abstractNum w:abstractNumId="66" w15:restartNumberingAfterBreak="0">
+  <w:abstractNum w:abstractNumId="70" w15:restartNumberingAfterBreak="0">
     <w:nsid w:val="66E953FA"/>
     <w:multiLevelType w:val="hybridMultilevel"/>
     <w:tmpl w:val="5150D742"/>
@@ -11187,7 +14666,7 @@
       </w:pPr>
     </w:lvl>
   </w:abstractNum>
-  <w:abstractNum w:abstractNumId="67" w15:restartNumberingAfterBreak="0">
+  <w:abstractNum w:abstractNumId="71" w15:restartNumberingAfterBreak="0">
     <w:nsid w:val="68C35AE2"/>
     <w:multiLevelType w:val="multilevel"/>
     <w:tmpl w:val="B62686E2"/>
@@ -11336,7 +14815,7 @@
       </w:rPr>
     </w:lvl>
   </w:abstractNum>
-  <w:abstractNum w:abstractNumId="68" w15:restartNumberingAfterBreak="0">
+  <w:abstractNum w:abstractNumId="72" w15:restartNumberingAfterBreak="0">
     <w:nsid w:val="6F613310"/>
     <w:multiLevelType w:val="hybridMultilevel"/>
     <w:tmpl w:val="765E5A1A"/>
@@ -11425,7 +14904,7 @@
       </w:pPr>
     </w:lvl>
   </w:abstractNum>
-  <w:abstractNum w:abstractNumId="69" w15:restartNumberingAfterBreak="0">
+  <w:abstractNum w:abstractNumId="73" w15:restartNumberingAfterBreak="0">
     <w:nsid w:val="706B0D23"/>
     <w:multiLevelType w:val="hybridMultilevel"/>
     <w:tmpl w:val="53CC18F6"/>
@@ -11565,7 +15044,7 @@
       </w:rPr>
     </w:lvl>
   </w:abstractNum>
-  <w:abstractNum w:abstractNumId="70" w15:restartNumberingAfterBreak="0">
+  <w:abstractNum w:abstractNumId="74" w15:restartNumberingAfterBreak="0">
     <w:nsid w:val="71C44A47"/>
     <w:multiLevelType w:val="multilevel"/>
     <w:tmpl w:val="B4AEFBDC"/>
@@ -11682,7 +15161,7 @@
       </w:pPr>
     </w:lvl>
   </w:abstractNum>
-  <w:abstractNum w:abstractNumId="71" w15:restartNumberingAfterBreak="0">
+  <w:abstractNum w:abstractNumId="75" w15:restartNumberingAfterBreak="0">
     <w:nsid w:val="75185CB7"/>
     <w:multiLevelType w:val="multilevel"/>
     <w:tmpl w:val="63182928"/>
@@ -11799,7 +15278,7 @@
       </w:pPr>
     </w:lvl>
   </w:abstractNum>
-  <w:abstractNum w:abstractNumId="72" w15:restartNumberingAfterBreak="0">
+  <w:abstractNum w:abstractNumId="76" w15:restartNumberingAfterBreak="0">
     <w:nsid w:val="76CD6B33"/>
     <w:multiLevelType w:val="multilevel"/>
     <w:tmpl w:val="A4F4CA88"/>
@@ -11948,7 +15427,7 @@
       </w:rPr>
     </w:lvl>
   </w:abstractNum>
-  <w:abstractNum w:abstractNumId="73" w15:restartNumberingAfterBreak="0">
+  <w:abstractNum w:abstractNumId="77" w15:restartNumberingAfterBreak="0">
     <w:nsid w:val="77A4172C"/>
     <w:multiLevelType w:val="hybridMultilevel"/>
     <w:tmpl w:val="108C0746"/>
@@ -12037,7 +15516,7 @@
       </w:pPr>
     </w:lvl>
   </w:abstractNum>
-  <w:abstractNum w:abstractNumId="74" w15:restartNumberingAfterBreak="0">
+  <w:abstractNum w:abstractNumId="78" w15:restartNumberingAfterBreak="0">
     <w:nsid w:val="78466898"/>
     <w:multiLevelType w:val="hybridMultilevel"/>
     <w:tmpl w:val="B2CCCDE8"/>
@@ -12177,7 +15656,7 @@
       </w:rPr>
     </w:lvl>
   </w:abstractNum>
-  <w:abstractNum w:abstractNumId="75" w15:restartNumberingAfterBreak="0">
+  <w:abstractNum w:abstractNumId="79" w15:restartNumberingAfterBreak="0">
     <w:nsid w:val="793F458F"/>
     <w:multiLevelType w:val="multilevel"/>
     <w:tmpl w:val="8E805BD6"/>
@@ -12294,7 +15773,7 @@
       </w:pPr>
     </w:lvl>
   </w:abstractNum>
-  <w:abstractNum w:abstractNumId="76" w15:restartNumberingAfterBreak="0">
+  <w:abstractNum w:abstractNumId="80" w15:restartNumberingAfterBreak="0">
     <w:nsid w:val="79A75263"/>
     <w:multiLevelType w:val="hybridMultilevel"/>
     <w:tmpl w:val="D916E1D6"/>
@@ -12383,7 +15862,7 @@
       </w:pPr>
     </w:lvl>
   </w:abstractNum>
-  <w:abstractNum w:abstractNumId="77" w15:restartNumberingAfterBreak="0">
+  <w:abstractNum w:abstractNumId="81" w15:restartNumberingAfterBreak="0">
     <w:nsid w:val="7B9D0479"/>
     <w:multiLevelType w:val="multilevel"/>
     <w:tmpl w:val="B00090C4"/>
@@ -12536,100 +16015,100 @@
     <w:abstractNumId w:val="6"/>
   </w:num>
   <w:num w:numId="2" w16cid:durableId="442111059">
-    <w:abstractNumId w:val="66"/>
+    <w:abstractNumId w:val="70"/>
   </w:num>
   <w:num w:numId="3" w16cid:durableId="1029067420">
-    <w:abstractNumId w:val="26"/>
+    <w:abstractNumId w:val="29"/>
   </w:num>
   <w:num w:numId="4" w16cid:durableId="109396650">
+    <w:abstractNumId w:val="14"/>
+  </w:num>
+  <w:num w:numId="5" w16cid:durableId="212155006">
+    <w:abstractNumId w:val="55"/>
+  </w:num>
+  <w:num w:numId="6" w16cid:durableId="1792283045">
+    <w:abstractNumId w:val="77"/>
+  </w:num>
+  <w:num w:numId="7" w16cid:durableId="976030857">
+    <w:abstractNumId w:val="44"/>
+  </w:num>
+  <w:num w:numId="8" w16cid:durableId="1157114045">
+    <w:abstractNumId w:val="80"/>
+  </w:num>
+  <w:num w:numId="9" w16cid:durableId="1503469554">
+    <w:abstractNumId w:val="46"/>
+  </w:num>
+  <w:num w:numId="10" w16cid:durableId="1464075173">
+    <w:abstractNumId w:val="36"/>
+  </w:num>
+  <w:num w:numId="11" w16cid:durableId="1915240378">
+    <w:abstractNumId w:val="12"/>
+  </w:num>
+  <w:num w:numId="12" w16cid:durableId="1489635008">
     <w:abstractNumId w:val="13"/>
   </w:num>
-  <w:num w:numId="5" w16cid:durableId="212155006">
-    <w:abstractNumId w:val="52"/>
-  </w:num>
-  <w:num w:numId="6" w16cid:durableId="1792283045">
-    <w:abstractNumId w:val="73"/>
-  </w:num>
-  <w:num w:numId="7" w16cid:durableId="976030857">
-    <w:abstractNumId w:val="41"/>
-  </w:num>
-  <w:num w:numId="8" w16cid:durableId="1157114045">
-    <w:abstractNumId w:val="76"/>
-  </w:num>
-  <w:num w:numId="9" w16cid:durableId="1503469554">
-    <w:abstractNumId w:val="43"/>
-  </w:num>
-  <w:num w:numId="10" w16cid:durableId="1464075173">
-    <w:abstractNumId w:val="33"/>
-  </w:num>
-  <w:num w:numId="11" w16cid:durableId="1915240378">
-    <w:abstractNumId w:val="11"/>
-  </w:num>
-  <w:num w:numId="12" w16cid:durableId="1489635008">
-    <w:abstractNumId w:val="12"/>
-  </w:num>
   <w:num w:numId="13" w16cid:durableId="2111272301">
-    <w:abstractNumId w:val="35"/>
+    <w:abstractNumId w:val="38"/>
   </w:num>
   <w:num w:numId="14" w16cid:durableId="2027898062">
-    <w:abstractNumId w:val="61"/>
+    <w:abstractNumId w:val="64"/>
   </w:num>
   <w:num w:numId="15" w16cid:durableId="1004164127">
-    <w:abstractNumId w:val="59"/>
+    <w:abstractNumId w:val="62"/>
   </w:num>
   <w:num w:numId="16" w16cid:durableId="1494833165">
+    <w:abstractNumId w:val="69"/>
+  </w:num>
+  <w:num w:numId="17" w16cid:durableId="19281872">
+    <w:abstractNumId w:val="30"/>
+  </w:num>
+  <w:num w:numId="18" w16cid:durableId="1530142502">
+    <w:abstractNumId w:val="79"/>
+  </w:num>
+  <w:num w:numId="19" w16cid:durableId="432553545">
     <w:abstractNumId w:val="65"/>
   </w:num>
-  <w:num w:numId="17" w16cid:durableId="19281872">
-    <w:abstractNumId w:val="27"/>
-  </w:num>
-  <w:num w:numId="18" w16cid:durableId="1530142502">
+  <w:num w:numId="20" w16cid:durableId="521743333">
     <w:abstractNumId w:val="75"/>
   </w:num>
-  <w:num w:numId="19" w16cid:durableId="432553545">
-    <w:abstractNumId w:val="62"/>
-  </w:num>
-  <w:num w:numId="20" w16cid:durableId="521743333">
-    <w:abstractNumId w:val="71"/>
-  </w:num>
   <w:num w:numId="21" w16cid:durableId="2125078504">
-    <w:abstractNumId w:val="20"/>
+    <w:abstractNumId w:val="22"/>
   </w:num>
   <w:num w:numId="22" w16cid:durableId="921337237">
-    <w:abstractNumId w:val="60"/>
+    <w:abstractNumId w:val="63"/>
   </w:num>
   <w:num w:numId="23" w16cid:durableId="238440546">
-    <w:abstractNumId w:val="54"/>
+    <w:abstractNumId w:val="57"/>
   </w:num>
   <w:num w:numId="24" w16cid:durableId="1783181903">
     <w:abstractNumId w:val="3"/>
   </w:num>
   <w:num w:numId="25" w16cid:durableId="1485318151">
+    <w:abstractNumId w:val="56"/>
+  </w:num>
+  <w:num w:numId="26" w16cid:durableId="1320689588">
+    <w:abstractNumId w:val="32"/>
+  </w:num>
+  <w:num w:numId="27" w16cid:durableId="1692798527">
+    <w:abstractNumId w:val="47"/>
+  </w:num>
+  <w:num w:numId="28" w16cid:durableId="1888569486">
+    <w:abstractNumId w:val="39"/>
+  </w:num>
+  <w:num w:numId="29" w16cid:durableId="1597714059">
+    <w:abstractNumId w:val="68"/>
+  </w:num>
+  <w:num w:numId="30" w16cid:durableId="904028737">
+    <w:abstractNumId w:val="72"/>
+  </w:num>
+  <w:num w:numId="31" w16cid:durableId="1977443540">
+    <w:abstractNumId w:val="16"/>
+  </w:num>
+  <w:num w:numId="32" w16cid:durableId="1842112727">
     <w:abstractNumId w:val="53"/>
   </w:num>
-  <w:num w:numId="26" w16cid:durableId="1320689588">
-    <w:abstractNumId w:val="29"/>
-  </w:num>
-  <w:num w:numId="27" w16cid:durableId="1692798527">
-    <w:abstractNumId w:val="44"/>
-  </w:num>
-  <w:num w:numId="28" w16cid:durableId="1888569486">
-    <w:abstractNumId w:val="36"/>
-  </w:num>
-  <w:num w:numId="29" w16cid:durableId="1597714059">
-    <w:abstractNumId w:val="64"/>
-  </w:num>
-  <w:num w:numId="30" w16cid:durableId="904028737">
-    <w:abstractNumId w:val="68"/>
-  </w:num>
-  <w:num w:numId="31" w16cid:durableId="1977443540">
-    <w:abstractNumId w:val="15"/>
-  </w:num>
-  <w:num w:numId="32" w16cid:durableId="1842112727">
-    <w:abstractNumId w:val="50"/>
-  </w:num>
   <w:num w:numId="33" w16cid:durableId="744449272">
-    <w:abstractNumId w:val="16"/>
+    <w:abstractNumId w:val="17"/>
     <w:lvlOverride w:ilvl="0">
       <w:startOverride w:val="3"/>
     </w:lvlOverride>
@@ -12659,7 +16138,7 @@
     </w:lvlOverride>
   </w:num>
   <w:num w:numId="34" w16cid:durableId="519665207">
-    <w:abstractNumId w:val="31"/>
+    <w:abstractNumId w:val="34"/>
     <w:lvlOverride w:ilvl="0">
       <w:startOverride w:val="1"/>
     </w:lvlOverride>
@@ -12692,61 +16171,61 @@
     <w:abstractNumId w:val="5"/>
   </w:num>
   <w:num w:numId="36" w16cid:durableId="135028232">
-    <w:abstractNumId w:val="10"/>
+    <w:abstractNumId w:val="11"/>
   </w:num>
   <w:num w:numId="37" w16cid:durableId="93525401">
-    <w:abstractNumId w:val="67"/>
+    <w:abstractNumId w:val="71"/>
   </w:num>
   <w:num w:numId="38" w16cid:durableId="1070077322">
-    <w:abstractNumId w:val="42"/>
+    <w:abstractNumId w:val="45"/>
   </w:num>
   <w:num w:numId="39" w16cid:durableId="199828578">
     <w:abstractNumId w:val="2"/>
   </w:num>
   <w:num w:numId="40" w16cid:durableId="1804883297">
-    <w:abstractNumId w:val="46"/>
+    <w:abstractNumId w:val="49"/>
   </w:num>
   <w:num w:numId="41" w16cid:durableId="911158931">
-    <w:abstractNumId w:val="57"/>
+    <w:abstractNumId w:val="60"/>
   </w:num>
   <w:num w:numId="42" w16cid:durableId="140776152">
     <w:abstractNumId w:val="0"/>
   </w:num>
   <w:num w:numId="43" w16cid:durableId="1835879137">
-    <w:abstractNumId w:val="56"/>
+    <w:abstractNumId w:val="59"/>
   </w:num>
   <w:num w:numId="44" w16cid:durableId="303462545">
-    <w:abstractNumId w:val="38"/>
+    <w:abstractNumId w:val="41"/>
   </w:num>
   <w:num w:numId="45" w16cid:durableId="350842200">
-    <w:abstractNumId w:val="40"/>
+    <w:abstractNumId w:val="43"/>
   </w:num>
   <w:num w:numId="46" w16cid:durableId="1055086468">
-    <w:abstractNumId w:val="45"/>
+    <w:abstractNumId w:val="48"/>
   </w:num>
   <w:num w:numId="47" w16cid:durableId="267934558">
-    <w:abstractNumId w:val="9"/>
+    <w:abstractNumId w:val="10"/>
   </w:num>
   <w:num w:numId="48" w16cid:durableId="1279684432">
-    <w:abstractNumId w:val="25"/>
+    <w:abstractNumId w:val="28"/>
   </w:num>
   <w:num w:numId="49" w16cid:durableId="32581524">
     <w:abstractNumId w:val="7"/>
   </w:num>
   <w:num w:numId="50" w16cid:durableId="801775278">
-    <w:abstractNumId w:val="14"/>
+    <w:abstractNumId w:val="15"/>
   </w:num>
   <w:num w:numId="51" w16cid:durableId="772868346">
-    <w:abstractNumId w:val="48"/>
+    <w:abstractNumId w:val="51"/>
   </w:num>
   <w:num w:numId="52" w16cid:durableId="1043166333">
     <w:abstractNumId w:val="4"/>
   </w:num>
   <w:num w:numId="53" w16cid:durableId="17705921">
-    <w:abstractNumId w:val="21"/>
+    <w:abstractNumId w:val="23"/>
   </w:num>
   <w:num w:numId="54" w16cid:durableId="1334530672">
-    <w:abstractNumId w:val="55"/>
+    <w:abstractNumId w:val="58"/>
     <w:lvlOverride w:ilvl="0">
       <w:startOverride w:val="1"/>
     </w:lvlOverride>
@@ -12776,13 +16255,13 @@
     </w:lvlOverride>
   </w:num>
   <w:num w:numId="55" w16cid:durableId="430012546">
-    <w:abstractNumId w:val="51"/>
+    <w:abstractNumId w:val="54"/>
   </w:num>
   <w:num w:numId="56" w16cid:durableId="309016889">
-    <w:abstractNumId w:val="77"/>
+    <w:abstractNumId w:val="81"/>
   </w:num>
   <w:num w:numId="57" w16cid:durableId="1373916783">
-    <w:abstractNumId w:val="28"/>
+    <w:abstractNumId w:val="31"/>
     <w:lvlOverride w:ilvl="0">
       <w:startOverride w:val="1"/>
     </w:lvlOverride>
@@ -12812,70 +16291,61 @@
     </w:lvlOverride>
   </w:num>
   <w:num w:numId="58" w16cid:durableId="1913739648">
-    <w:abstractNumId w:val="39"/>
+    <w:abstractNumId w:val="42"/>
   </w:num>
   <w:num w:numId="59" w16cid:durableId="1014771244">
-    <w:abstractNumId w:val="49"/>
+    <w:abstractNumId w:val="52"/>
   </w:num>
   <w:num w:numId="60" w16cid:durableId="76025121">
-    <w:abstractNumId w:val="17"/>
+    <w:abstractNumId w:val="18"/>
   </w:num>
   <w:num w:numId="61" w16cid:durableId="1761902558">
-    <w:abstractNumId w:val="58"/>
+    <w:abstractNumId w:val="61"/>
   </w:num>
   <w:num w:numId="62" w16cid:durableId="336662844">
-    <w:abstractNumId w:val="47"/>
+    <w:abstractNumId w:val="50"/>
   </w:num>
   <w:num w:numId="63" w16cid:durableId="1419717295">
     <w:abstractNumId w:val="1"/>
   </w:num>
   <w:num w:numId="64" w16cid:durableId="1624850195">
-    <w:abstractNumId w:val="34"/>
+    <w:abstractNumId w:val="37"/>
   </w:num>
   <w:num w:numId="65" w16cid:durableId="926620694">
-    <w:abstractNumId w:val="72"/>
+    <w:abstractNumId w:val="76"/>
   </w:num>
   <w:num w:numId="66" w16cid:durableId="1136800382">
-    <w:abstractNumId w:val="22"/>
+    <w:abstractNumId w:val="24"/>
   </w:num>
   <w:num w:numId="67" w16cid:durableId="856190910">
-    <w:abstractNumId w:val="32"/>
+    <w:abstractNumId w:val="35"/>
   </w:num>
   <w:num w:numId="68" w16cid:durableId="1871987576">
     <w:abstractNumId w:val="8"/>
   </w:num>
   <w:num w:numId="69" w16cid:durableId="1054768129">
+    <w:abstractNumId w:val="21"/>
+  </w:num>
+  <w:num w:numId="70" w16cid:durableId="1820460464">
+    <w:abstractNumId w:val="27"/>
+  </w:num>
+  <w:num w:numId="71" w16cid:durableId="819270197">
+    <w:abstractNumId w:val="40"/>
+  </w:num>
+  <w:num w:numId="72" w16cid:durableId="1573084357">
     <w:abstractNumId w:val="19"/>
   </w:num>
-  <w:num w:numId="70" w16cid:durableId="1820460464">
-    <w:abstractNumId w:val="24"/>
-  </w:num>
-  <w:num w:numId="71" w16cid:durableId="819270197">
-    <w:abstractNumId w:val="37"/>
-  </w:num>
-  <w:num w:numId="72" w16cid:durableId="1573084357">
-    <w:abstractNumId w:val="18"/>
-  </w:num>
   <w:num w:numId="73" w16cid:durableId="1694647318">
-    <w:abstractNumId w:val="70"/>
+    <w:abstractNumId w:val="74"/>
   </w:num>
   <w:num w:numId="74" w16cid:durableId="1691226058">
-    <w:abstractNumId w:val="63"/>
+    <w:abstractNumId w:val="67"/>
   </w:num>
   <w:num w:numId="75" w16cid:durableId="774205193">
-    <w:abstractNumId w:val="30"/>
-    <w:lvlOverride w:ilvl="0"/>
-    <w:lvlOverride w:ilvl="1"/>
-    <w:lvlOverride w:ilvl="2"/>
-    <w:lvlOverride w:ilvl="3"/>
-    <w:lvlOverride w:ilvl="4"/>
-    <w:lvlOverride w:ilvl="5"/>
-    <w:lvlOverride w:ilvl="6"/>
-    <w:lvlOverride w:ilvl="7"/>
-    <w:lvlOverride w:ilvl="8"/>
+    <w:abstractNumId w:val="33"/>
   </w:num>
   <w:num w:numId="76" w16cid:durableId="774444106">
-    <w:abstractNumId w:val="23"/>
+    <w:abstractNumId w:val="25"/>
     <w:lvlOverride w:ilvl="0">
       <w:startOverride w:val="2"/>
     </w:lvlOverride>
@@ -12903,28 +16373,22 @@
     </w:lvlOverride>
   </w:num>
   <w:num w:numId="77" w16cid:durableId="581718895">
-    <w:abstractNumId w:val="74"/>
-    <w:lvlOverride w:ilvl="0"/>
-    <w:lvlOverride w:ilvl="1"/>
-    <w:lvlOverride w:ilvl="2"/>
-    <w:lvlOverride w:ilvl="3"/>
-    <w:lvlOverride w:ilvl="4"/>
-    <w:lvlOverride w:ilvl="5"/>
-    <w:lvlOverride w:ilvl="6"/>
-    <w:lvlOverride w:ilvl="7"/>
-    <w:lvlOverride w:ilvl="8"/>
+    <w:abstractNumId w:val="78"/>
   </w:num>
   <w:num w:numId="78" w16cid:durableId="297079395">
-    <w:abstractNumId w:val="69"/>
-    <w:lvlOverride w:ilvl="0"/>
-    <w:lvlOverride w:ilvl="1"/>
-    <w:lvlOverride w:ilvl="2"/>
-    <w:lvlOverride w:ilvl="3"/>
-    <w:lvlOverride w:ilvl="4"/>
-    <w:lvlOverride w:ilvl="5"/>
-    <w:lvlOverride w:ilvl="6"/>
-    <w:lvlOverride w:ilvl="7"/>
-    <w:lvlOverride w:ilvl="8"/>
+    <w:abstractNumId w:val="73"/>
+  </w:num>
+  <w:num w:numId="79" w16cid:durableId="519590841">
+    <w:abstractNumId w:val="66"/>
+  </w:num>
+  <w:num w:numId="80" w16cid:durableId="176890355">
+    <w:abstractNumId w:val="20"/>
+  </w:num>
+  <w:num w:numId="81" w16cid:durableId="292294213">
+    <w:abstractNumId w:val="26"/>
+  </w:num>
+  <w:num w:numId="82" w16cid:durableId="701907460">
+    <w:abstractNumId w:val="9"/>
   </w:num>
 </w:numbering>
 </file>

</xml_diff>